<commit_message>
refactor: unpack_header抽取 + 锁补全 + 前缀和 + EWMA RTO + SR Task3
主要改动:
- common.py 新增 unpack_header(): 解包13B头，统一兜底长度检查+struct.error
- udpserver.py/udpclient.py: 14处裸struct.unpack全部换为unpack_header
- 删冗余len(data)<13检查，改为if flags is None
- 发送循环加锁保护send_times/next_seq/total_sends
- 超时重传加锁保护packets/next_seq
- send_times从dict改为list[float]，删字典推导式清理
- byte_offsets前缀和替代sum(packet_sizes[:s])
- RTO从简化avgRTTx5升级为TCP EWMA(estimated_rtt+4xdev_rtt)
- _fast_retransmit同步更新send_times
- FIN握手加max_retries防无限重试
- retransmit_count统一为事件级计数(快速重传/超时各+1)
- 文档占位去emoji，对齐任务书风格
- Task3 SR选择性重传实现(乱序缓存+逐包超时+单独重传)
- 测试: Task1(18), Task2(18), Task3(5)

Co-Authored-By: Claude Opus 4.7 <noreply@anthropic.com>
</commit_message>
<xml_diff>
--- a/Task1/tcp_packet_capture.docx
+++ b/Task1/tcp_packet_capture.docx
@@ -9,7 +9,8 @@
       </w:pPr>
       <w:r>
         <w:rPr>
-          <w:rFonts w:ascii="Times New Roman" w:hAnsi="Times New Roman" w:eastAsia="黑体" w:cs="Times New Roman"/>
+          <w:rFonts w:eastAsia="黑体" w:ascii="Times New Roman" w:hAnsi="Times New Roman" w:cs="Times New Roman"/>
+          <w:rFonts w:ascii="Times New Roman" w:hAnsi="Times New Roman"/>
           <w:b/>
           <w:sz w:val="32"/>
         </w:rPr>
@@ -23,7 +24,8 @@
       </w:pPr>
       <w:r>
         <w:rPr>
-          <w:rFonts w:ascii="Times New Roman" w:hAnsi="Times New Roman" w:eastAsia="黑体" w:cs="Times New Roman"/>
+          <w:rFonts w:eastAsia="黑体" w:ascii="Times New Roman" w:hAnsi="Times New Roman" w:cs="Times New Roman"/>
+          <w:rFonts w:ascii="Times New Roman" w:hAnsi="Times New Roman"/>
           <w:b/>
           <w:sz w:val="24"/>
         </w:rPr>
@@ -37,7 +39,8 @@
       </w:pPr>
       <w:r>
         <w:rPr>
-          <w:rFonts w:ascii="Times New Roman" w:hAnsi="Times New Roman" w:eastAsia="宋体" w:cs="Times New Roman"/>
+          <w:rFonts w:eastAsia="宋体" w:ascii="Times New Roman" w:hAnsi="Times New Roman" w:cs="Times New Roman"/>
+          <w:rFonts w:ascii="Times New Roman" w:hAnsi="Times New Roman"/>
           <w:b w:val="0"/>
           <w:sz w:val="24"/>
         </w:rPr>
@@ -50,10 +53,11 @@
       </w:pPr>
       <w:r>
         <w:rPr>
-          <w:rFonts w:ascii="Times New Roman" w:hAnsi="Times New Roman" w:eastAsia="宋体" w:cs="Times New Roman"/>
+          <w:rFonts w:eastAsia="宋体" w:ascii="Times New Roman" w:hAnsi="Times New Roman" w:cs="Times New Roman"/>
+          <w:rFonts w:ascii="Times New Roman" w:hAnsi="Times New Roman"/>
           <w:sz w:val="21"/>
         </w:rPr>
-        <w:t>📷 [待插入截图] 图1 — 四种报文概览（Initialization / agree / reverseRequest / reverseAnswer）</w:t>
+        <w:t>[待插入截图] 图1 — 四种报文概览（Initialization / agree / reverseRequest / reverseAnswer）</w:t>
       </w:r>
     </w:p>
     <w:p>
@@ -62,10 +66,11 @@
       </w:pPr>
       <w:r>
         <w:rPr>
-          <w:rFonts w:ascii="Times New Roman" w:hAnsi="Times New Roman" w:eastAsia="宋体" w:cs="Times New Roman"/>
+          <w:rFonts w:eastAsia="宋体" w:ascii="Times New Roman" w:hAnsi="Times New Roman" w:cs="Times New Roman"/>
+          <w:rFonts w:ascii="Times New Roman" w:hAnsi="Times New Roman"/>
           <w:sz w:val="21"/>
         </w:rPr>
-        <w:t>📷 [待插入截图] 图2 — Type=1 Initialization 报文详情（Type + N 块数）</w:t>
+        <w:t>[待插入截图] 图2 — Type=1 Initialization 报文详情（Type + N 块数）</w:t>
       </w:r>
     </w:p>
     <w:p>
@@ -74,10 +79,11 @@
       </w:pPr>
       <w:r>
         <w:rPr>
-          <w:rFonts w:ascii="Times New Roman" w:hAnsi="Times New Roman" w:eastAsia="宋体" w:cs="Times New Roman"/>
+          <w:rFonts w:eastAsia="宋体" w:ascii="Times New Roman" w:hAnsi="Times New Roman" w:cs="Times New Roman"/>
+          <w:rFonts w:ascii="Times New Roman" w:hAnsi="Times New Roman"/>
           <w:sz w:val="21"/>
         </w:rPr>
-        <w:t>📷 [待插入截图] 图3 — Type=2 agree 报文详情（单字节 Type=2）</w:t>
+        <w:t>[待插入截图] 图3 — Type=2 agree 报文详情（单字节 Type=2）</w:t>
       </w:r>
     </w:p>
     <w:p>
@@ -86,10 +92,11 @@
       </w:pPr>
       <w:r>
         <w:rPr>
-          <w:rFonts w:ascii="Times New Roman" w:hAnsi="Times New Roman" w:eastAsia="宋体" w:cs="Times New Roman"/>
+          <w:rFonts w:eastAsia="宋体" w:ascii="Times New Roman" w:hAnsi="Times New Roman" w:cs="Times New Roman"/>
+          <w:rFonts w:ascii="Times New Roman" w:hAnsi="Times New Roman"/>
           <w:sz w:val="21"/>
         </w:rPr>
-        <w:t>📷 [待插入截图] 图4 — Type=3 reverseRequest 报文详情（Type + Length + Data）</w:t>
+        <w:t>[待插入截图] 图4 — Type=3 reverseRequest 报文详情（Type + Length + Data）</w:t>
       </w:r>
     </w:p>
     <w:p>
@@ -98,10 +105,11 @@
       </w:pPr>
       <w:r>
         <w:rPr>
-          <w:rFonts w:ascii="Times New Roman" w:hAnsi="Times New Roman" w:eastAsia="宋体" w:cs="Times New Roman"/>
+          <w:rFonts w:eastAsia="宋体" w:ascii="Times New Roman" w:hAnsi="Times New Roman" w:cs="Times New Roman"/>
+          <w:rFonts w:ascii="Times New Roman" w:hAnsi="Times New Roman"/>
           <w:sz w:val="21"/>
         </w:rPr>
-        <w:t>📷 [待插入截图] 图5 — Type=4 reverseAnswer 报文详情（Type + Length + 反转后 Data）</w:t>
+        <w:t>[待插入截图] 图5 — Type=4 reverseAnswer 报文详情（Type + Length + 反转后 Data）</w:t>
       </w:r>
     </w:p>
     <w:p>
@@ -111,7 +119,8 @@
       </w:pPr>
       <w:r>
         <w:rPr>
-          <w:rFonts w:ascii="Times New Roman" w:hAnsi="Times New Roman" w:eastAsia="黑体" w:cs="Times New Roman"/>
+          <w:rFonts w:eastAsia="黑体" w:ascii="Times New Roman" w:hAnsi="Times New Roman" w:cs="Times New Roman"/>
+          <w:rFonts w:ascii="Times New Roman" w:hAnsi="Times New Roman"/>
           <w:b/>
           <w:sz w:val="24"/>
         </w:rPr>
@@ -125,7 +134,8 @@
       </w:pPr>
       <w:r>
         <w:rPr>
-          <w:rFonts w:ascii="Times New Roman" w:hAnsi="Times New Roman" w:eastAsia="宋体" w:cs="Times New Roman"/>
+          <w:rFonts w:eastAsia="宋体" w:ascii="Times New Roman" w:hAnsi="Times New Roman" w:cs="Times New Roman"/>
+          <w:rFonts w:ascii="Times New Roman" w:hAnsi="Times New Roman"/>
           <w:b/>
           <w:sz w:val="24"/>
         </w:rPr>
@@ -196,11 +206,12 @@
       </w:pPr>
       <w:r>
         <w:rPr>
-          <w:rFonts w:ascii="Times New Roman" w:hAnsi="Times New Roman" w:eastAsia="宋体" w:cs="Times New Roman"/>
+          <w:rFonts w:eastAsia="宋体" w:ascii="Times New Roman" w:hAnsi="Times New Roman" w:cs="Times New Roman"/>
+          <w:rFonts w:ascii="Times New Roman" w:hAnsi="Times New Roman"/>
           <w:b/>
           <w:sz w:val="24"/>
         </w:rPr>
-        <w:t>关键点2：自定义协议报文设计与交互。使用 struct.pack/unpack 构造和解析 4 种类型报文。Type 字段 1 字节（!B），Length 字段 4 字节（!I），统一 Big-Endian。TCP 流式传输使用 recv_exact() 精确接收防止粘包。代码位于 common.py 。</w:t>
+        <w:t>关键点2：自定义协议报文设计与交互。使用 struct.pack/unpack 构造和解析 4 种类型报文。Type 字段 1 字节（!B），Length 字段 4 字节（!I），统一 Big-Endian。TCP 流式传输使用 recv_exact() 精确接收防止粘包。代码位于 common.py。</w:t>
       </w:r>
     </w:p>
     <w:tbl>
@@ -256,11 +267,12 @@
       </w:pPr>
       <w:r>
         <w:rPr>
-          <w:rFonts w:ascii="Times New Roman" w:hAnsi="Times New Roman" w:eastAsia="宋体" w:cs="Times New Roman"/>
+          <w:rFonts w:eastAsia="宋体" w:ascii="Times New Roman" w:hAnsi="Times New Roman" w:cs="Times New Roman"/>
+          <w:rFonts w:ascii="Times New Roman" w:hAnsi="Times New Roman"/>
           <w:b/>
           <w:sz w:val="24"/>
         </w:rPr>
-        <w:t>关键点3：多客户端并发 + 线程安全日志。Server 使用 threading.Thread 为每个连接创建独立处理线程。run_log.txt 写入使用 threading.Lock 保证多线程写安全，每条日志带毫秒级时间戳，与 Wireshark 拓包时间可相互印证。</w:t>
+        <w:t>关键点3：多客户端并发 + 线程安全日志。Server 使用 threading.Thread 为每个连接创建独立处理线程。run_log.txt 写入使用 threading.Lock 保证多线程写安全，每条日志带毫秒级时间戳，与 Wireshark 抓包时间可相互印证。</w:t>
       </w:r>
     </w:p>
     <w:tbl>
@@ -323,11 +335,12 @@
       </w:pPr>
       <w:r>
         <w:rPr>
-          <w:rFonts w:ascii="Times New Roman" w:hAnsi="Times New Roman" w:eastAsia="宋体" w:cs="Times New Roman"/>
+          <w:rFonts w:eastAsia="宋体" w:ascii="Times New Roman" w:hAnsi="Times New Roman" w:cs="Times New Roman"/>
+          <w:rFonts w:ascii="Times New Roman" w:hAnsi="Times New Roman"/>
           <w:b/>
           <w:sz w:val="24"/>
         </w:rPr>
-        <w:t>关键点4：common.py 模块化设计。将 recv_exact、log_event、TYPE_* 常量提取到 common.py，server 和 client 共同 import，消除代码重复，便于维护。同时将网络配置、协议常量、分块默认值统一管理在 config.py 中。</w:t>
+        <w:t>关键点4：common.py + config.py 模块化设计。将 recv_exact、log_event、TYPE_* 常量提取到 common.py，server 和 client 共同 import，消除代码重复。同时将网络配置、协议常量、分块默认值统一管理在 config.py 中。</w:t>
       </w:r>
     </w:p>
     <w:p>
@@ -337,7 +350,8 @@
       </w:pPr>
       <w:r>
         <w:rPr>
-          <w:rFonts w:ascii="Times New Roman" w:hAnsi="Times New Roman" w:eastAsia="黑体" w:cs="Times New Roman"/>
+          <w:rFonts w:eastAsia="黑体" w:ascii="Times New Roman" w:hAnsi="Times New Roman" w:cs="Times New Roman"/>
+          <w:rFonts w:ascii="Times New Roman" w:hAnsi="Times New Roman"/>
           <w:b/>
           <w:sz w:val="24"/>
         </w:rPr>
@@ -351,11 +365,12 @@
       </w:pPr>
       <w:r>
         <w:rPr>
-          <w:rFonts w:ascii="Times New Roman" w:hAnsi="Times New Roman" w:eastAsia="宋体" w:cs="Times New Roman"/>
+          <w:rFonts w:eastAsia="宋体" w:ascii="Times New Roman" w:hAnsi="Times New Roman" w:cs="Times New Roman"/>
+          <w:rFonts w:ascii="Times New Roman" w:hAnsi="Times New Roman"/>
           <w:b w:val="0"/>
           <w:sz w:val="24"/>
         </w:rPr>
-        <w:t>1. TCP Socket 编程：socket() → bind() → listen() → accept() 服务端流程；socket() → connect() 客户端流程；TCP 全双工、面向连接、可靠传输特性。</w:t>
+        <w:t>1. TCP Socket 编程：socket() -&gt; bind() -&gt; listen() -&gt; accept() 服务端流程；socket() -&gt; connect() 客户端流程；TCP 全双工、面向连接、可靠传输特性。</w:t>
       </w:r>
     </w:p>
     <w:p>
@@ -365,7 +380,8 @@
       </w:pPr>
       <w:r>
         <w:rPr>
-          <w:rFonts w:ascii="Times New Roman" w:hAnsi="Times New Roman" w:eastAsia="宋体" w:cs="Times New Roman"/>
+          <w:rFonts w:eastAsia="宋体" w:ascii="Times New Roman" w:hAnsi="Times New Roman" w:cs="Times New Roman"/>
+          <w:rFonts w:ascii="Times New Roman" w:hAnsi="Times New Roman"/>
           <w:b w:val="0"/>
           <w:sz w:val="24"/>
         </w:rPr>
@@ -379,7 +395,8 @@
       </w:pPr>
       <w:r>
         <w:rPr>
-          <w:rFonts w:ascii="Times New Roman" w:hAnsi="Times New Roman" w:eastAsia="宋体" w:cs="Times New Roman"/>
+          <w:rFonts w:eastAsia="宋体" w:ascii="Times New Roman" w:hAnsi="Times New Roman" w:cs="Times New Roman"/>
+          <w:rFonts w:ascii="Times New Roman" w:hAnsi="Times New Roman"/>
           <w:b w:val="0"/>
           <w:sz w:val="24"/>
         </w:rPr>
@@ -393,7 +410,8 @@
       </w:pPr>
       <w:r>
         <w:rPr>
-          <w:rFonts w:ascii="Times New Roman" w:hAnsi="Times New Roman" w:eastAsia="宋体" w:cs="Times New Roman"/>
+          <w:rFonts w:eastAsia="宋体" w:ascii="Times New Roman" w:hAnsi="Times New Roman" w:cs="Times New Roman"/>
+          <w:rFonts w:ascii="Times New Roman" w:hAnsi="Times New Roman"/>
           <w:b w:val="0"/>
           <w:sz w:val="24"/>
         </w:rPr>
@@ -407,11 +425,12 @@
       </w:pPr>
       <w:r>
         <w:rPr>
-          <w:rFonts w:ascii="Times New Roman" w:hAnsi="Times New Roman" w:eastAsia="宋体" w:cs="Times New Roman"/>
+          <w:rFonts w:eastAsia="宋体" w:ascii="Times New Roman" w:hAnsi="Times New Roman" w:cs="Times New Roman"/>
+          <w:rFonts w:ascii="Times New Roman" w:hAnsi="Times New Roman"/>
           <w:b w:val="0"/>
           <w:sz w:val="24"/>
         </w:rPr>
-        <w:t>5. 分块算法与随机种子：random.Random(seed) 确定性随机；Offset 累加分块定位；边界条件处理（最后一块 ≤ Lmax）。</w:t>
+        <w:t>5. 分块算法与随机种子：random.Random(seed) 确定性随机；Offset 累加分块定位；边界条件处理（最后块 &lt;= Lmax）。</w:t>
       </w:r>
     </w:p>
     <w:p>
@@ -421,11 +440,12 @@
       </w:pPr>
       <w:r>
         <w:rPr>
-          <w:rFonts w:ascii="Times New Roman" w:hAnsi="Times New Roman" w:eastAsia="宋体" w:cs="Times New Roman"/>
+          <w:rFonts w:eastAsia="宋体" w:ascii="Times New Roman" w:hAnsi="Times New Roman" w:cs="Times New Roman"/>
+          <w:rFonts w:ascii="Times New Roman" w:hAnsi="Times New Roman"/>
           <w:b w:val="0"/>
           <w:sz w:val="24"/>
         </w:rPr>
-        <w:t>6. Wireshark 拓包分析：Display Filter 过滤条件；跟踪 TCP 流查看报文交互；时间戳与运行日志交叉验证。</w:t>
+        <w:t>6. Wireshark 抓包分析：Display Filter 过滤条件；跟踪 TCP 流查看报文交互；时间戳与运行日志交叉验证。</w:t>
       </w:r>
     </w:p>
     <w:p>
@@ -435,7 +455,8 @@
       </w:pPr>
       <w:r>
         <w:rPr>
-          <w:rFonts w:ascii="Times New Roman" w:hAnsi="Times New Roman" w:eastAsia="宋体" w:cs="Times New Roman"/>
+          <w:rFonts w:eastAsia="宋体" w:ascii="Times New Roman" w:hAnsi="Times New Roman" w:cs="Times New Roman"/>
+          <w:rFonts w:ascii="Times New Roman" w:hAnsi="Times New Roman"/>
           <w:b w:val="0"/>
           <w:sz w:val="24"/>
         </w:rPr>
@@ -449,7 +470,8 @@
       </w:pPr>
       <w:r>
         <w:rPr>
-          <w:rFonts w:ascii="Times New Roman" w:hAnsi="Times New Roman" w:eastAsia="黑体" w:cs="Times New Roman"/>
+          <w:rFonts w:eastAsia="黑体" w:ascii="Times New Roman" w:hAnsi="Times New Roman" w:cs="Times New Roman"/>
+          <w:rFonts w:ascii="Times New Roman" w:hAnsi="Times New Roman"/>
           <w:b/>
           <w:sz w:val="24"/>
         </w:rPr>
@@ -462,7 +484,8 @@
       </w:pPr>
       <w:r>
         <w:rPr>
-          <w:rFonts w:ascii="Times New Roman" w:hAnsi="Times New Roman" w:eastAsia="宋体" w:cs="Times New Roman"/>
+          <w:rFonts w:eastAsia="宋体" w:ascii="Times New Roman" w:hAnsi="Times New Roman" w:cs="Times New Roman"/>
+          <w:rFonts w:ascii="Times New Roman" w:hAnsi="Times New Roman"/>
           <w:b w:val="0"/>
           <w:sz w:val="24"/>
         </w:rPr>
@@ -475,7 +498,8 @@
       </w:pPr>
       <w:r>
         <w:rPr>
-          <w:rFonts w:ascii="Times New Roman" w:hAnsi="Times New Roman" w:eastAsia="宋体" w:cs="Times New Roman"/>
+          <w:rFonts w:eastAsia="宋体" w:ascii="Times New Roman" w:hAnsi="Times New Roman" w:cs="Times New Roman"/>
+          <w:rFonts w:ascii="Times New Roman" w:hAnsi="Times New Roman"/>
           <w:b w:val="0"/>
           <w:sz w:val="24"/>
         </w:rPr>

</xml_diff>

<commit_message>
docs: Task1/Task2 Wireshark报告完成, 清理冗余文件
- Task1: 5张TCP抓包截图 + 报告自动生成
- Task2: 4张抓包截图(握手/数据/重传/挥手) + EWMA/四步挥手/三阶段拆分
- _build_docs.py: Pygments语法高亮代码块 + 自动截图嵌入
- 删除提取中间文件、Word锁备份、旧版docx
- .gitignore 补 .pytest_cache ~$*.docx

Co-Authored-By: Claude Opus 4.7 <noreply@anthropic.com>
</commit_message>
<xml_diff>
--- a/Task1/tcp_packet_capture.docx
+++ b/Task1/tcp_packet_capture.docx
@@ -49,7 +49,9 @@
     </w:p>
     <w:p>
       <w:pPr>
+        <w:spacing w:before="120" w:after="60"/>
         <w:ind w:firstLine="0"/>
+        <w:jc w:val="center"/>
       </w:pPr>
       <w:r>
         <w:rPr>
@@ -57,12 +59,54 @@
           <w:rFonts w:ascii="Times New Roman" w:hAnsi="Times New Roman"/>
           <w:sz w:val="21"/>
         </w:rPr>
-        <w:t>[待插入截图] 图1 — 四种报文概览（Initialization / agree / reverseRequest / reverseAnswer）</w:t>
+        <w:t>图1 — 四种报文概览（Initialization / agree / reverseRequest / reverseAnswer）</w:t>
       </w:r>
     </w:p>
     <w:p>
       <w:pPr>
+        <w:spacing w:after="240"/>
+        <w:jc w:val="center"/>
+      </w:pPr>
+      <w:r>
+        <w:drawing>
+          <wp:inline xmlns:a="http://schemas.openxmlformats.org/drawingml/2006/main" xmlns:pic="http://schemas.openxmlformats.org/drawingml/2006/picture">
+            <wp:extent cx="5040000" cy="1151436"/>
+            <wp:docPr id="1" name="Picture 1"/>
+            <wp:cNvGraphicFramePr>
+              <a:graphicFrameLocks noChangeAspect="1"/>
+            </wp:cNvGraphicFramePr>
+            <a:graphic>
+              <a:graphicData uri="http://schemas.openxmlformats.org/drawingml/2006/picture">
+                <pic:pic>
+                  <pic:nvPicPr>
+                    <pic:cNvPr id="0" name="overview.png"/>
+                    <pic:cNvPicPr/>
+                  </pic:nvPicPr>
+                  <pic:blipFill>
+                    <a:blip r:embed="rId9"/>
+                    <a:stretch>
+                      <a:fillRect/>
+                    </a:stretch>
+                  </pic:blipFill>
+                  <pic:spPr>
+                    <a:xfrm>
+                      <a:off x="0" y="0"/>
+                      <a:ext cx="5040000" cy="1151436"/>
+                    </a:xfrm>
+                    <a:prstGeom prst="rect"/>
+                  </pic:spPr>
+                </pic:pic>
+              </a:graphicData>
+            </a:graphic>
+          </wp:inline>
+        </w:drawing>
+      </w:r>
+    </w:p>
+    <w:p>
+      <w:pPr>
+        <w:spacing w:before="120" w:after="60"/>
         <w:ind w:firstLine="0"/>
+        <w:jc w:val="center"/>
       </w:pPr>
       <w:r>
         <w:rPr>
@@ -70,12 +114,54 @@
           <w:rFonts w:ascii="Times New Roman" w:hAnsi="Times New Roman"/>
           <w:sz w:val="21"/>
         </w:rPr>
-        <w:t>[待插入截图] 图2 — Type=1 Initialization 报文详情（Type + N 块数）</w:t>
+        <w:t>图2 — Type=1 Initialization 报文详情（Type + N 块数）</w:t>
       </w:r>
     </w:p>
     <w:p>
       <w:pPr>
+        <w:spacing w:after="240"/>
+        <w:jc w:val="center"/>
+      </w:pPr>
+      <w:r>
+        <w:drawing>
+          <wp:inline xmlns:a="http://schemas.openxmlformats.org/drawingml/2006/main" xmlns:pic="http://schemas.openxmlformats.org/drawingml/2006/picture">
+            <wp:extent cx="5040000" cy="168821"/>
+            <wp:docPr id="2" name="Picture 2"/>
+            <wp:cNvGraphicFramePr>
+              <a:graphicFrameLocks noChangeAspect="1"/>
+            </wp:cNvGraphicFramePr>
+            <a:graphic>
+              <a:graphicData uri="http://schemas.openxmlformats.org/drawingml/2006/picture">
+                <pic:pic>
+                  <pic:nvPicPr>
+                    <pic:cNvPr id="0" name="type1_init.png"/>
+                    <pic:cNvPicPr/>
+                  </pic:nvPicPr>
+                  <pic:blipFill>
+                    <a:blip r:embed="rId10"/>
+                    <a:stretch>
+                      <a:fillRect/>
+                    </a:stretch>
+                  </pic:blipFill>
+                  <pic:spPr>
+                    <a:xfrm>
+                      <a:off x="0" y="0"/>
+                      <a:ext cx="5040000" cy="168821"/>
+                    </a:xfrm>
+                    <a:prstGeom prst="rect"/>
+                  </pic:spPr>
+                </pic:pic>
+              </a:graphicData>
+            </a:graphic>
+          </wp:inline>
+        </w:drawing>
+      </w:r>
+    </w:p>
+    <w:p>
+      <w:pPr>
+        <w:spacing w:before="120" w:after="60"/>
         <w:ind w:firstLine="0"/>
+        <w:jc w:val="center"/>
       </w:pPr>
       <w:r>
         <w:rPr>
@@ -83,12 +169,54 @@
           <w:rFonts w:ascii="Times New Roman" w:hAnsi="Times New Roman"/>
           <w:sz w:val="21"/>
         </w:rPr>
-        <w:t>[待插入截图] 图3 — Type=2 agree 报文详情（单字节 Type=2）</w:t>
+        <w:t>图3 — Type=2 agree 报文详情（单字节 Type=2）</w:t>
       </w:r>
     </w:p>
     <w:p>
       <w:pPr>
+        <w:spacing w:after="240"/>
+        <w:jc w:val="center"/>
+      </w:pPr>
+      <w:r>
+        <w:drawing>
+          <wp:inline xmlns:a="http://schemas.openxmlformats.org/drawingml/2006/main" xmlns:pic="http://schemas.openxmlformats.org/drawingml/2006/picture">
+            <wp:extent cx="5040000" cy="152512"/>
+            <wp:docPr id="3" name="Picture 3"/>
+            <wp:cNvGraphicFramePr>
+              <a:graphicFrameLocks noChangeAspect="1"/>
+            </wp:cNvGraphicFramePr>
+            <a:graphic>
+              <a:graphicData uri="http://schemas.openxmlformats.org/drawingml/2006/picture">
+                <pic:pic>
+                  <pic:nvPicPr>
+                    <pic:cNvPr id="0" name="type2_agree.png"/>
+                    <pic:cNvPicPr/>
+                  </pic:nvPicPr>
+                  <pic:blipFill>
+                    <a:blip r:embed="rId11"/>
+                    <a:stretch>
+                      <a:fillRect/>
+                    </a:stretch>
+                  </pic:blipFill>
+                  <pic:spPr>
+                    <a:xfrm>
+                      <a:off x="0" y="0"/>
+                      <a:ext cx="5040000" cy="152512"/>
+                    </a:xfrm>
+                    <a:prstGeom prst="rect"/>
+                  </pic:spPr>
+                </pic:pic>
+              </a:graphicData>
+            </a:graphic>
+          </wp:inline>
+        </w:drawing>
+      </w:r>
+    </w:p>
+    <w:p>
+      <w:pPr>
+        <w:spacing w:before="120" w:after="60"/>
         <w:ind w:firstLine="0"/>
+        <w:jc w:val="center"/>
       </w:pPr>
       <w:r>
         <w:rPr>
@@ -96,12 +224,54 @@
           <w:rFonts w:ascii="Times New Roman" w:hAnsi="Times New Roman"/>
           <w:sz w:val="21"/>
         </w:rPr>
-        <w:t>[待插入截图] 图4 — Type=3 reverseRequest 报文详情（Type + Length + Data）</w:t>
+        <w:t>图4 — Type=3 reverseRequest 报文详情（Type + Length + Data）</w:t>
       </w:r>
     </w:p>
     <w:p>
       <w:pPr>
+        <w:spacing w:after="240"/>
+        <w:jc w:val="center"/>
+      </w:pPr>
+      <w:r>
+        <w:drawing>
+          <wp:inline xmlns:a="http://schemas.openxmlformats.org/drawingml/2006/main" xmlns:pic="http://schemas.openxmlformats.org/drawingml/2006/picture">
+            <wp:extent cx="5040000" cy="160510"/>
+            <wp:docPr id="4" name="Picture 4"/>
+            <wp:cNvGraphicFramePr>
+              <a:graphicFrameLocks noChangeAspect="1"/>
+            </wp:cNvGraphicFramePr>
+            <a:graphic>
+              <a:graphicData uri="http://schemas.openxmlformats.org/drawingml/2006/picture">
+                <pic:pic>
+                  <pic:nvPicPr>
+                    <pic:cNvPr id="0" name="type3_request.png"/>
+                    <pic:cNvPicPr/>
+                  </pic:nvPicPr>
+                  <pic:blipFill>
+                    <a:blip r:embed="rId12"/>
+                    <a:stretch>
+                      <a:fillRect/>
+                    </a:stretch>
+                  </pic:blipFill>
+                  <pic:spPr>
+                    <a:xfrm>
+                      <a:off x="0" y="0"/>
+                      <a:ext cx="5040000" cy="160510"/>
+                    </a:xfrm>
+                    <a:prstGeom prst="rect"/>
+                  </pic:spPr>
+                </pic:pic>
+              </a:graphicData>
+            </a:graphic>
+          </wp:inline>
+        </w:drawing>
+      </w:r>
+    </w:p>
+    <w:p>
+      <w:pPr>
+        <w:spacing w:before="120" w:after="60"/>
         <w:ind w:firstLine="0"/>
+        <w:jc w:val="center"/>
       </w:pPr>
       <w:r>
         <w:rPr>
@@ -109,7 +279,47 @@
           <w:rFonts w:ascii="Times New Roman" w:hAnsi="Times New Roman"/>
           <w:sz w:val="21"/>
         </w:rPr>
-        <w:t>[待插入截图] 图5 — Type=4 reverseAnswer 报文详情（Type + Length + 反转后 Data）</w:t>
+        <w:t>图5 — Type=4 reverseAnswer 报文详情（Type + Length + 反转后 Data）</w:t>
+      </w:r>
+    </w:p>
+    <w:p>
+      <w:pPr>
+        <w:spacing w:after="240"/>
+        <w:jc w:val="center"/>
+      </w:pPr>
+      <w:r>
+        <w:drawing>
+          <wp:inline xmlns:a="http://schemas.openxmlformats.org/drawingml/2006/main" xmlns:pic="http://schemas.openxmlformats.org/drawingml/2006/picture">
+            <wp:extent cx="5040000" cy="162916"/>
+            <wp:docPr id="5" name="Picture 5"/>
+            <wp:cNvGraphicFramePr>
+              <a:graphicFrameLocks noChangeAspect="1"/>
+            </wp:cNvGraphicFramePr>
+            <a:graphic>
+              <a:graphicData uri="http://schemas.openxmlformats.org/drawingml/2006/picture">
+                <pic:pic>
+                  <pic:nvPicPr>
+                    <pic:cNvPr id="0" name="type4_answer.png"/>
+                    <pic:cNvPicPr/>
+                  </pic:nvPicPr>
+                  <pic:blipFill>
+                    <a:blip r:embed="rId13"/>
+                    <a:stretch>
+                      <a:fillRect/>
+                    </a:stretch>
+                  </pic:blipFill>
+                  <pic:spPr>
+                    <a:xfrm>
+                      <a:off x="0" y="0"/>
+                      <a:ext cx="5040000" cy="162916"/>
+                    </a:xfrm>
+                    <a:prstGeom prst="rect"/>
+                  </pic:spPr>
+                </pic:pic>
+              </a:graphicData>
+            </a:graphic>
+          </wp:inline>
+        </w:drawing>
       </w:r>
     </w:p>
     <w:p>
@@ -139,7 +349,7 @@
           <w:b/>
           <w:sz w:val="24"/>
         </w:rPr>
-        <w:t>关键点1：随机分块算法。使用 chunk_seed 固定随机种子，保证分块结果可复现。验收时给定 (文件大小, Lmin, Lmax, seed) 可手推 N 及各块长度。剩余字节 ≤ Lmax 时直接作为最后一块。代码位于 reversetcpclient.py 中的 split_file() 函数。</w:t>
+        <w:t>关键点1：随机分块算法。使用 chunk_seed 固定随机种子，保证分块结果可复现。验收时给定 (文件大小, Lmin, Lmax, seed) 可手推 N 及各块长度。剩余字节 &lt;= Lmax 时直接作为最后一块。代码位于 reversetcpclient.py 中的 split_file() 函数。</w:t>
       </w:r>
     </w:p>
     <w:tbl>
@@ -156,45 +366,1311 @@
           <w:tcPr>
             <w:tcW w:type="dxa" w:w="8640"/>
             <w:shd w:fill="F5F5F5" w:val="clear"/>
+            <w:tcBorders>
+              <w:top w:val="single" w:sz="4" w:space="0" w:color="999999"/>
+              <w:left w:val="single" w:sz="4" w:space="0" w:color="999999"/>
+              <w:bottom w:val="single" w:sz="4" w:space="0" w:color="999999"/>
+              <w:right w:val="single" w:sz="4" w:space="0" w:color="999999"/>
+            </w:tcBorders>
           </w:tcPr>
           <w:p>
             <w:pPr>
-              <w:spacing w:before="80" w:after="80"/>
+              <w:spacing w:before="80" w:line="220" w:lineRule="exact"/>
             </w:pPr>
             <w:r>
               <w:rPr>
                 <w:rFonts w:eastAsia="宋体" w:ascii="Consolas" w:hAnsi="Consolas"/>
                 <w:rFonts w:ascii="Consolas" w:hAnsi="Consolas"/>
                 <w:sz w:val="18"/>
-              </w:rPr>
-              <w:t>def split_file(data: bytes, lmin: int, lmax: int, seed: int) -&gt; list:</w:t>
-              <w:br/>
-              <w:t xml:space="preserve">    rng = random.Random(seed)</w:t>
-              <w:br/>
-              <w:t xml:space="preserve">    total = len(data)</w:t>
-              <w:br/>
-              <w:t xml:space="preserve">    chunks = []</w:t>
-              <w:br/>
-              <w:t xml:space="preserve">    pos = 0</w:t>
-              <w:br/>
-              <w:t xml:space="preserve">    while pos &lt; total:</w:t>
-              <w:br/>
-              <w:t xml:space="preserve">        remaining = total - pos</w:t>
-              <w:br/>
-              <w:t xml:space="preserve">        if remaining &lt;= lmax:</w:t>
-              <w:br/>
-              <w:t xml:space="preserve">            chunks.append(remaining)</w:t>
-              <w:br/>
-              <w:t xml:space="preserve">            break</w:t>
-              <w:br/>
-              <w:t xml:space="preserve">        size = rng.randint(lmin, lmax)</w:t>
-              <w:br/>
-              <w:t xml:space="preserve">        chunks.append(size)</w:t>
-              <w:br/>
-              <w:t xml:space="preserve">        pos += size</w:t>
-              <w:br/>
-              <w:t xml:space="preserve">    return chunks</w:t>
-            </w:r>
+                <w:color w:val="0000FF"/>
+              </w:rPr>
+              <w:t>def</w:t>
+            </w:r>
+            <w:r>
+              <w:rPr>
+                <w:rFonts w:eastAsia="宋体" w:ascii="Consolas" w:hAnsi="Consolas"/>
+                <w:rFonts w:ascii="Consolas" w:hAnsi="Consolas"/>
+                <w:sz w:val="18"/>
+                <w:color w:val="000000"/>
+              </w:rPr>
+              <w:t xml:space="preserve"> </w:t>
+            </w:r>
+            <w:r>
+              <w:rPr>
+                <w:rFonts w:eastAsia="宋体" w:ascii="Consolas" w:hAnsi="Consolas"/>
+                <w:rFonts w:ascii="Consolas" w:hAnsi="Consolas"/>
+                <w:sz w:val="18"/>
+                <w:color w:val="795E26"/>
+              </w:rPr>
+              <w:t>split_file</w:t>
+            </w:r>
+            <w:r>
+              <w:rPr>
+                <w:rFonts w:eastAsia="宋体" w:ascii="Consolas" w:hAnsi="Consolas"/>
+                <w:rFonts w:ascii="Consolas" w:hAnsi="Consolas"/>
+                <w:sz w:val="18"/>
+                <w:color w:val="000000"/>
+              </w:rPr>
+              <w:t>(</w:t>
+            </w:r>
+            <w:r>
+              <w:rPr>
+                <w:rFonts w:eastAsia="宋体" w:ascii="Consolas" w:hAnsi="Consolas"/>
+                <w:rFonts w:ascii="Consolas" w:hAnsi="Consolas"/>
+                <w:sz w:val="18"/>
+                <w:color w:val="000000"/>
+              </w:rPr>
+              <w:t>data</w:t>
+            </w:r>
+            <w:r>
+              <w:rPr>
+                <w:rFonts w:eastAsia="宋体" w:ascii="Consolas" w:hAnsi="Consolas"/>
+                <w:rFonts w:ascii="Consolas" w:hAnsi="Consolas"/>
+                <w:sz w:val="18"/>
+                <w:color w:val="000000"/>
+              </w:rPr>
+              <w:t>:</w:t>
+            </w:r>
+            <w:r>
+              <w:rPr>
+                <w:rFonts w:eastAsia="宋体" w:ascii="Consolas" w:hAnsi="Consolas"/>
+                <w:rFonts w:ascii="Consolas" w:hAnsi="Consolas"/>
+                <w:sz w:val="18"/>
+                <w:color w:val="000000"/>
+              </w:rPr>
+              <w:t xml:space="preserve"> </w:t>
+            </w:r>
+            <w:r>
+              <w:rPr>
+                <w:rFonts w:eastAsia="宋体" w:ascii="Consolas" w:hAnsi="Consolas"/>
+                <w:rFonts w:ascii="Consolas" w:hAnsi="Consolas"/>
+                <w:sz w:val="18"/>
+                <w:color w:val="008080"/>
+              </w:rPr>
+              <w:t>bytes</w:t>
+            </w:r>
+            <w:r>
+              <w:rPr>
+                <w:rFonts w:eastAsia="宋体" w:ascii="Consolas" w:hAnsi="Consolas"/>
+                <w:rFonts w:ascii="Consolas" w:hAnsi="Consolas"/>
+                <w:sz w:val="18"/>
+                <w:color w:val="000000"/>
+              </w:rPr>
+              <w:t>,</w:t>
+            </w:r>
+            <w:r>
+              <w:rPr>
+                <w:rFonts w:eastAsia="宋体" w:ascii="Consolas" w:hAnsi="Consolas"/>
+                <w:rFonts w:ascii="Consolas" w:hAnsi="Consolas"/>
+                <w:sz w:val="18"/>
+                <w:color w:val="000000"/>
+              </w:rPr>
+              <w:t xml:space="preserve"> </w:t>
+            </w:r>
+            <w:r>
+              <w:rPr>
+                <w:rFonts w:eastAsia="宋体" w:ascii="Consolas" w:hAnsi="Consolas"/>
+                <w:rFonts w:ascii="Consolas" w:hAnsi="Consolas"/>
+                <w:sz w:val="18"/>
+                <w:color w:val="000000"/>
+              </w:rPr>
+              <w:t>lmin</w:t>
+            </w:r>
+            <w:r>
+              <w:rPr>
+                <w:rFonts w:eastAsia="宋体" w:ascii="Consolas" w:hAnsi="Consolas"/>
+                <w:rFonts w:ascii="Consolas" w:hAnsi="Consolas"/>
+                <w:sz w:val="18"/>
+                <w:color w:val="000000"/>
+              </w:rPr>
+              <w:t>:</w:t>
+            </w:r>
+            <w:r>
+              <w:rPr>
+                <w:rFonts w:eastAsia="宋体" w:ascii="Consolas" w:hAnsi="Consolas"/>
+                <w:rFonts w:ascii="Consolas" w:hAnsi="Consolas"/>
+                <w:sz w:val="18"/>
+                <w:color w:val="000000"/>
+              </w:rPr>
+              <w:t xml:space="preserve"> </w:t>
+            </w:r>
+            <w:r>
+              <w:rPr>
+                <w:rFonts w:eastAsia="宋体" w:ascii="Consolas" w:hAnsi="Consolas"/>
+                <w:rFonts w:ascii="Consolas" w:hAnsi="Consolas"/>
+                <w:sz w:val="18"/>
+                <w:color w:val="008080"/>
+              </w:rPr>
+              <w:t>int</w:t>
+            </w:r>
+            <w:r>
+              <w:rPr>
+                <w:rFonts w:eastAsia="宋体" w:ascii="Consolas" w:hAnsi="Consolas"/>
+                <w:rFonts w:ascii="Consolas" w:hAnsi="Consolas"/>
+                <w:sz w:val="18"/>
+                <w:color w:val="000000"/>
+              </w:rPr>
+              <w:t>,</w:t>
+            </w:r>
+            <w:r>
+              <w:rPr>
+                <w:rFonts w:eastAsia="宋体" w:ascii="Consolas" w:hAnsi="Consolas"/>
+                <w:rFonts w:ascii="Consolas" w:hAnsi="Consolas"/>
+                <w:sz w:val="18"/>
+                <w:color w:val="000000"/>
+              </w:rPr>
+              <w:t xml:space="preserve"> </w:t>
+            </w:r>
+            <w:r>
+              <w:rPr>
+                <w:rFonts w:eastAsia="宋体" w:ascii="Consolas" w:hAnsi="Consolas"/>
+                <w:rFonts w:ascii="Consolas" w:hAnsi="Consolas"/>
+                <w:sz w:val="18"/>
+                <w:color w:val="000000"/>
+              </w:rPr>
+              <w:t>lmax</w:t>
+            </w:r>
+            <w:r>
+              <w:rPr>
+                <w:rFonts w:eastAsia="宋体" w:ascii="Consolas" w:hAnsi="Consolas"/>
+                <w:rFonts w:ascii="Consolas" w:hAnsi="Consolas"/>
+                <w:sz w:val="18"/>
+                <w:color w:val="000000"/>
+              </w:rPr>
+              <w:t>:</w:t>
+            </w:r>
+            <w:r>
+              <w:rPr>
+                <w:rFonts w:eastAsia="宋体" w:ascii="Consolas" w:hAnsi="Consolas"/>
+                <w:rFonts w:ascii="Consolas" w:hAnsi="Consolas"/>
+                <w:sz w:val="18"/>
+                <w:color w:val="000000"/>
+              </w:rPr>
+              <w:t xml:space="preserve"> </w:t>
+            </w:r>
+            <w:r>
+              <w:rPr>
+                <w:rFonts w:eastAsia="宋体" w:ascii="Consolas" w:hAnsi="Consolas"/>
+                <w:rFonts w:ascii="Consolas" w:hAnsi="Consolas"/>
+                <w:sz w:val="18"/>
+                <w:color w:val="008080"/>
+              </w:rPr>
+              <w:t>int</w:t>
+            </w:r>
+            <w:r>
+              <w:rPr>
+                <w:rFonts w:eastAsia="宋体" w:ascii="Consolas" w:hAnsi="Consolas"/>
+                <w:rFonts w:ascii="Consolas" w:hAnsi="Consolas"/>
+                <w:sz w:val="18"/>
+                <w:color w:val="000000"/>
+              </w:rPr>
+              <w:t>,</w:t>
+            </w:r>
+            <w:r>
+              <w:rPr>
+                <w:rFonts w:eastAsia="宋体" w:ascii="Consolas" w:hAnsi="Consolas"/>
+                <w:rFonts w:ascii="Consolas" w:hAnsi="Consolas"/>
+                <w:sz w:val="18"/>
+                <w:color w:val="000000"/>
+              </w:rPr>
+              <w:t xml:space="preserve"> </w:t>
+            </w:r>
+            <w:r>
+              <w:rPr>
+                <w:rFonts w:eastAsia="宋体" w:ascii="Consolas" w:hAnsi="Consolas"/>
+                <w:rFonts w:ascii="Consolas" w:hAnsi="Consolas"/>
+                <w:sz w:val="18"/>
+                <w:color w:val="000000"/>
+              </w:rPr>
+              <w:t>seed</w:t>
+            </w:r>
+            <w:r>
+              <w:rPr>
+                <w:rFonts w:eastAsia="宋体" w:ascii="Consolas" w:hAnsi="Consolas"/>
+                <w:rFonts w:ascii="Consolas" w:hAnsi="Consolas"/>
+                <w:sz w:val="18"/>
+                <w:color w:val="000000"/>
+              </w:rPr>
+              <w:t>:</w:t>
+            </w:r>
+            <w:r>
+              <w:rPr>
+                <w:rFonts w:eastAsia="宋体" w:ascii="Consolas" w:hAnsi="Consolas"/>
+                <w:rFonts w:ascii="Consolas" w:hAnsi="Consolas"/>
+                <w:sz w:val="18"/>
+                <w:color w:val="000000"/>
+              </w:rPr>
+              <w:t xml:space="preserve"> </w:t>
+            </w:r>
+            <w:r>
+              <w:rPr>
+                <w:rFonts w:eastAsia="宋体" w:ascii="Consolas" w:hAnsi="Consolas"/>
+                <w:rFonts w:ascii="Consolas" w:hAnsi="Consolas"/>
+                <w:sz w:val="18"/>
+                <w:color w:val="008080"/>
+              </w:rPr>
+              <w:t>int</w:t>
+            </w:r>
+            <w:r>
+              <w:rPr>
+                <w:rFonts w:eastAsia="宋体" w:ascii="Consolas" w:hAnsi="Consolas"/>
+                <w:rFonts w:ascii="Consolas" w:hAnsi="Consolas"/>
+                <w:sz w:val="18"/>
+                <w:color w:val="000000"/>
+              </w:rPr>
+              <w:t>)</w:t>
+            </w:r>
+            <w:r>
+              <w:rPr>
+                <w:rFonts w:eastAsia="宋体" w:ascii="Consolas" w:hAnsi="Consolas"/>
+                <w:rFonts w:ascii="Consolas" w:hAnsi="Consolas"/>
+                <w:sz w:val="18"/>
+                <w:color w:val="000000"/>
+              </w:rPr>
+              <w:t xml:space="preserve"> </w:t>
+            </w:r>
+            <w:r>
+              <w:rPr>
+                <w:rFonts w:eastAsia="宋体" w:ascii="Consolas" w:hAnsi="Consolas"/>
+                <w:rFonts w:ascii="Consolas" w:hAnsi="Consolas"/>
+                <w:sz w:val="18"/>
+                <w:color w:val="000000"/>
+              </w:rPr>
+              <w:t>-</w:t>
+            </w:r>
+            <w:r>
+              <w:rPr>
+                <w:rFonts w:eastAsia="宋体" w:ascii="Consolas" w:hAnsi="Consolas"/>
+                <w:rFonts w:ascii="Consolas" w:hAnsi="Consolas"/>
+                <w:sz w:val="18"/>
+                <w:color w:val="000000"/>
+              </w:rPr>
+              <w:t>&gt;</w:t>
+            </w:r>
+            <w:r>
+              <w:rPr>
+                <w:rFonts w:eastAsia="宋体" w:ascii="Consolas" w:hAnsi="Consolas"/>
+                <w:rFonts w:ascii="Consolas" w:hAnsi="Consolas"/>
+                <w:sz w:val="18"/>
+                <w:color w:val="000000"/>
+              </w:rPr>
+              <w:t xml:space="preserve"> </w:t>
+            </w:r>
+            <w:r>
+              <w:rPr>
+                <w:rFonts w:eastAsia="宋体" w:ascii="Consolas" w:hAnsi="Consolas"/>
+                <w:rFonts w:ascii="Consolas" w:hAnsi="Consolas"/>
+                <w:sz w:val="18"/>
+                <w:color w:val="008080"/>
+              </w:rPr>
+              <w:t>list</w:t>
+            </w:r>
+            <w:r>
+              <w:rPr>
+                <w:rFonts w:eastAsia="宋体" w:ascii="Consolas" w:hAnsi="Consolas"/>
+                <w:rFonts w:ascii="Consolas" w:hAnsi="Consolas"/>
+                <w:sz w:val="18"/>
+                <w:color w:val="000000"/>
+              </w:rPr>
+              <w:t>:</w:t>
+            </w:r>
+          </w:p>
+          <w:p>
+            <w:pPr>
+              <w:spacing w:before="0" w:after="0" w:line="220" w:lineRule="exact"/>
+            </w:pPr>
+            <w:r>
+              <w:rPr>
+                <w:rFonts w:eastAsia="宋体" w:ascii="Consolas" w:hAnsi="Consolas"/>
+                <w:rFonts w:ascii="Consolas" w:hAnsi="Consolas"/>
+                <w:sz w:val="18"/>
+                <w:color w:val="000000"/>
+              </w:rPr>
+              <w:t xml:space="preserve">    </w:t>
+            </w:r>
+            <w:r>
+              <w:rPr>
+                <w:rFonts w:eastAsia="宋体" w:ascii="Consolas" w:hAnsi="Consolas"/>
+                <w:rFonts w:ascii="Consolas" w:hAnsi="Consolas"/>
+                <w:sz w:val="18"/>
+                <w:color w:val="000000"/>
+              </w:rPr>
+              <w:t>rng</w:t>
+            </w:r>
+            <w:r>
+              <w:rPr>
+                <w:rFonts w:eastAsia="宋体" w:ascii="Consolas" w:hAnsi="Consolas"/>
+                <w:rFonts w:ascii="Consolas" w:hAnsi="Consolas"/>
+                <w:sz w:val="18"/>
+                <w:color w:val="000000"/>
+              </w:rPr>
+              <w:t xml:space="preserve"> </w:t>
+            </w:r>
+            <w:r>
+              <w:rPr>
+                <w:rFonts w:eastAsia="宋体" w:ascii="Consolas" w:hAnsi="Consolas"/>
+                <w:rFonts w:ascii="Consolas" w:hAnsi="Consolas"/>
+                <w:sz w:val="18"/>
+                <w:color w:val="000000"/>
+              </w:rPr>
+              <w:t>=</w:t>
+            </w:r>
+            <w:r>
+              <w:rPr>
+                <w:rFonts w:eastAsia="宋体" w:ascii="Consolas" w:hAnsi="Consolas"/>
+                <w:rFonts w:ascii="Consolas" w:hAnsi="Consolas"/>
+                <w:sz w:val="18"/>
+                <w:color w:val="000000"/>
+              </w:rPr>
+              <w:t xml:space="preserve"> </w:t>
+            </w:r>
+            <w:r>
+              <w:rPr>
+                <w:rFonts w:eastAsia="宋体" w:ascii="Consolas" w:hAnsi="Consolas"/>
+                <w:rFonts w:ascii="Consolas" w:hAnsi="Consolas"/>
+                <w:sz w:val="18"/>
+                <w:color w:val="000000"/>
+              </w:rPr>
+              <w:t>random</w:t>
+            </w:r>
+            <w:r>
+              <w:rPr>
+                <w:rFonts w:eastAsia="宋体" w:ascii="Consolas" w:hAnsi="Consolas"/>
+                <w:rFonts w:ascii="Consolas" w:hAnsi="Consolas"/>
+                <w:sz w:val="18"/>
+                <w:color w:val="000000"/>
+              </w:rPr>
+              <w:t>.</w:t>
+            </w:r>
+            <w:r>
+              <w:rPr>
+                <w:rFonts w:eastAsia="宋体" w:ascii="Consolas" w:hAnsi="Consolas"/>
+                <w:rFonts w:ascii="Consolas" w:hAnsi="Consolas"/>
+                <w:sz w:val="18"/>
+                <w:color w:val="000000"/>
+              </w:rPr>
+              <w:t>Random</w:t>
+            </w:r>
+            <w:r>
+              <w:rPr>
+                <w:rFonts w:eastAsia="宋体" w:ascii="Consolas" w:hAnsi="Consolas"/>
+                <w:rFonts w:ascii="Consolas" w:hAnsi="Consolas"/>
+                <w:sz w:val="18"/>
+                <w:color w:val="000000"/>
+              </w:rPr>
+              <w:t>(</w:t>
+            </w:r>
+            <w:r>
+              <w:rPr>
+                <w:rFonts w:eastAsia="宋体" w:ascii="Consolas" w:hAnsi="Consolas"/>
+                <w:rFonts w:ascii="Consolas" w:hAnsi="Consolas"/>
+                <w:sz w:val="18"/>
+                <w:color w:val="000000"/>
+              </w:rPr>
+              <w:t>seed</w:t>
+            </w:r>
+            <w:r>
+              <w:rPr>
+                <w:rFonts w:eastAsia="宋体" w:ascii="Consolas" w:hAnsi="Consolas"/>
+                <w:rFonts w:ascii="Consolas" w:hAnsi="Consolas"/>
+                <w:sz w:val="18"/>
+                <w:color w:val="000000"/>
+              </w:rPr>
+              <w:t>)</w:t>
+            </w:r>
+          </w:p>
+          <w:p>
+            <w:pPr>
+              <w:spacing w:before="0" w:after="0" w:line="220" w:lineRule="exact"/>
+            </w:pPr>
+            <w:r>
+              <w:rPr>
+                <w:rFonts w:eastAsia="宋体" w:ascii="Consolas" w:hAnsi="Consolas"/>
+                <w:rFonts w:ascii="Consolas" w:hAnsi="Consolas"/>
+                <w:sz w:val="18"/>
+                <w:color w:val="000000"/>
+              </w:rPr>
+              <w:t xml:space="preserve">    </w:t>
+            </w:r>
+            <w:r>
+              <w:rPr>
+                <w:rFonts w:eastAsia="宋体" w:ascii="Consolas" w:hAnsi="Consolas"/>
+                <w:rFonts w:ascii="Consolas" w:hAnsi="Consolas"/>
+                <w:sz w:val="18"/>
+                <w:color w:val="000000"/>
+              </w:rPr>
+              <w:t>total</w:t>
+            </w:r>
+            <w:r>
+              <w:rPr>
+                <w:rFonts w:eastAsia="宋体" w:ascii="Consolas" w:hAnsi="Consolas"/>
+                <w:rFonts w:ascii="Consolas" w:hAnsi="Consolas"/>
+                <w:sz w:val="18"/>
+                <w:color w:val="000000"/>
+              </w:rPr>
+              <w:t xml:space="preserve"> </w:t>
+            </w:r>
+            <w:r>
+              <w:rPr>
+                <w:rFonts w:eastAsia="宋体" w:ascii="Consolas" w:hAnsi="Consolas"/>
+                <w:rFonts w:ascii="Consolas" w:hAnsi="Consolas"/>
+                <w:sz w:val="18"/>
+                <w:color w:val="000000"/>
+              </w:rPr>
+              <w:t>=</w:t>
+            </w:r>
+            <w:r>
+              <w:rPr>
+                <w:rFonts w:eastAsia="宋体" w:ascii="Consolas" w:hAnsi="Consolas"/>
+                <w:rFonts w:ascii="Consolas" w:hAnsi="Consolas"/>
+                <w:sz w:val="18"/>
+                <w:color w:val="000000"/>
+              </w:rPr>
+              <w:t xml:space="preserve"> </w:t>
+            </w:r>
+            <w:r>
+              <w:rPr>
+                <w:rFonts w:eastAsia="宋体" w:ascii="Consolas" w:hAnsi="Consolas"/>
+                <w:rFonts w:ascii="Consolas" w:hAnsi="Consolas"/>
+                <w:sz w:val="18"/>
+                <w:color w:val="008080"/>
+              </w:rPr>
+              <w:t>len</w:t>
+            </w:r>
+            <w:r>
+              <w:rPr>
+                <w:rFonts w:eastAsia="宋体" w:ascii="Consolas" w:hAnsi="Consolas"/>
+                <w:rFonts w:ascii="Consolas" w:hAnsi="Consolas"/>
+                <w:sz w:val="18"/>
+                <w:color w:val="000000"/>
+              </w:rPr>
+              <w:t>(</w:t>
+            </w:r>
+            <w:r>
+              <w:rPr>
+                <w:rFonts w:eastAsia="宋体" w:ascii="Consolas" w:hAnsi="Consolas"/>
+                <w:rFonts w:ascii="Consolas" w:hAnsi="Consolas"/>
+                <w:sz w:val="18"/>
+                <w:color w:val="000000"/>
+              </w:rPr>
+              <w:t>data</w:t>
+            </w:r>
+            <w:r>
+              <w:rPr>
+                <w:rFonts w:eastAsia="宋体" w:ascii="Consolas" w:hAnsi="Consolas"/>
+                <w:rFonts w:ascii="Consolas" w:hAnsi="Consolas"/>
+                <w:sz w:val="18"/>
+                <w:color w:val="000000"/>
+              </w:rPr>
+              <w:t>)</w:t>
+            </w:r>
+          </w:p>
+          <w:p>
+            <w:pPr>
+              <w:spacing w:before="0" w:after="0" w:line="220" w:lineRule="exact"/>
+            </w:pPr>
+            <w:r>
+              <w:rPr>
+                <w:rFonts w:eastAsia="宋体" w:ascii="Consolas" w:hAnsi="Consolas"/>
+                <w:rFonts w:ascii="Consolas" w:hAnsi="Consolas"/>
+                <w:sz w:val="18"/>
+                <w:color w:val="000000"/>
+              </w:rPr>
+              <w:t xml:space="preserve">    </w:t>
+            </w:r>
+            <w:r>
+              <w:rPr>
+                <w:rFonts w:eastAsia="宋体" w:ascii="Consolas" w:hAnsi="Consolas"/>
+                <w:rFonts w:ascii="Consolas" w:hAnsi="Consolas"/>
+                <w:sz w:val="18"/>
+                <w:color w:val="000000"/>
+              </w:rPr>
+              <w:t>chunks</w:t>
+            </w:r>
+            <w:r>
+              <w:rPr>
+                <w:rFonts w:eastAsia="宋体" w:ascii="Consolas" w:hAnsi="Consolas"/>
+                <w:rFonts w:ascii="Consolas" w:hAnsi="Consolas"/>
+                <w:sz w:val="18"/>
+                <w:color w:val="000000"/>
+              </w:rPr>
+              <w:t xml:space="preserve"> </w:t>
+            </w:r>
+            <w:r>
+              <w:rPr>
+                <w:rFonts w:eastAsia="宋体" w:ascii="Consolas" w:hAnsi="Consolas"/>
+                <w:rFonts w:ascii="Consolas" w:hAnsi="Consolas"/>
+                <w:sz w:val="18"/>
+                <w:color w:val="000000"/>
+              </w:rPr>
+              <w:t>=</w:t>
+            </w:r>
+            <w:r>
+              <w:rPr>
+                <w:rFonts w:eastAsia="宋体" w:ascii="Consolas" w:hAnsi="Consolas"/>
+                <w:rFonts w:ascii="Consolas" w:hAnsi="Consolas"/>
+                <w:sz w:val="18"/>
+                <w:color w:val="000000"/>
+              </w:rPr>
+              <w:t xml:space="preserve"> </w:t>
+            </w:r>
+            <w:r>
+              <w:rPr>
+                <w:rFonts w:eastAsia="宋体" w:ascii="Consolas" w:hAnsi="Consolas"/>
+                <w:rFonts w:ascii="Consolas" w:hAnsi="Consolas"/>
+                <w:sz w:val="18"/>
+                <w:color w:val="000000"/>
+              </w:rPr>
+              <w:t>[</w:t>
+            </w:r>
+            <w:r>
+              <w:rPr>
+                <w:rFonts w:eastAsia="宋体" w:ascii="Consolas" w:hAnsi="Consolas"/>
+                <w:rFonts w:ascii="Consolas" w:hAnsi="Consolas"/>
+                <w:sz w:val="18"/>
+                <w:color w:val="000000"/>
+              </w:rPr>
+              <w:t>]</w:t>
+            </w:r>
+          </w:p>
+          <w:p>
+            <w:pPr>
+              <w:spacing w:before="0" w:after="0" w:line="220" w:lineRule="exact"/>
+            </w:pPr>
+            <w:r>
+              <w:rPr>
+                <w:rFonts w:eastAsia="宋体" w:ascii="Consolas" w:hAnsi="Consolas"/>
+                <w:rFonts w:ascii="Consolas" w:hAnsi="Consolas"/>
+                <w:sz w:val="18"/>
+                <w:color w:val="000000"/>
+              </w:rPr>
+              <w:t xml:space="preserve">    </w:t>
+            </w:r>
+            <w:r>
+              <w:rPr>
+                <w:rFonts w:eastAsia="宋体" w:ascii="Consolas" w:hAnsi="Consolas"/>
+                <w:rFonts w:ascii="Consolas" w:hAnsi="Consolas"/>
+                <w:sz w:val="18"/>
+                <w:color w:val="000000"/>
+              </w:rPr>
+              <w:t>pos</w:t>
+            </w:r>
+            <w:r>
+              <w:rPr>
+                <w:rFonts w:eastAsia="宋体" w:ascii="Consolas" w:hAnsi="Consolas"/>
+                <w:rFonts w:ascii="Consolas" w:hAnsi="Consolas"/>
+                <w:sz w:val="18"/>
+                <w:color w:val="000000"/>
+              </w:rPr>
+              <w:t xml:space="preserve"> </w:t>
+            </w:r>
+            <w:r>
+              <w:rPr>
+                <w:rFonts w:eastAsia="宋体" w:ascii="Consolas" w:hAnsi="Consolas"/>
+                <w:rFonts w:ascii="Consolas" w:hAnsi="Consolas"/>
+                <w:sz w:val="18"/>
+                <w:color w:val="000000"/>
+              </w:rPr>
+              <w:t>=</w:t>
+            </w:r>
+            <w:r>
+              <w:rPr>
+                <w:rFonts w:eastAsia="宋体" w:ascii="Consolas" w:hAnsi="Consolas"/>
+                <w:rFonts w:ascii="Consolas" w:hAnsi="Consolas"/>
+                <w:sz w:val="18"/>
+                <w:color w:val="000000"/>
+              </w:rPr>
+              <w:t xml:space="preserve"> </w:t>
+            </w:r>
+            <w:r>
+              <w:rPr>
+                <w:rFonts w:eastAsia="宋体" w:ascii="Consolas" w:hAnsi="Consolas"/>
+                <w:rFonts w:ascii="Consolas" w:hAnsi="Consolas"/>
+                <w:sz w:val="18"/>
+                <w:color w:val="098658"/>
+              </w:rPr>
+              <w:t>0</w:t>
+            </w:r>
+          </w:p>
+          <w:p>
+            <w:pPr>
+              <w:spacing w:before="0" w:after="0" w:line="220" w:lineRule="exact"/>
+            </w:pPr>
+            <w:r>
+              <w:rPr>
+                <w:rFonts w:eastAsia="宋体" w:ascii="Consolas" w:hAnsi="Consolas"/>
+                <w:rFonts w:ascii="Consolas" w:hAnsi="Consolas"/>
+                <w:sz w:val="18"/>
+                <w:color w:val="000000"/>
+              </w:rPr>
+              <w:t xml:space="preserve">    </w:t>
+            </w:r>
+            <w:r>
+              <w:rPr>
+                <w:rFonts w:eastAsia="宋体" w:ascii="Consolas" w:hAnsi="Consolas"/>
+                <w:rFonts w:ascii="Consolas" w:hAnsi="Consolas"/>
+                <w:sz w:val="18"/>
+                <w:color w:val="0000FF"/>
+              </w:rPr>
+              <w:t>while</w:t>
+            </w:r>
+            <w:r>
+              <w:rPr>
+                <w:rFonts w:eastAsia="宋体" w:ascii="Consolas" w:hAnsi="Consolas"/>
+                <w:rFonts w:ascii="Consolas" w:hAnsi="Consolas"/>
+                <w:sz w:val="18"/>
+                <w:color w:val="000000"/>
+              </w:rPr>
+              <w:t xml:space="preserve"> </w:t>
+            </w:r>
+            <w:r>
+              <w:rPr>
+                <w:rFonts w:eastAsia="宋体" w:ascii="Consolas" w:hAnsi="Consolas"/>
+                <w:rFonts w:ascii="Consolas" w:hAnsi="Consolas"/>
+                <w:sz w:val="18"/>
+                <w:color w:val="000000"/>
+              </w:rPr>
+              <w:t>pos</w:t>
+            </w:r>
+            <w:r>
+              <w:rPr>
+                <w:rFonts w:eastAsia="宋体" w:ascii="Consolas" w:hAnsi="Consolas"/>
+                <w:rFonts w:ascii="Consolas" w:hAnsi="Consolas"/>
+                <w:sz w:val="18"/>
+                <w:color w:val="000000"/>
+              </w:rPr>
+              <w:t xml:space="preserve"> </w:t>
+            </w:r>
+            <w:r>
+              <w:rPr>
+                <w:rFonts w:eastAsia="宋体" w:ascii="Consolas" w:hAnsi="Consolas"/>
+                <w:rFonts w:ascii="Consolas" w:hAnsi="Consolas"/>
+                <w:sz w:val="18"/>
+                <w:color w:val="000000"/>
+              </w:rPr>
+              <w:t>&lt;</w:t>
+            </w:r>
+            <w:r>
+              <w:rPr>
+                <w:rFonts w:eastAsia="宋体" w:ascii="Consolas" w:hAnsi="Consolas"/>
+                <w:rFonts w:ascii="Consolas" w:hAnsi="Consolas"/>
+                <w:sz w:val="18"/>
+                <w:color w:val="000000"/>
+              </w:rPr>
+              <w:t xml:space="preserve"> </w:t>
+            </w:r>
+            <w:r>
+              <w:rPr>
+                <w:rFonts w:eastAsia="宋体" w:ascii="Consolas" w:hAnsi="Consolas"/>
+                <w:rFonts w:ascii="Consolas" w:hAnsi="Consolas"/>
+                <w:sz w:val="18"/>
+                <w:color w:val="000000"/>
+              </w:rPr>
+              <w:t>total</w:t>
+            </w:r>
+            <w:r>
+              <w:rPr>
+                <w:rFonts w:eastAsia="宋体" w:ascii="Consolas" w:hAnsi="Consolas"/>
+                <w:rFonts w:ascii="Consolas" w:hAnsi="Consolas"/>
+                <w:sz w:val="18"/>
+                <w:color w:val="000000"/>
+              </w:rPr>
+              <w:t>:</w:t>
+            </w:r>
+          </w:p>
+          <w:p>
+            <w:pPr>
+              <w:spacing w:before="0" w:after="0" w:line="220" w:lineRule="exact"/>
+            </w:pPr>
+            <w:r>
+              <w:rPr>
+                <w:rFonts w:eastAsia="宋体" w:ascii="Consolas" w:hAnsi="Consolas"/>
+                <w:rFonts w:ascii="Consolas" w:hAnsi="Consolas"/>
+                <w:sz w:val="18"/>
+                <w:color w:val="000000"/>
+              </w:rPr>
+              <w:t xml:space="preserve">        </w:t>
+            </w:r>
+            <w:r>
+              <w:rPr>
+                <w:rFonts w:eastAsia="宋体" w:ascii="Consolas" w:hAnsi="Consolas"/>
+                <w:rFonts w:ascii="Consolas" w:hAnsi="Consolas"/>
+                <w:sz w:val="18"/>
+                <w:color w:val="000000"/>
+              </w:rPr>
+              <w:t>remaining</w:t>
+            </w:r>
+            <w:r>
+              <w:rPr>
+                <w:rFonts w:eastAsia="宋体" w:ascii="Consolas" w:hAnsi="Consolas"/>
+                <w:rFonts w:ascii="Consolas" w:hAnsi="Consolas"/>
+                <w:sz w:val="18"/>
+                <w:color w:val="000000"/>
+              </w:rPr>
+              <w:t xml:space="preserve"> </w:t>
+            </w:r>
+            <w:r>
+              <w:rPr>
+                <w:rFonts w:eastAsia="宋体" w:ascii="Consolas" w:hAnsi="Consolas"/>
+                <w:rFonts w:ascii="Consolas" w:hAnsi="Consolas"/>
+                <w:sz w:val="18"/>
+                <w:color w:val="000000"/>
+              </w:rPr>
+              <w:t>=</w:t>
+            </w:r>
+            <w:r>
+              <w:rPr>
+                <w:rFonts w:eastAsia="宋体" w:ascii="Consolas" w:hAnsi="Consolas"/>
+                <w:rFonts w:ascii="Consolas" w:hAnsi="Consolas"/>
+                <w:sz w:val="18"/>
+                <w:color w:val="000000"/>
+              </w:rPr>
+              <w:t xml:space="preserve"> </w:t>
+            </w:r>
+            <w:r>
+              <w:rPr>
+                <w:rFonts w:eastAsia="宋体" w:ascii="Consolas" w:hAnsi="Consolas"/>
+                <w:rFonts w:ascii="Consolas" w:hAnsi="Consolas"/>
+                <w:sz w:val="18"/>
+                <w:color w:val="000000"/>
+              </w:rPr>
+              <w:t>total</w:t>
+            </w:r>
+            <w:r>
+              <w:rPr>
+                <w:rFonts w:eastAsia="宋体" w:ascii="Consolas" w:hAnsi="Consolas"/>
+                <w:rFonts w:ascii="Consolas" w:hAnsi="Consolas"/>
+                <w:sz w:val="18"/>
+                <w:color w:val="000000"/>
+              </w:rPr>
+              <w:t xml:space="preserve"> </w:t>
+            </w:r>
+            <w:r>
+              <w:rPr>
+                <w:rFonts w:eastAsia="宋体" w:ascii="Consolas" w:hAnsi="Consolas"/>
+                <w:rFonts w:ascii="Consolas" w:hAnsi="Consolas"/>
+                <w:sz w:val="18"/>
+                <w:color w:val="000000"/>
+              </w:rPr>
+              <w:t>-</w:t>
+            </w:r>
+            <w:r>
+              <w:rPr>
+                <w:rFonts w:eastAsia="宋体" w:ascii="Consolas" w:hAnsi="Consolas"/>
+                <w:rFonts w:ascii="Consolas" w:hAnsi="Consolas"/>
+                <w:sz w:val="18"/>
+                <w:color w:val="000000"/>
+              </w:rPr>
+              <w:t xml:space="preserve"> </w:t>
+            </w:r>
+            <w:r>
+              <w:rPr>
+                <w:rFonts w:eastAsia="宋体" w:ascii="Consolas" w:hAnsi="Consolas"/>
+                <w:rFonts w:ascii="Consolas" w:hAnsi="Consolas"/>
+                <w:sz w:val="18"/>
+                <w:color w:val="000000"/>
+              </w:rPr>
+              <w:t>pos</w:t>
+            </w:r>
+          </w:p>
+          <w:p>
+            <w:pPr>
+              <w:spacing w:before="0" w:after="0" w:line="220" w:lineRule="exact"/>
+            </w:pPr>
+            <w:r>
+              <w:rPr>
+                <w:rFonts w:eastAsia="宋体" w:ascii="Consolas" w:hAnsi="Consolas"/>
+                <w:rFonts w:ascii="Consolas" w:hAnsi="Consolas"/>
+                <w:sz w:val="18"/>
+                <w:color w:val="000000"/>
+              </w:rPr>
+              <w:t xml:space="preserve">        </w:t>
+            </w:r>
+            <w:r>
+              <w:rPr>
+                <w:rFonts w:eastAsia="宋体" w:ascii="Consolas" w:hAnsi="Consolas"/>
+                <w:rFonts w:ascii="Consolas" w:hAnsi="Consolas"/>
+                <w:sz w:val="18"/>
+                <w:color w:val="0000FF"/>
+              </w:rPr>
+              <w:t>if</w:t>
+            </w:r>
+            <w:r>
+              <w:rPr>
+                <w:rFonts w:eastAsia="宋体" w:ascii="Consolas" w:hAnsi="Consolas"/>
+                <w:rFonts w:ascii="Consolas" w:hAnsi="Consolas"/>
+                <w:sz w:val="18"/>
+                <w:color w:val="000000"/>
+              </w:rPr>
+              <w:t xml:space="preserve"> </w:t>
+            </w:r>
+            <w:r>
+              <w:rPr>
+                <w:rFonts w:eastAsia="宋体" w:ascii="Consolas" w:hAnsi="Consolas"/>
+                <w:rFonts w:ascii="Consolas" w:hAnsi="Consolas"/>
+                <w:sz w:val="18"/>
+                <w:color w:val="000000"/>
+              </w:rPr>
+              <w:t>remaining</w:t>
+            </w:r>
+            <w:r>
+              <w:rPr>
+                <w:rFonts w:eastAsia="宋体" w:ascii="Consolas" w:hAnsi="Consolas"/>
+                <w:rFonts w:ascii="Consolas" w:hAnsi="Consolas"/>
+                <w:sz w:val="18"/>
+                <w:color w:val="000000"/>
+              </w:rPr>
+              <w:t xml:space="preserve"> </w:t>
+            </w:r>
+            <w:r>
+              <w:rPr>
+                <w:rFonts w:eastAsia="宋体" w:ascii="Consolas" w:hAnsi="Consolas"/>
+                <w:rFonts w:ascii="Consolas" w:hAnsi="Consolas"/>
+                <w:sz w:val="18"/>
+                <w:color w:val="000000"/>
+              </w:rPr>
+              <w:t>&lt;</w:t>
+            </w:r>
+            <w:r>
+              <w:rPr>
+                <w:rFonts w:eastAsia="宋体" w:ascii="Consolas" w:hAnsi="Consolas"/>
+                <w:rFonts w:ascii="Consolas" w:hAnsi="Consolas"/>
+                <w:sz w:val="18"/>
+                <w:color w:val="000000"/>
+              </w:rPr>
+              <w:t>=</w:t>
+            </w:r>
+            <w:r>
+              <w:rPr>
+                <w:rFonts w:eastAsia="宋体" w:ascii="Consolas" w:hAnsi="Consolas"/>
+                <w:rFonts w:ascii="Consolas" w:hAnsi="Consolas"/>
+                <w:sz w:val="18"/>
+                <w:color w:val="000000"/>
+              </w:rPr>
+              <w:t xml:space="preserve"> </w:t>
+            </w:r>
+            <w:r>
+              <w:rPr>
+                <w:rFonts w:eastAsia="宋体" w:ascii="Consolas" w:hAnsi="Consolas"/>
+                <w:rFonts w:ascii="Consolas" w:hAnsi="Consolas"/>
+                <w:sz w:val="18"/>
+                <w:color w:val="000000"/>
+              </w:rPr>
+              <w:t>lmax</w:t>
+            </w:r>
+            <w:r>
+              <w:rPr>
+                <w:rFonts w:eastAsia="宋体" w:ascii="Consolas" w:hAnsi="Consolas"/>
+                <w:rFonts w:ascii="Consolas" w:hAnsi="Consolas"/>
+                <w:sz w:val="18"/>
+                <w:color w:val="000000"/>
+              </w:rPr>
+              <w:t>:</w:t>
+            </w:r>
+          </w:p>
+          <w:p>
+            <w:pPr>
+              <w:spacing w:before="0" w:after="0" w:line="220" w:lineRule="exact"/>
+            </w:pPr>
+            <w:r>
+              <w:rPr>
+                <w:rFonts w:eastAsia="宋体" w:ascii="Consolas" w:hAnsi="Consolas"/>
+                <w:rFonts w:ascii="Consolas" w:hAnsi="Consolas"/>
+                <w:sz w:val="18"/>
+                <w:color w:val="000000"/>
+              </w:rPr>
+              <w:t xml:space="preserve">            </w:t>
+            </w:r>
+            <w:r>
+              <w:rPr>
+                <w:rFonts w:eastAsia="宋体" w:ascii="Consolas" w:hAnsi="Consolas"/>
+                <w:rFonts w:ascii="Consolas" w:hAnsi="Consolas"/>
+                <w:sz w:val="18"/>
+                <w:color w:val="000000"/>
+              </w:rPr>
+              <w:t>chunks</w:t>
+            </w:r>
+            <w:r>
+              <w:rPr>
+                <w:rFonts w:eastAsia="宋体" w:ascii="Consolas" w:hAnsi="Consolas"/>
+                <w:rFonts w:ascii="Consolas" w:hAnsi="Consolas"/>
+                <w:sz w:val="18"/>
+                <w:color w:val="000000"/>
+              </w:rPr>
+              <w:t>.</w:t>
+            </w:r>
+            <w:r>
+              <w:rPr>
+                <w:rFonts w:eastAsia="宋体" w:ascii="Consolas" w:hAnsi="Consolas"/>
+                <w:rFonts w:ascii="Consolas" w:hAnsi="Consolas"/>
+                <w:sz w:val="18"/>
+                <w:color w:val="000000"/>
+              </w:rPr>
+              <w:t>append</w:t>
+            </w:r>
+            <w:r>
+              <w:rPr>
+                <w:rFonts w:eastAsia="宋体" w:ascii="Consolas" w:hAnsi="Consolas"/>
+                <w:rFonts w:ascii="Consolas" w:hAnsi="Consolas"/>
+                <w:sz w:val="18"/>
+                <w:color w:val="000000"/>
+              </w:rPr>
+              <w:t>(</w:t>
+            </w:r>
+            <w:r>
+              <w:rPr>
+                <w:rFonts w:eastAsia="宋体" w:ascii="Consolas" w:hAnsi="Consolas"/>
+                <w:rFonts w:ascii="Consolas" w:hAnsi="Consolas"/>
+                <w:sz w:val="18"/>
+                <w:color w:val="000000"/>
+              </w:rPr>
+              <w:t>remaining</w:t>
+            </w:r>
+            <w:r>
+              <w:rPr>
+                <w:rFonts w:eastAsia="宋体" w:ascii="Consolas" w:hAnsi="Consolas"/>
+                <w:rFonts w:ascii="Consolas" w:hAnsi="Consolas"/>
+                <w:sz w:val="18"/>
+                <w:color w:val="000000"/>
+              </w:rPr>
+              <w:t>)</w:t>
+            </w:r>
+          </w:p>
+          <w:p>
+            <w:pPr>
+              <w:spacing w:before="0" w:after="0" w:line="220" w:lineRule="exact"/>
+            </w:pPr>
+            <w:r>
+              <w:rPr>
+                <w:rFonts w:eastAsia="宋体" w:ascii="Consolas" w:hAnsi="Consolas"/>
+                <w:rFonts w:ascii="Consolas" w:hAnsi="Consolas"/>
+                <w:sz w:val="18"/>
+                <w:color w:val="000000"/>
+              </w:rPr>
+              <w:t xml:space="preserve">            </w:t>
+            </w:r>
+            <w:r>
+              <w:rPr>
+                <w:rFonts w:eastAsia="宋体" w:ascii="Consolas" w:hAnsi="Consolas"/>
+                <w:rFonts w:ascii="Consolas" w:hAnsi="Consolas"/>
+                <w:sz w:val="18"/>
+                <w:color w:val="0000FF"/>
+              </w:rPr>
+              <w:t>break</w:t>
+            </w:r>
+          </w:p>
+          <w:p>
+            <w:pPr>
+              <w:spacing w:before="0" w:after="0" w:line="220" w:lineRule="exact"/>
+            </w:pPr>
+            <w:r>
+              <w:rPr>
+                <w:rFonts w:eastAsia="宋体" w:ascii="Consolas" w:hAnsi="Consolas"/>
+                <w:rFonts w:ascii="Consolas" w:hAnsi="Consolas"/>
+                <w:sz w:val="18"/>
+                <w:color w:val="000000"/>
+              </w:rPr>
+              <w:t xml:space="preserve">        </w:t>
+            </w:r>
+            <w:r>
+              <w:rPr>
+                <w:rFonts w:eastAsia="宋体" w:ascii="Consolas" w:hAnsi="Consolas"/>
+                <w:rFonts w:ascii="Consolas" w:hAnsi="Consolas"/>
+                <w:sz w:val="18"/>
+                <w:color w:val="000000"/>
+              </w:rPr>
+              <w:t>size</w:t>
+            </w:r>
+            <w:r>
+              <w:rPr>
+                <w:rFonts w:eastAsia="宋体" w:ascii="Consolas" w:hAnsi="Consolas"/>
+                <w:rFonts w:ascii="Consolas" w:hAnsi="Consolas"/>
+                <w:sz w:val="18"/>
+                <w:color w:val="000000"/>
+              </w:rPr>
+              <w:t xml:space="preserve"> </w:t>
+            </w:r>
+            <w:r>
+              <w:rPr>
+                <w:rFonts w:eastAsia="宋体" w:ascii="Consolas" w:hAnsi="Consolas"/>
+                <w:rFonts w:ascii="Consolas" w:hAnsi="Consolas"/>
+                <w:sz w:val="18"/>
+                <w:color w:val="000000"/>
+              </w:rPr>
+              <w:t>=</w:t>
+            </w:r>
+            <w:r>
+              <w:rPr>
+                <w:rFonts w:eastAsia="宋体" w:ascii="Consolas" w:hAnsi="Consolas"/>
+                <w:rFonts w:ascii="Consolas" w:hAnsi="Consolas"/>
+                <w:sz w:val="18"/>
+                <w:color w:val="000000"/>
+              </w:rPr>
+              <w:t xml:space="preserve"> </w:t>
+            </w:r>
+            <w:r>
+              <w:rPr>
+                <w:rFonts w:eastAsia="宋体" w:ascii="Consolas" w:hAnsi="Consolas"/>
+                <w:rFonts w:ascii="Consolas" w:hAnsi="Consolas"/>
+                <w:sz w:val="18"/>
+                <w:color w:val="000000"/>
+              </w:rPr>
+              <w:t>rng</w:t>
+            </w:r>
+            <w:r>
+              <w:rPr>
+                <w:rFonts w:eastAsia="宋体" w:ascii="Consolas" w:hAnsi="Consolas"/>
+                <w:rFonts w:ascii="Consolas" w:hAnsi="Consolas"/>
+                <w:sz w:val="18"/>
+                <w:color w:val="000000"/>
+              </w:rPr>
+              <w:t>.</w:t>
+            </w:r>
+            <w:r>
+              <w:rPr>
+                <w:rFonts w:eastAsia="宋体" w:ascii="Consolas" w:hAnsi="Consolas"/>
+                <w:rFonts w:ascii="Consolas" w:hAnsi="Consolas"/>
+                <w:sz w:val="18"/>
+                <w:color w:val="000000"/>
+              </w:rPr>
+              <w:t>randint</w:t>
+            </w:r>
+            <w:r>
+              <w:rPr>
+                <w:rFonts w:eastAsia="宋体" w:ascii="Consolas" w:hAnsi="Consolas"/>
+                <w:rFonts w:ascii="Consolas" w:hAnsi="Consolas"/>
+                <w:sz w:val="18"/>
+                <w:color w:val="000000"/>
+              </w:rPr>
+              <w:t>(</w:t>
+            </w:r>
+            <w:r>
+              <w:rPr>
+                <w:rFonts w:eastAsia="宋体" w:ascii="Consolas" w:hAnsi="Consolas"/>
+                <w:rFonts w:ascii="Consolas" w:hAnsi="Consolas"/>
+                <w:sz w:val="18"/>
+                <w:color w:val="000000"/>
+              </w:rPr>
+              <w:t>lmin</w:t>
+            </w:r>
+            <w:r>
+              <w:rPr>
+                <w:rFonts w:eastAsia="宋体" w:ascii="Consolas" w:hAnsi="Consolas"/>
+                <w:rFonts w:ascii="Consolas" w:hAnsi="Consolas"/>
+                <w:sz w:val="18"/>
+                <w:color w:val="000000"/>
+              </w:rPr>
+              <w:t>,</w:t>
+            </w:r>
+            <w:r>
+              <w:rPr>
+                <w:rFonts w:eastAsia="宋体" w:ascii="Consolas" w:hAnsi="Consolas"/>
+                <w:rFonts w:ascii="Consolas" w:hAnsi="Consolas"/>
+                <w:sz w:val="18"/>
+                <w:color w:val="000000"/>
+              </w:rPr>
+              <w:t xml:space="preserve"> </w:t>
+            </w:r>
+            <w:r>
+              <w:rPr>
+                <w:rFonts w:eastAsia="宋体" w:ascii="Consolas" w:hAnsi="Consolas"/>
+                <w:rFonts w:ascii="Consolas" w:hAnsi="Consolas"/>
+                <w:sz w:val="18"/>
+                <w:color w:val="000000"/>
+              </w:rPr>
+              <w:t>lmax</w:t>
+            </w:r>
+            <w:r>
+              <w:rPr>
+                <w:rFonts w:eastAsia="宋体" w:ascii="Consolas" w:hAnsi="Consolas"/>
+                <w:rFonts w:ascii="Consolas" w:hAnsi="Consolas"/>
+                <w:sz w:val="18"/>
+                <w:color w:val="000000"/>
+              </w:rPr>
+              <w:t>)</w:t>
+            </w:r>
+          </w:p>
+          <w:p>
+            <w:pPr>
+              <w:spacing w:before="0" w:after="0" w:line="220" w:lineRule="exact"/>
+            </w:pPr>
+            <w:r>
+              <w:rPr>
+                <w:rFonts w:eastAsia="宋体" w:ascii="Consolas" w:hAnsi="Consolas"/>
+                <w:rFonts w:ascii="Consolas" w:hAnsi="Consolas"/>
+                <w:sz w:val="18"/>
+                <w:color w:val="000000"/>
+              </w:rPr>
+              <w:t xml:space="preserve">        </w:t>
+            </w:r>
+            <w:r>
+              <w:rPr>
+                <w:rFonts w:eastAsia="宋体" w:ascii="Consolas" w:hAnsi="Consolas"/>
+                <w:rFonts w:ascii="Consolas" w:hAnsi="Consolas"/>
+                <w:sz w:val="18"/>
+                <w:color w:val="000000"/>
+              </w:rPr>
+              <w:t>chunks</w:t>
+            </w:r>
+            <w:r>
+              <w:rPr>
+                <w:rFonts w:eastAsia="宋体" w:ascii="Consolas" w:hAnsi="Consolas"/>
+                <w:rFonts w:ascii="Consolas" w:hAnsi="Consolas"/>
+                <w:sz w:val="18"/>
+                <w:color w:val="000000"/>
+              </w:rPr>
+              <w:t>.</w:t>
+            </w:r>
+            <w:r>
+              <w:rPr>
+                <w:rFonts w:eastAsia="宋体" w:ascii="Consolas" w:hAnsi="Consolas"/>
+                <w:rFonts w:ascii="Consolas" w:hAnsi="Consolas"/>
+                <w:sz w:val="18"/>
+                <w:color w:val="000000"/>
+              </w:rPr>
+              <w:t>append</w:t>
+            </w:r>
+            <w:r>
+              <w:rPr>
+                <w:rFonts w:eastAsia="宋体" w:ascii="Consolas" w:hAnsi="Consolas"/>
+                <w:rFonts w:ascii="Consolas" w:hAnsi="Consolas"/>
+                <w:sz w:val="18"/>
+                <w:color w:val="000000"/>
+              </w:rPr>
+              <w:t>(</w:t>
+            </w:r>
+            <w:r>
+              <w:rPr>
+                <w:rFonts w:eastAsia="宋体" w:ascii="Consolas" w:hAnsi="Consolas"/>
+                <w:rFonts w:ascii="Consolas" w:hAnsi="Consolas"/>
+                <w:sz w:val="18"/>
+                <w:color w:val="000000"/>
+              </w:rPr>
+              <w:t>size</w:t>
+            </w:r>
+            <w:r>
+              <w:rPr>
+                <w:rFonts w:eastAsia="宋体" w:ascii="Consolas" w:hAnsi="Consolas"/>
+                <w:rFonts w:ascii="Consolas" w:hAnsi="Consolas"/>
+                <w:sz w:val="18"/>
+                <w:color w:val="000000"/>
+              </w:rPr>
+              <w:t>)</w:t>
+            </w:r>
+          </w:p>
+          <w:p>
+            <w:pPr>
+              <w:spacing w:before="0" w:after="0" w:line="220" w:lineRule="exact"/>
+            </w:pPr>
+            <w:r>
+              <w:rPr>
+                <w:rFonts w:eastAsia="宋体" w:ascii="Consolas" w:hAnsi="Consolas"/>
+                <w:rFonts w:ascii="Consolas" w:hAnsi="Consolas"/>
+                <w:sz w:val="18"/>
+                <w:color w:val="000000"/>
+              </w:rPr>
+              <w:t xml:space="preserve">        </w:t>
+            </w:r>
+            <w:r>
+              <w:rPr>
+                <w:rFonts w:eastAsia="宋体" w:ascii="Consolas" w:hAnsi="Consolas"/>
+                <w:rFonts w:ascii="Consolas" w:hAnsi="Consolas"/>
+                <w:sz w:val="18"/>
+                <w:color w:val="000000"/>
+              </w:rPr>
+              <w:t>pos</w:t>
+            </w:r>
+            <w:r>
+              <w:rPr>
+                <w:rFonts w:eastAsia="宋体" w:ascii="Consolas" w:hAnsi="Consolas"/>
+                <w:rFonts w:ascii="Consolas" w:hAnsi="Consolas"/>
+                <w:sz w:val="18"/>
+                <w:color w:val="000000"/>
+              </w:rPr>
+              <w:t xml:space="preserve"> </w:t>
+            </w:r>
+            <w:r>
+              <w:rPr>
+                <w:rFonts w:eastAsia="宋体" w:ascii="Consolas" w:hAnsi="Consolas"/>
+                <w:rFonts w:ascii="Consolas" w:hAnsi="Consolas"/>
+                <w:sz w:val="18"/>
+                <w:color w:val="000000"/>
+              </w:rPr>
+              <w:t>+</w:t>
+            </w:r>
+            <w:r>
+              <w:rPr>
+                <w:rFonts w:eastAsia="宋体" w:ascii="Consolas" w:hAnsi="Consolas"/>
+                <w:rFonts w:ascii="Consolas" w:hAnsi="Consolas"/>
+                <w:sz w:val="18"/>
+                <w:color w:val="000000"/>
+              </w:rPr>
+              <w:t>=</w:t>
+            </w:r>
+            <w:r>
+              <w:rPr>
+                <w:rFonts w:eastAsia="宋体" w:ascii="Consolas" w:hAnsi="Consolas"/>
+                <w:rFonts w:ascii="Consolas" w:hAnsi="Consolas"/>
+                <w:sz w:val="18"/>
+                <w:color w:val="000000"/>
+              </w:rPr>
+              <w:t xml:space="preserve"> </w:t>
+            </w:r>
+            <w:r>
+              <w:rPr>
+                <w:rFonts w:eastAsia="宋体" w:ascii="Consolas" w:hAnsi="Consolas"/>
+                <w:rFonts w:ascii="Consolas" w:hAnsi="Consolas"/>
+                <w:sz w:val="18"/>
+                <w:color w:val="000000"/>
+              </w:rPr>
+              <w:t>size</w:t>
+            </w:r>
+          </w:p>
+          <w:p>
+            <w:pPr>
+              <w:spacing w:before="0" w:after="0" w:line="220" w:lineRule="exact"/>
+            </w:pPr>
+            <w:r>
+              <w:rPr>
+                <w:rFonts w:eastAsia="宋体" w:ascii="Consolas" w:hAnsi="Consolas"/>
+                <w:rFonts w:ascii="Consolas" w:hAnsi="Consolas"/>
+                <w:sz w:val="18"/>
+                <w:color w:val="000000"/>
+              </w:rPr>
+              <w:t xml:space="preserve">    </w:t>
+            </w:r>
+            <w:r>
+              <w:rPr>
+                <w:rFonts w:eastAsia="宋体" w:ascii="Consolas" w:hAnsi="Consolas"/>
+                <w:rFonts w:ascii="Consolas" w:hAnsi="Consolas"/>
+                <w:sz w:val="18"/>
+                <w:color w:val="0000FF"/>
+              </w:rPr>
+              <w:t>return</w:t>
+            </w:r>
+            <w:r>
+              <w:rPr>
+                <w:rFonts w:eastAsia="宋体" w:ascii="Consolas" w:hAnsi="Consolas"/>
+                <w:rFonts w:ascii="Consolas" w:hAnsi="Consolas"/>
+                <w:sz w:val="18"/>
+                <w:color w:val="000000"/>
+              </w:rPr>
+              <w:t xml:space="preserve"> </w:t>
+            </w:r>
+            <w:r>
+              <w:rPr>
+                <w:rFonts w:eastAsia="宋体" w:ascii="Consolas" w:hAnsi="Consolas"/>
+                <w:rFonts w:ascii="Consolas" w:hAnsi="Consolas"/>
+                <w:sz w:val="18"/>
+                <w:color w:val="000000"/>
+              </w:rPr>
+              <w:t>chunks</w:t>
+            </w:r>
+          </w:p>
+          <w:p>
+            <w:pPr>
+              <w:spacing w:before="0" w:after="80" w:line="220" w:lineRule="exact"/>
+            </w:pPr>
           </w:p>
         </w:tc>
       </w:tr>
@@ -228,34 +1704,791 @@
           <w:tcPr>
             <w:tcW w:type="dxa" w:w="8640"/>
             <w:shd w:fill="F5F5F5" w:val="clear"/>
+            <w:tcBorders>
+              <w:top w:val="single" w:sz="4" w:space="0" w:color="999999"/>
+              <w:left w:val="single" w:sz="4" w:space="0" w:color="999999"/>
+              <w:bottom w:val="single" w:sz="4" w:space="0" w:color="999999"/>
+              <w:right w:val="single" w:sz="4" w:space="0" w:color="999999"/>
+            </w:tcBorders>
           </w:tcPr>
           <w:p>
             <w:pPr>
-              <w:spacing w:before="80" w:after="80"/>
+              <w:spacing w:before="80" w:line="220" w:lineRule="exact"/>
             </w:pPr>
             <w:r>
               <w:rPr>
                 <w:rFonts w:eastAsia="宋体" w:ascii="Consolas" w:hAnsi="Consolas"/>
                 <w:rFonts w:ascii="Consolas" w:hAnsi="Consolas"/>
                 <w:sz w:val="18"/>
-              </w:rPr>
-              <w:t>TYPE_INIT = 1     # Initialization: [1B Type][4B N]</w:t>
-              <w:br/>
-              <w:t>TYPE_AGREE = 2    # agree:          [1B Type]</w:t>
-              <w:br/>
-              <w:t>TYPE_REQUEST = 3  # reverseRequest: [1B Type][4B Length][Data]</w:t>
-              <w:br/>
-              <w:t>TYPE_ANSWER = 4   # reverseAnswer:  [1B Type][4B Length][Data]</w:t>
-              <w:br/>
-              <w:br/>
-              <w:t>init = struct.pack("!BI", TYPE_INIT, n_blocks)</w:t>
-              <w:br/>
-              <w:t>msg_type, n = struct.unpack("!BI", header)</w:t>
-              <w:br/>
-              <w:t>conn.sendall(answer)</w:t>
-              <w:br/>
-              <w:t>data = recv_exact(sock, n)</w:t>
-            </w:r>
+                <w:color w:val="000000"/>
+              </w:rPr>
+              <w:t>TYPE_INIT</w:t>
+            </w:r>
+            <w:r>
+              <w:rPr>
+                <w:rFonts w:eastAsia="宋体" w:ascii="Consolas" w:hAnsi="Consolas"/>
+                <w:rFonts w:ascii="Consolas" w:hAnsi="Consolas"/>
+                <w:sz w:val="18"/>
+                <w:color w:val="000000"/>
+              </w:rPr>
+              <w:t xml:space="preserve"> </w:t>
+            </w:r>
+            <w:r>
+              <w:rPr>
+                <w:rFonts w:eastAsia="宋体" w:ascii="Consolas" w:hAnsi="Consolas"/>
+                <w:rFonts w:ascii="Consolas" w:hAnsi="Consolas"/>
+                <w:sz w:val="18"/>
+                <w:color w:val="000000"/>
+              </w:rPr>
+              <w:t>=</w:t>
+            </w:r>
+            <w:r>
+              <w:rPr>
+                <w:rFonts w:eastAsia="宋体" w:ascii="Consolas" w:hAnsi="Consolas"/>
+                <w:rFonts w:ascii="Consolas" w:hAnsi="Consolas"/>
+                <w:sz w:val="18"/>
+                <w:color w:val="000000"/>
+              </w:rPr>
+              <w:t xml:space="preserve"> </w:t>
+            </w:r>
+            <w:r>
+              <w:rPr>
+                <w:rFonts w:eastAsia="宋体" w:ascii="Consolas" w:hAnsi="Consolas"/>
+                <w:rFonts w:ascii="Consolas" w:hAnsi="Consolas"/>
+                <w:sz w:val="18"/>
+                <w:color w:val="098658"/>
+              </w:rPr>
+              <w:t>1</w:t>
+            </w:r>
+            <w:r>
+              <w:rPr>
+                <w:rFonts w:eastAsia="宋体" w:ascii="Consolas" w:hAnsi="Consolas"/>
+                <w:rFonts w:ascii="Consolas" w:hAnsi="Consolas"/>
+                <w:sz w:val="18"/>
+                <w:color w:val="000000"/>
+              </w:rPr>
+              <w:t xml:space="preserve">     </w:t>
+            </w:r>
+            <w:r>
+              <w:rPr>
+                <w:rFonts w:eastAsia="宋体" w:ascii="Consolas" w:hAnsi="Consolas"/>
+                <w:rFonts w:ascii="Consolas" w:hAnsi="Consolas"/>
+                <w:sz w:val="18"/>
+                <w:color w:val="008000"/>
+              </w:rPr>
+              <w:t># Initialization: [1B Type][4B N]</w:t>
+            </w:r>
+          </w:p>
+          <w:p>
+            <w:pPr>
+              <w:spacing w:before="0" w:after="0" w:line="220" w:lineRule="exact"/>
+            </w:pPr>
+            <w:r>
+              <w:rPr>
+                <w:rFonts w:eastAsia="宋体" w:ascii="Consolas" w:hAnsi="Consolas"/>
+                <w:rFonts w:ascii="Consolas" w:hAnsi="Consolas"/>
+                <w:sz w:val="18"/>
+                <w:color w:val="000000"/>
+              </w:rPr>
+              <w:t>TYPE_AGREE</w:t>
+            </w:r>
+            <w:r>
+              <w:rPr>
+                <w:rFonts w:eastAsia="宋体" w:ascii="Consolas" w:hAnsi="Consolas"/>
+                <w:rFonts w:ascii="Consolas" w:hAnsi="Consolas"/>
+                <w:sz w:val="18"/>
+                <w:color w:val="000000"/>
+              </w:rPr>
+              <w:t xml:space="preserve"> </w:t>
+            </w:r>
+            <w:r>
+              <w:rPr>
+                <w:rFonts w:eastAsia="宋体" w:ascii="Consolas" w:hAnsi="Consolas"/>
+                <w:rFonts w:ascii="Consolas" w:hAnsi="Consolas"/>
+                <w:sz w:val="18"/>
+                <w:color w:val="000000"/>
+              </w:rPr>
+              <w:t>=</w:t>
+            </w:r>
+            <w:r>
+              <w:rPr>
+                <w:rFonts w:eastAsia="宋体" w:ascii="Consolas" w:hAnsi="Consolas"/>
+                <w:rFonts w:ascii="Consolas" w:hAnsi="Consolas"/>
+                <w:sz w:val="18"/>
+                <w:color w:val="000000"/>
+              </w:rPr>
+              <w:t xml:space="preserve"> </w:t>
+            </w:r>
+            <w:r>
+              <w:rPr>
+                <w:rFonts w:eastAsia="宋体" w:ascii="Consolas" w:hAnsi="Consolas"/>
+                <w:rFonts w:ascii="Consolas" w:hAnsi="Consolas"/>
+                <w:sz w:val="18"/>
+                <w:color w:val="098658"/>
+              </w:rPr>
+              <w:t>2</w:t>
+            </w:r>
+            <w:r>
+              <w:rPr>
+                <w:rFonts w:eastAsia="宋体" w:ascii="Consolas" w:hAnsi="Consolas"/>
+                <w:rFonts w:ascii="Consolas" w:hAnsi="Consolas"/>
+                <w:sz w:val="18"/>
+                <w:color w:val="000000"/>
+              </w:rPr>
+              <w:t xml:space="preserve">    </w:t>
+            </w:r>
+            <w:r>
+              <w:rPr>
+                <w:rFonts w:eastAsia="宋体" w:ascii="Consolas" w:hAnsi="Consolas"/>
+                <w:rFonts w:ascii="Consolas" w:hAnsi="Consolas"/>
+                <w:sz w:val="18"/>
+                <w:color w:val="008000"/>
+              </w:rPr>
+              <w:t># agree:          [1B Type]</w:t>
+            </w:r>
+          </w:p>
+          <w:p>
+            <w:pPr>
+              <w:spacing w:before="0" w:after="0" w:line="220" w:lineRule="exact"/>
+            </w:pPr>
+            <w:r>
+              <w:rPr>
+                <w:rFonts w:eastAsia="宋体" w:ascii="Consolas" w:hAnsi="Consolas"/>
+                <w:rFonts w:ascii="Consolas" w:hAnsi="Consolas"/>
+                <w:sz w:val="18"/>
+                <w:color w:val="000000"/>
+              </w:rPr>
+              <w:t>TYPE_REQUEST</w:t>
+            </w:r>
+            <w:r>
+              <w:rPr>
+                <w:rFonts w:eastAsia="宋体" w:ascii="Consolas" w:hAnsi="Consolas"/>
+                <w:rFonts w:ascii="Consolas" w:hAnsi="Consolas"/>
+                <w:sz w:val="18"/>
+                <w:color w:val="000000"/>
+              </w:rPr>
+              <w:t xml:space="preserve"> </w:t>
+            </w:r>
+            <w:r>
+              <w:rPr>
+                <w:rFonts w:eastAsia="宋体" w:ascii="Consolas" w:hAnsi="Consolas"/>
+                <w:rFonts w:ascii="Consolas" w:hAnsi="Consolas"/>
+                <w:sz w:val="18"/>
+                <w:color w:val="000000"/>
+              </w:rPr>
+              <w:t>=</w:t>
+            </w:r>
+            <w:r>
+              <w:rPr>
+                <w:rFonts w:eastAsia="宋体" w:ascii="Consolas" w:hAnsi="Consolas"/>
+                <w:rFonts w:ascii="Consolas" w:hAnsi="Consolas"/>
+                <w:sz w:val="18"/>
+                <w:color w:val="000000"/>
+              </w:rPr>
+              <w:t xml:space="preserve"> </w:t>
+            </w:r>
+            <w:r>
+              <w:rPr>
+                <w:rFonts w:eastAsia="宋体" w:ascii="Consolas" w:hAnsi="Consolas"/>
+                <w:rFonts w:ascii="Consolas" w:hAnsi="Consolas"/>
+                <w:sz w:val="18"/>
+                <w:color w:val="098658"/>
+              </w:rPr>
+              <w:t>3</w:t>
+            </w:r>
+            <w:r>
+              <w:rPr>
+                <w:rFonts w:eastAsia="宋体" w:ascii="Consolas" w:hAnsi="Consolas"/>
+                <w:rFonts w:ascii="Consolas" w:hAnsi="Consolas"/>
+                <w:sz w:val="18"/>
+                <w:color w:val="000000"/>
+              </w:rPr>
+              <w:t xml:space="preserve">  </w:t>
+            </w:r>
+            <w:r>
+              <w:rPr>
+                <w:rFonts w:eastAsia="宋体" w:ascii="Consolas" w:hAnsi="Consolas"/>
+                <w:rFonts w:ascii="Consolas" w:hAnsi="Consolas"/>
+                <w:sz w:val="18"/>
+                <w:color w:val="008000"/>
+              </w:rPr>
+              <w:t># reverseRequest: [1B Type][4B Length][Data]</w:t>
+            </w:r>
+          </w:p>
+          <w:p>
+            <w:pPr>
+              <w:spacing w:before="0" w:after="0" w:line="220" w:lineRule="exact"/>
+            </w:pPr>
+            <w:r>
+              <w:rPr>
+                <w:rFonts w:eastAsia="宋体" w:ascii="Consolas" w:hAnsi="Consolas"/>
+                <w:rFonts w:ascii="Consolas" w:hAnsi="Consolas"/>
+                <w:sz w:val="18"/>
+                <w:color w:val="000000"/>
+              </w:rPr>
+              <w:t>TYPE_ANSWER</w:t>
+            </w:r>
+            <w:r>
+              <w:rPr>
+                <w:rFonts w:eastAsia="宋体" w:ascii="Consolas" w:hAnsi="Consolas"/>
+                <w:rFonts w:ascii="Consolas" w:hAnsi="Consolas"/>
+                <w:sz w:val="18"/>
+                <w:color w:val="000000"/>
+              </w:rPr>
+              <w:t xml:space="preserve"> </w:t>
+            </w:r>
+            <w:r>
+              <w:rPr>
+                <w:rFonts w:eastAsia="宋体" w:ascii="Consolas" w:hAnsi="Consolas"/>
+                <w:rFonts w:ascii="Consolas" w:hAnsi="Consolas"/>
+                <w:sz w:val="18"/>
+                <w:color w:val="000000"/>
+              </w:rPr>
+              <w:t>=</w:t>
+            </w:r>
+            <w:r>
+              <w:rPr>
+                <w:rFonts w:eastAsia="宋体" w:ascii="Consolas" w:hAnsi="Consolas"/>
+                <w:rFonts w:ascii="Consolas" w:hAnsi="Consolas"/>
+                <w:sz w:val="18"/>
+                <w:color w:val="000000"/>
+              </w:rPr>
+              <w:t xml:space="preserve"> </w:t>
+            </w:r>
+            <w:r>
+              <w:rPr>
+                <w:rFonts w:eastAsia="宋体" w:ascii="Consolas" w:hAnsi="Consolas"/>
+                <w:rFonts w:ascii="Consolas" w:hAnsi="Consolas"/>
+                <w:sz w:val="18"/>
+                <w:color w:val="098658"/>
+              </w:rPr>
+              <w:t>4</w:t>
+            </w:r>
+            <w:r>
+              <w:rPr>
+                <w:rFonts w:eastAsia="宋体" w:ascii="Consolas" w:hAnsi="Consolas"/>
+                <w:rFonts w:ascii="Consolas" w:hAnsi="Consolas"/>
+                <w:sz w:val="18"/>
+                <w:color w:val="000000"/>
+              </w:rPr>
+              <w:t xml:space="preserve">   </w:t>
+            </w:r>
+            <w:r>
+              <w:rPr>
+                <w:rFonts w:eastAsia="宋体" w:ascii="Consolas" w:hAnsi="Consolas"/>
+                <w:rFonts w:ascii="Consolas" w:hAnsi="Consolas"/>
+                <w:sz w:val="18"/>
+                <w:color w:val="008000"/>
+              </w:rPr>
+              <w:t># reverseAnswer:  [1B Type][4B Length][Data]</w:t>
+            </w:r>
+          </w:p>
+          <w:p>
+            <w:pPr>
+              <w:spacing w:before="0" w:after="0" w:line="220" w:lineRule="exact"/>
+            </w:pPr>
+          </w:p>
+          <w:p>
+            <w:pPr>
+              <w:spacing w:before="0" w:after="0" w:line="220" w:lineRule="exact"/>
+            </w:pPr>
+            <w:r>
+              <w:rPr>
+                <w:rFonts w:eastAsia="宋体" w:ascii="Consolas" w:hAnsi="Consolas"/>
+                <w:rFonts w:ascii="Consolas" w:hAnsi="Consolas"/>
+                <w:sz w:val="18"/>
+                <w:color w:val="000000"/>
+              </w:rPr>
+              <w:t>init</w:t>
+            </w:r>
+            <w:r>
+              <w:rPr>
+                <w:rFonts w:eastAsia="宋体" w:ascii="Consolas" w:hAnsi="Consolas"/>
+                <w:rFonts w:ascii="Consolas" w:hAnsi="Consolas"/>
+                <w:sz w:val="18"/>
+                <w:color w:val="000000"/>
+              </w:rPr>
+              <w:t xml:space="preserve"> </w:t>
+            </w:r>
+            <w:r>
+              <w:rPr>
+                <w:rFonts w:eastAsia="宋体" w:ascii="Consolas" w:hAnsi="Consolas"/>
+                <w:rFonts w:ascii="Consolas" w:hAnsi="Consolas"/>
+                <w:sz w:val="18"/>
+                <w:color w:val="000000"/>
+              </w:rPr>
+              <w:t>=</w:t>
+            </w:r>
+            <w:r>
+              <w:rPr>
+                <w:rFonts w:eastAsia="宋体" w:ascii="Consolas" w:hAnsi="Consolas"/>
+                <w:rFonts w:ascii="Consolas" w:hAnsi="Consolas"/>
+                <w:sz w:val="18"/>
+                <w:color w:val="000000"/>
+              </w:rPr>
+              <w:t xml:space="preserve"> </w:t>
+            </w:r>
+            <w:r>
+              <w:rPr>
+                <w:rFonts w:eastAsia="宋体" w:ascii="Consolas" w:hAnsi="Consolas"/>
+                <w:rFonts w:ascii="Consolas" w:hAnsi="Consolas"/>
+                <w:sz w:val="18"/>
+                <w:color w:val="000000"/>
+              </w:rPr>
+              <w:t>struct</w:t>
+            </w:r>
+            <w:r>
+              <w:rPr>
+                <w:rFonts w:eastAsia="宋体" w:ascii="Consolas" w:hAnsi="Consolas"/>
+                <w:rFonts w:ascii="Consolas" w:hAnsi="Consolas"/>
+                <w:sz w:val="18"/>
+                <w:color w:val="000000"/>
+              </w:rPr>
+              <w:t>.</w:t>
+            </w:r>
+            <w:r>
+              <w:rPr>
+                <w:rFonts w:eastAsia="宋体" w:ascii="Consolas" w:hAnsi="Consolas"/>
+                <w:rFonts w:ascii="Consolas" w:hAnsi="Consolas"/>
+                <w:sz w:val="18"/>
+                <w:color w:val="000000"/>
+              </w:rPr>
+              <w:t>pack</w:t>
+            </w:r>
+            <w:r>
+              <w:rPr>
+                <w:rFonts w:eastAsia="宋体" w:ascii="Consolas" w:hAnsi="Consolas"/>
+                <w:rFonts w:ascii="Consolas" w:hAnsi="Consolas"/>
+                <w:sz w:val="18"/>
+                <w:color w:val="000000"/>
+              </w:rPr>
+              <w:t>(</w:t>
+            </w:r>
+            <w:r>
+              <w:rPr>
+                <w:rFonts w:eastAsia="宋体" w:ascii="Consolas" w:hAnsi="Consolas"/>
+                <w:rFonts w:ascii="Consolas" w:hAnsi="Consolas"/>
+                <w:sz w:val="18"/>
+                <w:color w:val="A31515"/>
+              </w:rPr>
+              <w:t>"</w:t>
+            </w:r>
+            <w:r>
+              <w:rPr>
+                <w:rFonts w:eastAsia="宋体" w:ascii="Consolas" w:hAnsi="Consolas"/>
+                <w:rFonts w:ascii="Consolas" w:hAnsi="Consolas"/>
+                <w:sz w:val="18"/>
+                <w:color w:val="A31515"/>
+              </w:rPr>
+              <w:t>!BI</w:t>
+            </w:r>
+            <w:r>
+              <w:rPr>
+                <w:rFonts w:eastAsia="宋体" w:ascii="Consolas" w:hAnsi="Consolas"/>
+                <w:rFonts w:ascii="Consolas" w:hAnsi="Consolas"/>
+                <w:sz w:val="18"/>
+                <w:color w:val="A31515"/>
+              </w:rPr>
+              <w:t>"</w:t>
+            </w:r>
+            <w:r>
+              <w:rPr>
+                <w:rFonts w:eastAsia="宋体" w:ascii="Consolas" w:hAnsi="Consolas"/>
+                <w:rFonts w:ascii="Consolas" w:hAnsi="Consolas"/>
+                <w:sz w:val="18"/>
+                <w:color w:val="000000"/>
+              </w:rPr>
+              <w:t>,</w:t>
+            </w:r>
+            <w:r>
+              <w:rPr>
+                <w:rFonts w:eastAsia="宋体" w:ascii="Consolas" w:hAnsi="Consolas"/>
+                <w:rFonts w:ascii="Consolas" w:hAnsi="Consolas"/>
+                <w:sz w:val="18"/>
+                <w:color w:val="000000"/>
+              </w:rPr>
+              <w:t xml:space="preserve"> </w:t>
+            </w:r>
+            <w:r>
+              <w:rPr>
+                <w:rFonts w:eastAsia="宋体" w:ascii="Consolas" w:hAnsi="Consolas"/>
+                <w:rFonts w:ascii="Consolas" w:hAnsi="Consolas"/>
+                <w:sz w:val="18"/>
+                <w:color w:val="000000"/>
+              </w:rPr>
+              <w:t>TYPE_INIT</w:t>
+            </w:r>
+            <w:r>
+              <w:rPr>
+                <w:rFonts w:eastAsia="宋体" w:ascii="Consolas" w:hAnsi="Consolas"/>
+                <w:rFonts w:ascii="Consolas" w:hAnsi="Consolas"/>
+                <w:sz w:val="18"/>
+                <w:color w:val="000000"/>
+              </w:rPr>
+              <w:t>,</w:t>
+            </w:r>
+            <w:r>
+              <w:rPr>
+                <w:rFonts w:eastAsia="宋体" w:ascii="Consolas" w:hAnsi="Consolas"/>
+                <w:rFonts w:ascii="Consolas" w:hAnsi="Consolas"/>
+                <w:sz w:val="18"/>
+                <w:color w:val="000000"/>
+              </w:rPr>
+              <w:t xml:space="preserve"> </w:t>
+            </w:r>
+            <w:r>
+              <w:rPr>
+                <w:rFonts w:eastAsia="宋体" w:ascii="Consolas" w:hAnsi="Consolas"/>
+                <w:rFonts w:ascii="Consolas" w:hAnsi="Consolas"/>
+                <w:sz w:val="18"/>
+                <w:color w:val="000000"/>
+              </w:rPr>
+              <w:t>n_blocks</w:t>
+            </w:r>
+            <w:r>
+              <w:rPr>
+                <w:rFonts w:eastAsia="宋体" w:ascii="Consolas" w:hAnsi="Consolas"/>
+                <w:rFonts w:ascii="Consolas" w:hAnsi="Consolas"/>
+                <w:sz w:val="18"/>
+                <w:color w:val="000000"/>
+              </w:rPr>
+              <w:t>)</w:t>
+            </w:r>
+          </w:p>
+          <w:p>
+            <w:pPr>
+              <w:spacing w:before="0" w:after="0" w:line="220" w:lineRule="exact"/>
+            </w:pPr>
+            <w:r>
+              <w:rPr>
+                <w:rFonts w:eastAsia="宋体" w:ascii="Consolas" w:hAnsi="Consolas"/>
+                <w:rFonts w:ascii="Consolas" w:hAnsi="Consolas"/>
+                <w:sz w:val="18"/>
+                <w:color w:val="000000"/>
+              </w:rPr>
+              <w:t>msg_type</w:t>
+            </w:r>
+            <w:r>
+              <w:rPr>
+                <w:rFonts w:eastAsia="宋体" w:ascii="Consolas" w:hAnsi="Consolas"/>
+                <w:rFonts w:ascii="Consolas" w:hAnsi="Consolas"/>
+                <w:sz w:val="18"/>
+                <w:color w:val="000000"/>
+              </w:rPr>
+              <w:t>,</w:t>
+            </w:r>
+            <w:r>
+              <w:rPr>
+                <w:rFonts w:eastAsia="宋体" w:ascii="Consolas" w:hAnsi="Consolas"/>
+                <w:rFonts w:ascii="Consolas" w:hAnsi="Consolas"/>
+                <w:sz w:val="18"/>
+                <w:color w:val="000000"/>
+              </w:rPr>
+              <w:t xml:space="preserve"> </w:t>
+            </w:r>
+            <w:r>
+              <w:rPr>
+                <w:rFonts w:eastAsia="宋体" w:ascii="Consolas" w:hAnsi="Consolas"/>
+                <w:rFonts w:ascii="Consolas" w:hAnsi="Consolas"/>
+                <w:sz w:val="18"/>
+                <w:color w:val="000000"/>
+              </w:rPr>
+              <w:t>n</w:t>
+            </w:r>
+            <w:r>
+              <w:rPr>
+                <w:rFonts w:eastAsia="宋体" w:ascii="Consolas" w:hAnsi="Consolas"/>
+                <w:rFonts w:ascii="Consolas" w:hAnsi="Consolas"/>
+                <w:sz w:val="18"/>
+                <w:color w:val="000000"/>
+              </w:rPr>
+              <w:t xml:space="preserve"> </w:t>
+            </w:r>
+            <w:r>
+              <w:rPr>
+                <w:rFonts w:eastAsia="宋体" w:ascii="Consolas" w:hAnsi="Consolas"/>
+                <w:rFonts w:ascii="Consolas" w:hAnsi="Consolas"/>
+                <w:sz w:val="18"/>
+                <w:color w:val="000000"/>
+              </w:rPr>
+              <w:t>=</w:t>
+            </w:r>
+            <w:r>
+              <w:rPr>
+                <w:rFonts w:eastAsia="宋体" w:ascii="Consolas" w:hAnsi="Consolas"/>
+                <w:rFonts w:ascii="Consolas" w:hAnsi="Consolas"/>
+                <w:sz w:val="18"/>
+                <w:color w:val="000000"/>
+              </w:rPr>
+              <w:t xml:space="preserve"> </w:t>
+            </w:r>
+            <w:r>
+              <w:rPr>
+                <w:rFonts w:eastAsia="宋体" w:ascii="Consolas" w:hAnsi="Consolas"/>
+                <w:rFonts w:ascii="Consolas" w:hAnsi="Consolas"/>
+                <w:sz w:val="18"/>
+                <w:color w:val="000000"/>
+              </w:rPr>
+              <w:t>struct</w:t>
+            </w:r>
+            <w:r>
+              <w:rPr>
+                <w:rFonts w:eastAsia="宋体" w:ascii="Consolas" w:hAnsi="Consolas"/>
+                <w:rFonts w:ascii="Consolas" w:hAnsi="Consolas"/>
+                <w:sz w:val="18"/>
+                <w:color w:val="000000"/>
+              </w:rPr>
+              <w:t>.</w:t>
+            </w:r>
+            <w:r>
+              <w:rPr>
+                <w:rFonts w:eastAsia="宋体" w:ascii="Consolas" w:hAnsi="Consolas"/>
+                <w:rFonts w:ascii="Consolas" w:hAnsi="Consolas"/>
+                <w:sz w:val="18"/>
+                <w:color w:val="000000"/>
+              </w:rPr>
+              <w:t>unpack</w:t>
+            </w:r>
+            <w:r>
+              <w:rPr>
+                <w:rFonts w:eastAsia="宋体" w:ascii="Consolas" w:hAnsi="Consolas"/>
+                <w:rFonts w:ascii="Consolas" w:hAnsi="Consolas"/>
+                <w:sz w:val="18"/>
+                <w:color w:val="000000"/>
+              </w:rPr>
+              <w:t>(</w:t>
+            </w:r>
+            <w:r>
+              <w:rPr>
+                <w:rFonts w:eastAsia="宋体" w:ascii="Consolas" w:hAnsi="Consolas"/>
+                <w:rFonts w:ascii="Consolas" w:hAnsi="Consolas"/>
+                <w:sz w:val="18"/>
+                <w:color w:val="A31515"/>
+              </w:rPr>
+              <w:t>"</w:t>
+            </w:r>
+            <w:r>
+              <w:rPr>
+                <w:rFonts w:eastAsia="宋体" w:ascii="Consolas" w:hAnsi="Consolas"/>
+                <w:rFonts w:ascii="Consolas" w:hAnsi="Consolas"/>
+                <w:sz w:val="18"/>
+                <w:color w:val="A31515"/>
+              </w:rPr>
+              <w:t>!BI</w:t>
+            </w:r>
+            <w:r>
+              <w:rPr>
+                <w:rFonts w:eastAsia="宋体" w:ascii="Consolas" w:hAnsi="Consolas"/>
+                <w:rFonts w:ascii="Consolas" w:hAnsi="Consolas"/>
+                <w:sz w:val="18"/>
+                <w:color w:val="A31515"/>
+              </w:rPr>
+              <w:t>"</w:t>
+            </w:r>
+            <w:r>
+              <w:rPr>
+                <w:rFonts w:eastAsia="宋体" w:ascii="Consolas" w:hAnsi="Consolas"/>
+                <w:rFonts w:ascii="Consolas" w:hAnsi="Consolas"/>
+                <w:sz w:val="18"/>
+                <w:color w:val="000000"/>
+              </w:rPr>
+              <w:t>,</w:t>
+            </w:r>
+            <w:r>
+              <w:rPr>
+                <w:rFonts w:eastAsia="宋体" w:ascii="Consolas" w:hAnsi="Consolas"/>
+                <w:rFonts w:ascii="Consolas" w:hAnsi="Consolas"/>
+                <w:sz w:val="18"/>
+                <w:color w:val="000000"/>
+              </w:rPr>
+              <w:t xml:space="preserve"> </w:t>
+            </w:r>
+            <w:r>
+              <w:rPr>
+                <w:rFonts w:eastAsia="宋体" w:ascii="Consolas" w:hAnsi="Consolas"/>
+                <w:rFonts w:ascii="Consolas" w:hAnsi="Consolas"/>
+                <w:sz w:val="18"/>
+                <w:color w:val="000000"/>
+              </w:rPr>
+              <w:t>header</w:t>
+            </w:r>
+            <w:r>
+              <w:rPr>
+                <w:rFonts w:eastAsia="宋体" w:ascii="Consolas" w:hAnsi="Consolas"/>
+                <w:rFonts w:ascii="Consolas" w:hAnsi="Consolas"/>
+                <w:sz w:val="18"/>
+                <w:color w:val="000000"/>
+              </w:rPr>
+              <w:t>)</w:t>
+            </w:r>
+          </w:p>
+          <w:p>
+            <w:pPr>
+              <w:spacing w:before="0" w:after="0" w:line="220" w:lineRule="exact"/>
+            </w:pPr>
+            <w:r>
+              <w:rPr>
+                <w:rFonts w:eastAsia="宋体" w:ascii="Consolas" w:hAnsi="Consolas"/>
+                <w:rFonts w:ascii="Consolas" w:hAnsi="Consolas"/>
+                <w:sz w:val="18"/>
+                <w:color w:val="000000"/>
+              </w:rPr>
+              <w:t>conn</w:t>
+            </w:r>
+            <w:r>
+              <w:rPr>
+                <w:rFonts w:eastAsia="宋体" w:ascii="Consolas" w:hAnsi="Consolas"/>
+                <w:rFonts w:ascii="Consolas" w:hAnsi="Consolas"/>
+                <w:sz w:val="18"/>
+                <w:color w:val="000000"/>
+              </w:rPr>
+              <w:t>.</w:t>
+            </w:r>
+            <w:r>
+              <w:rPr>
+                <w:rFonts w:eastAsia="宋体" w:ascii="Consolas" w:hAnsi="Consolas"/>
+                <w:rFonts w:ascii="Consolas" w:hAnsi="Consolas"/>
+                <w:sz w:val="18"/>
+                <w:color w:val="000000"/>
+              </w:rPr>
+              <w:t>sendall</w:t>
+            </w:r>
+            <w:r>
+              <w:rPr>
+                <w:rFonts w:eastAsia="宋体" w:ascii="Consolas" w:hAnsi="Consolas"/>
+                <w:rFonts w:ascii="Consolas" w:hAnsi="Consolas"/>
+                <w:sz w:val="18"/>
+                <w:color w:val="000000"/>
+              </w:rPr>
+              <w:t>(</w:t>
+            </w:r>
+            <w:r>
+              <w:rPr>
+                <w:rFonts w:eastAsia="宋体" w:ascii="Consolas" w:hAnsi="Consolas"/>
+                <w:rFonts w:ascii="Consolas" w:hAnsi="Consolas"/>
+                <w:sz w:val="18"/>
+                <w:color w:val="000000"/>
+              </w:rPr>
+              <w:t>answer</w:t>
+            </w:r>
+            <w:r>
+              <w:rPr>
+                <w:rFonts w:eastAsia="宋体" w:ascii="Consolas" w:hAnsi="Consolas"/>
+                <w:rFonts w:ascii="Consolas" w:hAnsi="Consolas"/>
+                <w:sz w:val="18"/>
+                <w:color w:val="000000"/>
+              </w:rPr>
+              <w:t>)</w:t>
+            </w:r>
+          </w:p>
+          <w:p>
+            <w:pPr>
+              <w:spacing w:before="0" w:after="0" w:line="220" w:lineRule="exact"/>
+            </w:pPr>
+            <w:r>
+              <w:rPr>
+                <w:rFonts w:eastAsia="宋体" w:ascii="Consolas" w:hAnsi="Consolas"/>
+                <w:rFonts w:ascii="Consolas" w:hAnsi="Consolas"/>
+                <w:sz w:val="18"/>
+                <w:color w:val="000000"/>
+              </w:rPr>
+              <w:t>data</w:t>
+            </w:r>
+            <w:r>
+              <w:rPr>
+                <w:rFonts w:eastAsia="宋体" w:ascii="Consolas" w:hAnsi="Consolas"/>
+                <w:rFonts w:ascii="Consolas" w:hAnsi="Consolas"/>
+                <w:sz w:val="18"/>
+                <w:color w:val="000000"/>
+              </w:rPr>
+              <w:t xml:space="preserve"> </w:t>
+            </w:r>
+            <w:r>
+              <w:rPr>
+                <w:rFonts w:eastAsia="宋体" w:ascii="Consolas" w:hAnsi="Consolas"/>
+                <w:rFonts w:ascii="Consolas" w:hAnsi="Consolas"/>
+                <w:sz w:val="18"/>
+                <w:color w:val="000000"/>
+              </w:rPr>
+              <w:t>=</w:t>
+            </w:r>
+            <w:r>
+              <w:rPr>
+                <w:rFonts w:eastAsia="宋体" w:ascii="Consolas" w:hAnsi="Consolas"/>
+                <w:rFonts w:ascii="Consolas" w:hAnsi="Consolas"/>
+                <w:sz w:val="18"/>
+                <w:color w:val="000000"/>
+              </w:rPr>
+              <w:t xml:space="preserve"> </w:t>
+            </w:r>
+            <w:r>
+              <w:rPr>
+                <w:rFonts w:eastAsia="宋体" w:ascii="Consolas" w:hAnsi="Consolas"/>
+                <w:rFonts w:ascii="Consolas" w:hAnsi="Consolas"/>
+                <w:sz w:val="18"/>
+                <w:color w:val="000000"/>
+              </w:rPr>
+              <w:t>recv_exact</w:t>
+            </w:r>
+            <w:r>
+              <w:rPr>
+                <w:rFonts w:eastAsia="宋体" w:ascii="Consolas" w:hAnsi="Consolas"/>
+                <w:rFonts w:ascii="Consolas" w:hAnsi="Consolas"/>
+                <w:sz w:val="18"/>
+                <w:color w:val="000000"/>
+              </w:rPr>
+              <w:t>(</w:t>
+            </w:r>
+            <w:r>
+              <w:rPr>
+                <w:rFonts w:eastAsia="宋体" w:ascii="Consolas" w:hAnsi="Consolas"/>
+                <w:rFonts w:ascii="Consolas" w:hAnsi="Consolas"/>
+                <w:sz w:val="18"/>
+                <w:color w:val="000000"/>
+              </w:rPr>
+              <w:t>sock</w:t>
+            </w:r>
+            <w:r>
+              <w:rPr>
+                <w:rFonts w:eastAsia="宋体" w:ascii="Consolas" w:hAnsi="Consolas"/>
+                <w:rFonts w:ascii="Consolas" w:hAnsi="Consolas"/>
+                <w:sz w:val="18"/>
+                <w:color w:val="000000"/>
+              </w:rPr>
+              <w:t>,</w:t>
+            </w:r>
+            <w:r>
+              <w:rPr>
+                <w:rFonts w:eastAsia="宋体" w:ascii="Consolas" w:hAnsi="Consolas"/>
+                <w:rFonts w:ascii="Consolas" w:hAnsi="Consolas"/>
+                <w:sz w:val="18"/>
+                <w:color w:val="000000"/>
+              </w:rPr>
+              <w:t xml:space="preserve"> </w:t>
+            </w:r>
+            <w:r>
+              <w:rPr>
+                <w:rFonts w:eastAsia="宋体" w:ascii="Consolas" w:hAnsi="Consolas"/>
+                <w:rFonts w:ascii="Consolas" w:hAnsi="Consolas"/>
+                <w:sz w:val="18"/>
+                <w:color w:val="000000"/>
+              </w:rPr>
+              <w:t>n</w:t>
+            </w:r>
+            <w:r>
+              <w:rPr>
+                <w:rFonts w:eastAsia="宋体" w:ascii="Consolas" w:hAnsi="Consolas"/>
+                <w:rFonts w:ascii="Consolas" w:hAnsi="Consolas"/>
+                <w:sz w:val="18"/>
+                <w:color w:val="000000"/>
+              </w:rPr>
+              <w:t>)</w:t>
+            </w:r>
+          </w:p>
+          <w:p>
+            <w:pPr>
+              <w:spacing w:before="0" w:after="80" w:line="220" w:lineRule="exact"/>
+            </w:pPr>
           </w:p>
         </w:tc>
       </w:tr>
@@ -289,41 +2522,1630 @@
           <w:tcPr>
             <w:tcW w:type="dxa" w:w="8640"/>
             <w:shd w:fill="F5F5F5" w:val="clear"/>
+            <w:tcBorders>
+              <w:top w:val="single" w:sz="4" w:space="0" w:color="999999"/>
+              <w:left w:val="single" w:sz="4" w:space="0" w:color="999999"/>
+              <w:bottom w:val="single" w:sz="4" w:space="0" w:color="999999"/>
+              <w:right w:val="single" w:sz="4" w:space="0" w:color="999999"/>
+            </w:tcBorders>
           </w:tcPr>
           <w:p>
             <w:pPr>
-              <w:spacing w:before="80" w:after="80"/>
+              <w:spacing w:before="80" w:line="220" w:lineRule="exact"/>
             </w:pPr>
             <w:r>
               <w:rPr>
                 <w:rFonts w:eastAsia="宋体" w:ascii="Consolas" w:hAnsi="Consolas"/>
                 <w:rFonts w:ascii="Consolas" w:hAnsi="Consolas"/>
                 <w:sz w:val="18"/>
-              </w:rPr>
-              <w:t>_LOG_LOCK = threading.Lock()</w:t>
-              <w:br/>
-              <w:br/>
-              <w:t>def log_event(log_path, fmt, *args):</w:t>
-              <w:br/>
-              <w:t xml:space="preserve">    timestamp = datetime.now().strftime("%Y-%m-%d %H:%M:%S.%f")[:-3]</w:t>
-              <w:br/>
-              <w:t xml:space="preserve">    line = f"[{timestamp}] {fmt.format(*args)}"</w:t>
-              <w:br/>
-              <w:t xml:space="preserve">    with _LOG_LOCK:</w:t>
-              <w:br/>
-              <w:t xml:space="preserve">        with open(log_path, "a", encoding="utf-8") as f:</w:t>
-              <w:br/>
-              <w:t xml:space="preserve">            f.write(line + "\n")</w:t>
-              <w:br/>
-              <w:br/>
-              <w:t>while True:</w:t>
-              <w:br/>
-              <w:t xml:space="preserve">    conn, addr = server_socket.accept()</w:t>
-              <w:br/>
-              <w:t xml:space="preserve">    t = threading.Thread(target=handle_client, args=(conn, addr), daemon=True)</w:t>
-              <w:br/>
-              <w:t xml:space="preserve">    t.start()</w:t>
-            </w:r>
+                <w:color w:val="000000"/>
+              </w:rPr>
+              <w:t>_LOG_LOCK</w:t>
+            </w:r>
+            <w:r>
+              <w:rPr>
+                <w:rFonts w:eastAsia="宋体" w:ascii="Consolas" w:hAnsi="Consolas"/>
+                <w:rFonts w:ascii="Consolas" w:hAnsi="Consolas"/>
+                <w:sz w:val="18"/>
+                <w:color w:val="000000"/>
+              </w:rPr>
+              <w:t xml:space="preserve"> </w:t>
+            </w:r>
+            <w:r>
+              <w:rPr>
+                <w:rFonts w:eastAsia="宋体" w:ascii="Consolas" w:hAnsi="Consolas"/>
+                <w:rFonts w:ascii="Consolas" w:hAnsi="Consolas"/>
+                <w:sz w:val="18"/>
+                <w:color w:val="000000"/>
+              </w:rPr>
+              <w:t>=</w:t>
+            </w:r>
+            <w:r>
+              <w:rPr>
+                <w:rFonts w:eastAsia="宋体" w:ascii="Consolas" w:hAnsi="Consolas"/>
+                <w:rFonts w:ascii="Consolas" w:hAnsi="Consolas"/>
+                <w:sz w:val="18"/>
+                <w:color w:val="000000"/>
+              </w:rPr>
+              <w:t xml:space="preserve"> </w:t>
+            </w:r>
+            <w:r>
+              <w:rPr>
+                <w:rFonts w:eastAsia="宋体" w:ascii="Consolas" w:hAnsi="Consolas"/>
+                <w:rFonts w:ascii="Consolas" w:hAnsi="Consolas"/>
+                <w:sz w:val="18"/>
+                <w:color w:val="000000"/>
+              </w:rPr>
+              <w:t>threading</w:t>
+            </w:r>
+            <w:r>
+              <w:rPr>
+                <w:rFonts w:eastAsia="宋体" w:ascii="Consolas" w:hAnsi="Consolas"/>
+                <w:rFonts w:ascii="Consolas" w:hAnsi="Consolas"/>
+                <w:sz w:val="18"/>
+                <w:color w:val="000000"/>
+              </w:rPr>
+              <w:t>.</w:t>
+            </w:r>
+            <w:r>
+              <w:rPr>
+                <w:rFonts w:eastAsia="宋体" w:ascii="Consolas" w:hAnsi="Consolas"/>
+                <w:rFonts w:ascii="Consolas" w:hAnsi="Consolas"/>
+                <w:sz w:val="18"/>
+                <w:color w:val="000000"/>
+              </w:rPr>
+              <w:t>Lock</w:t>
+            </w:r>
+            <w:r>
+              <w:rPr>
+                <w:rFonts w:eastAsia="宋体" w:ascii="Consolas" w:hAnsi="Consolas"/>
+                <w:rFonts w:ascii="Consolas" w:hAnsi="Consolas"/>
+                <w:sz w:val="18"/>
+                <w:color w:val="000000"/>
+              </w:rPr>
+              <w:t>(</w:t>
+            </w:r>
+            <w:r>
+              <w:rPr>
+                <w:rFonts w:eastAsia="宋体" w:ascii="Consolas" w:hAnsi="Consolas"/>
+                <w:rFonts w:ascii="Consolas" w:hAnsi="Consolas"/>
+                <w:sz w:val="18"/>
+                <w:color w:val="000000"/>
+              </w:rPr>
+              <w:t>)</w:t>
+            </w:r>
+          </w:p>
+          <w:p>
+            <w:pPr>
+              <w:spacing w:before="0" w:after="0" w:line="220" w:lineRule="exact"/>
+            </w:pPr>
+          </w:p>
+          <w:p>
+            <w:pPr>
+              <w:spacing w:before="0" w:after="0" w:line="220" w:lineRule="exact"/>
+            </w:pPr>
+            <w:r>
+              <w:rPr>
+                <w:rFonts w:eastAsia="宋体" w:ascii="Consolas" w:hAnsi="Consolas"/>
+                <w:rFonts w:ascii="Consolas" w:hAnsi="Consolas"/>
+                <w:sz w:val="18"/>
+                <w:color w:val="0000FF"/>
+              </w:rPr>
+              <w:t>def</w:t>
+            </w:r>
+            <w:r>
+              <w:rPr>
+                <w:rFonts w:eastAsia="宋体" w:ascii="Consolas" w:hAnsi="Consolas"/>
+                <w:rFonts w:ascii="Consolas" w:hAnsi="Consolas"/>
+                <w:sz w:val="18"/>
+                <w:color w:val="000000"/>
+              </w:rPr>
+              <w:t xml:space="preserve"> </w:t>
+            </w:r>
+            <w:r>
+              <w:rPr>
+                <w:rFonts w:eastAsia="宋体" w:ascii="Consolas" w:hAnsi="Consolas"/>
+                <w:rFonts w:ascii="Consolas" w:hAnsi="Consolas"/>
+                <w:sz w:val="18"/>
+                <w:color w:val="795E26"/>
+              </w:rPr>
+              <w:t>log_event</w:t>
+            </w:r>
+            <w:r>
+              <w:rPr>
+                <w:rFonts w:eastAsia="宋体" w:ascii="Consolas" w:hAnsi="Consolas"/>
+                <w:rFonts w:ascii="Consolas" w:hAnsi="Consolas"/>
+                <w:sz w:val="18"/>
+                <w:color w:val="000000"/>
+              </w:rPr>
+              <w:t>(</w:t>
+            </w:r>
+            <w:r>
+              <w:rPr>
+                <w:rFonts w:eastAsia="宋体" w:ascii="Consolas" w:hAnsi="Consolas"/>
+                <w:rFonts w:ascii="Consolas" w:hAnsi="Consolas"/>
+                <w:sz w:val="18"/>
+                <w:color w:val="000000"/>
+              </w:rPr>
+              <w:t>log_path</w:t>
+            </w:r>
+            <w:r>
+              <w:rPr>
+                <w:rFonts w:eastAsia="宋体" w:ascii="Consolas" w:hAnsi="Consolas"/>
+                <w:rFonts w:ascii="Consolas" w:hAnsi="Consolas"/>
+                <w:sz w:val="18"/>
+                <w:color w:val="000000"/>
+              </w:rPr>
+              <w:t>,</w:t>
+            </w:r>
+            <w:r>
+              <w:rPr>
+                <w:rFonts w:eastAsia="宋体" w:ascii="Consolas" w:hAnsi="Consolas"/>
+                <w:rFonts w:ascii="Consolas" w:hAnsi="Consolas"/>
+                <w:sz w:val="18"/>
+                <w:color w:val="000000"/>
+              </w:rPr>
+              <w:t xml:space="preserve"> </w:t>
+            </w:r>
+            <w:r>
+              <w:rPr>
+                <w:rFonts w:eastAsia="宋体" w:ascii="Consolas" w:hAnsi="Consolas"/>
+                <w:rFonts w:ascii="Consolas" w:hAnsi="Consolas"/>
+                <w:sz w:val="18"/>
+                <w:color w:val="000000"/>
+              </w:rPr>
+              <w:t>fmt</w:t>
+            </w:r>
+            <w:r>
+              <w:rPr>
+                <w:rFonts w:eastAsia="宋体" w:ascii="Consolas" w:hAnsi="Consolas"/>
+                <w:rFonts w:ascii="Consolas" w:hAnsi="Consolas"/>
+                <w:sz w:val="18"/>
+                <w:color w:val="000000"/>
+              </w:rPr>
+              <w:t>,</w:t>
+            </w:r>
+            <w:r>
+              <w:rPr>
+                <w:rFonts w:eastAsia="宋体" w:ascii="Consolas" w:hAnsi="Consolas"/>
+                <w:rFonts w:ascii="Consolas" w:hAnsi="Consolas"/>
+                <w:sz w:val="18"/>
+                <w:color w:val="000000"/>
+              </w:rPr>
+              <w:t xml:space="preserve"> </w:t>
+            </w:r>
+            <w:r>
+              <w:rPr>
+                <w:rFonts w:eastAsia="宋体" w:ascii="Consolas" w:hAnsi="Consolas"/>
+                <w:rFonts w:ascii="Consolas" w:hAnsi="Consolas"/>
+                <w:sz w:val="18"/>
+                <w:color w:val="000000"/>
+              </w:rPr>
+              <w:t>*</w:t>
+            </w:r>
+            <w:r>
+              <w:rPr>
+                <w:rFonts w:eastAsia="宋体" w:ascii="Consolas" w:hAnsi="Consolas"/>
+                <w:rFonts w:ascii="Consolas" w:hAnsi="Consolas"/>
+                <w:sz w:val="18"/>
+                <w:color w:val="000000"/>
+              </w:rPr>
+              <w:t>args</w:t>
+            </w:r>
+            <w:r>
+              <w:rPr>
+                <w:rFonts w:eastAsia="宋体" w:ascii="Consolas" w:hAnsi="Consolas"/>
+                <w:rFonts w:ascii="Consolas" w:hAnsi="Consolas"/>
+                <w:sz w:val="18"/>
+                <w:color w:val="000000"/>
+              </w:rPr>
+              <w:t>)</w:t>
+            </w:r>
+            <w:r>
+              <w:rPr>
+                <w:rFonts w:eastAsia="宋体" w:ascii="Consolas" w:hAnsi="Consolas"/>
+                <w:rFonts w:ascii="Consolas" w:hAnsi="Consolas"/>
+                <w:sz w:val="18"/>
+                <w:color w:val="000000"/>
+              </w:rPr>
+              <w:t>:</w:t>
+            </w:r>
+          </w:p>
+          <w:p>
+            <w:pPr>
+              <w:spacing w:before="0" w:after="0" w:line="220" w:lineRule="exact"/>
+            </w:pPr>
+            <w:r>
+              <w:rPr>
+                <w:rFonts w:eastAsia="宋体" w:ascii="Consolas" w:hAnsi="Consolas"/>
+                <w:rFonts w:ascii="Consolas" w:hAnsi="Consolas"/>
+                <w:sz w:val="18"/>
+                <w:color w:val="000000"/>
+              </w:rPr>
+              <w:t xml:space="preserve">    </w:t>
+            </w:r>
+            <w:r>
+              <w:rPr>
+                <w:rFonts w:eastAsia="宋体" w:ascii="Consolas" w:hAnsi="Consolas"/>
+                <w:rFonts w:ascii="Consolas" w:hAnsi="Consolas"/>
+                <w:sz w:val="18"/>
+                <w:color w:val="000000"/>
+              </w:rPr>
+              <w:t>timestamp</w:t>
+            </w:r>
+            <w:r>
+              <w:rPr>
+                <w:rFonts w:eastAsia="宋体" w:ascii="Consolas" w:hAnsi="Consolas"/>
+                <w:rFonts w:ascii="Consolas" w:hAnsi="Consolas"/>
+                <w:sz w:val="18"/>
+                <w:color w:val="000000"/>
+              </w:rPr>
+              <w:t xml:space="preserve"> </w:t>
+            </w:r>
+            <w:r>
+              <w:rPr>
+                <w:rFonts w:eastAsia="宋体" w:ascii="Consolas" w:hAnsi="Consolas"/>
+                <w:rFonts w:ascii="Consolas" w:hAnsi="Consolas"/>
+                <w:sz w:val="18"/>
+                <w:color w:val="000000"/>
+              </w:rPr>
+              <w:t>=</w:t>
+            </w:r>
+            <w:r>
+              <w:rPr>
+                <w:rFonts w:eastAsia="宋体" w:ascii="Consolas" w:hAnsi="Consolas"/>
+                <w:rFonts w:ascii="Consolas" w:hAnsi="Consolas"/>
+                <w:sz w:val="18"/>
+                <w:color w:val="000000"/>
+              </w:rPr>
+              <w:t xml:space="preserve"> </w:t>
+            </w:r>
+            <w:r>
+              <w:rPr>
+                <w:rFonts w:eastAsia="宋体" w:ascii="Consolas" w:hAnsi="Consolas"/>
+                <w:rFonts w:ascii="Consolas" w:hAnsi="Consolas"/>
+                <w:sz w:val="18"/>
+                <w:color w:val="000000"/>
+              </w:rPr>
+              <w:t>datetime</w:t>
+            </w:r>
+            <w:r>
+              <w:rPr>
+                <w:rFonts w:eastAsia="宋体" w:ascii="Consolas" w:hAnsi="Consolas"/>
+                <w:rFonts w:ascii="Consolas" w:hAnsi="Consolas"/>
+                <w:sz w:val="18"/>
+                <w:color w:val="000000"/>
+              </w:rPr>
+              <w:t>.</w:t>
+            </w:r>
+            <w:r>
+              <w:rPr>
+                <w:rFonts w:eastAsia="宋体" w:ascii="Consolas" w:hAnsi="Consolas"/>
+                <w:rFonts w:ascii="Consolas" w:hAnsi="Consolas"/>
+                <w:sz w:val="18"/>
+                <w:color w:val="000000"/>
+              </w:rPr>
+              <w:t>now</w:t>
+            </w:r>
+            <w:r>
+              <w:rPr>
+                <w:rFonts w:eastAsia="宋体" w:ascii="Consolas" w:hAnsi="Consolas"/>
+                <w:rFonts w:ascii="Consolas" w:hAnsi="Consolas"/>
+                <w:sz w:val="18"/>
+                <w:color w:val="000000"/>
+              </w:rPr>
+              <w:t>(</w:t>
+            </w:r>
+            <w:r>
+              <w:rPr>
+                <w:rFonts w:eastAsia="宋体" w:ascii="Consolas" w:hAnsi="Consolas"/>
+                <w:rFonts w:ascii="Consolas" w:hAnsi="Consolas"/>
+                <w:sz w:val="18"/>
+                <w:color w:val="000000"/>
+              </w:rPr>
+              <w:t>)</w:t>
+            </w:r>
+            <w:r>
+              <w:rPr>
+                <w:rFonts w:eastAsia="宋体" w:ascii="Consolas" w:hAnsi="Consolas"/>
+                <w:rFonts w:ascii="Consolas" w:hAnsi="Consolas"/>
+                <w:sz w:val="18"/>
+                <w:color w:val="000000"/>
+              </w:rPr>
+              <w:t>.</w:t>
+            </w:r>
+            <w:r>
+              <w:rPr>
+                <w:rFonts w:eastAsia="宋体" w:ascii="Consolas" w:hAnsi="Consolas"/>
+                <w:rFonts w:ascii="Consolas" w:hAnsi="Consolas"/>
+                <w:sz w:val="18"/>
+                <w:color w:val="000000"/>
+              </w:rPr>
+              <w:t>strftime</w:t>
+            </w:r>
+            <w:r>
+              <w:rPr>
+                <w:rFonts w:eastAsia="宋体" w:ascii="Consolas" w:hAnsi="Consolas"/>
+                <w:rFonts w:ascii="Consolas" w:hAnsi="Consolas"/>
+                <w:sz w:val="18"/>
+                <w:color w:val="000000"/>
+              </w:rPr>
+              <w:t>(</w:t>
+            </w:r>
+            <w:r>
+              <w:rPr>
+                <w:rFonts w:eastAsia="宋体" w:ascii="Consolas" w:hAnsi="Consolas"/>
+                <w:rFonts w:ascii="Consolas" w:hAnsi="Consolas"/>
+                <w:sz w:val="18"/>
+                <w:color w:val="A31515"/>
+              </w:rPr>
+              <w:t>"</w:t>
+            </w:r>
+            <w:r>
+              <w:rPr>
+                <w:rFonts w:eastAsia="宋体" w:ascii="Consolas" w:hAnsi="Consolas"/>
+                <w:rFonts w:ascii="Consolas" w:hAnsi="Consolas"/>
+                <w:sz w:val="18"/>
+                <w:color w:val="A31515"/>
+              </w:rPr>
+              <w:t>%</w:t>
+            </w:r>
+            <w:r>
+              <w:rPr>
+                <w:rFonts w:eastAsia="宋体" w:ascii="Consolas" w:hAnsi="Consolas"/>
+                <w:rFonts w:ascii="Consolas" w:hAnsi="Consolas"/>
+                <w:sz w:val="18"/>
+                <w:color w:val="A31515"/>
+              </w:rPr>
+              <w:t>Y-</w:t>
+            </w:r>
+            <w:r>
+              <w:rPr>
+                <w:rFonts w:eastAsia="宋体" w:ascii="Consolas" w:hAnsi="Consolas"/>
+                <w:rFonts w:ascii="Consolas" w:hAnsi="Consolas"/>
+                <w:sz w:val="18"/>
+                <w:color w:val="A31515"/>
+              </w:rPr>
+              <w:t>%</w:t>
+            </w:r>
+            <w:r>
+              <w:rPr>
+                <w:rFonts w:eastAsia="宋体" w:ascii="Consolas" w:hAnsi="Consolas"/>
+                <w:rFonts w:ascii="Consolas" w:hAnsi="Consolas"/>
+                <w:sz w:val="18"/>
+                <w:color w:val="A31515"/>
+              </w:rPr>
+              <w:t>m-</w:t>
+            </w:r>
+            <w:r>
+              <w:rPr>
+                <w:rFonts w:eastAsia="宋体" w:ascii="Consolas" w:hAnsi="Consolas"/>
+                <w:rFonts w:ascii="Consolas" w:hAnsi="Consolas"/>
+                <w:sz w:val="18"/>
+                <w:color w:val="A31515"/>
+              </w:rPr>
+              <w:t>%d</w:t>
+            </w:r>
+            <w:r>
+              <w:rPr>
+                <w:rFonts w:eastAsia="宋体" w:ascii="Consolas" w:hAnsi="Consolas"/>
+                <w:rFonts w:ascii="Consolas" w:hAnsi="Consolas"/>
+                <w:sz w:val="18"/>
+                <w:color w:val="A31515"/>
+              </w:rPr>
+              <w:t xml:space="preserve"> </w:t>
+            </w:r>
+            <w:r>
+              <w:rPr>
+                <w:rFonts w:eastAsia="宋体" w:ascii="Consolas" w:hAnsi="Consolas"/>
+                <w:rFonts w:ascii="Consolas" w:hAnsi="Consolas"/>
+                <w:sz w:val="18"/>
+                <w:color w:val="A31515"/>
+              </w:rPr>
+              <w:t>%</w:t>
+            </w:r>
+            <w:r>
+              <w:rPr>
+                <w:rFonts w:eastAsia="宋体" w:ascii="Consolas" w:hAnsi="Consolas"/>
+                <w:rFonts w:ascii="Consolas" w:hAnsi="Consolas"/>
+                <w:sz w:val="18"/>
+                <w:color w:val="A31515"/>
+              </w:rPr>
+              <w:t>H:</w:t>
+            </w:r>
+            <w:r>
+              <w:rPr>
+                <w:rFonts w:eastAsia="宋体" w:ascii="Consolas" w:hAnsi="Consolas"/>
+                <w:rFonts w:ascii="Consolas" w:hAnsi="Consolas"/>
+                <w:sz w:val="18"/>
+                <w:color w:val="A31515"/>
+              </w:rPr>
+              <w:t>%</w:t>
+            </w:r>
+            <w:r>
+              <w:rPr>
+                <w:rFonts w:eastAsia="宋体" w:ascii="Consolas" w:hAnsi="Consolas"/>
+                <w:rFonts w:ascii="Consolas" w:hAnsi="Consolas"/>
+                <w:sz w:val="18"/>
+                <w:color w:val="A31515"/>
+              </w:rPr>
+              <w:t>M:</w:t>
+            </w:r>
+            <w:r>
+              <w:rPr>
+                <w:rFonts w:eastAsia="宋体" w:ascii="Consolas" w:hAnsi="Consolas"/>
+                <w:rFonts w:ascii="Consolas" w:hAnsi="Consolas"/>
+                <w:sz w:val="18"/>
+                <w:color w:val="A31515"/>
+              </w:rPr>
+              <w:t>%</w:t>
+            </w:r>
+            <w:r>
+              <w:rPr>
+                <w:rFonts w:eastAsia="宋体" w:ascii="Consolas" w:hAnsi="Consolas"/>
+                <w:rFonts w:ascii="Consolas" w:hAnsi="Consolas"/>
+                <w:sz w:val="18"/>
+                <w:color w:val="A31515"/>
+              </w:rPr>
+              <w:t>S.</w:t>
+            </w:r>
+            <w:r>
+              <w:rPr>
+                <w:rFonts w:eastAsia="宋体" w:ascii="Consolas" w:hAnsi="Consolas"/>
+                <w:rFonts w:ascii="Consolas" w:hAnsi="Consolas"/>
+                <w:sz w:val="18"/>
+                <w:color w:val="A31515"/>
+              </w:rPr>
+              <w:t>%f</w:t>
+            </w:r>
+            <w:r>
+              <w:rPr>
+                <w:rFonts w:eastAsia="宋体" w:ascii="Consolas" w:hAnsi="Consolas"/>
+                <w:rFonts w:ascii="Consolas" w:hAnsi="Consolas"/>
+                <w:sz w:val="18"/>
+                <w:color w:val="A31515"/>
+              </w:rPr>
+              <w:t>"</w:t>
+            </w:r>
+            <w:r>
+              <w:rPr>
+                <w:rFonts w:eastAsia="宋体" w:ascii="Consolas" w:hAnsi="Consolas"/>
+                <w:rFonts w:ascii="Consolas" w:hAnsi="Consolas"/>
+                <w:sz w:val="18"/>
+                <w:color w:val="000000"/>
+              </w:rPr>
+              <w:t>)</w:t>
+            </w:r>
+            <w:r>
+              <w:rPr>
+                <w:rFonts w:eastAsia="宋体" w:ascii="Consolas" w:hAnsi="Consolas"/>
+                <w:rFonts w:ascii="Consolas" w:hAnsi="Consolas"/>
+                <w:sz w:val="18"/>
+                <w:color w:val="000000"/>
+              </w:rPr>
+              <w:t>[</w:t>
+            </w:r>
+            <w:r>
+              <w:rPr>
+                <w:rFonts w:eastAsia="宋体" w:ascii="Consolas" w:hAnsi="Consolas"/>
+                <w:rFonts w:ascii="Consolas" w:hAnsi="Consolas"/>
+                <w:sz w:val="18"/>
+                <w:color w:val="000000"/>
+              </w:rPr>
+              <w:t>:</w:t>
+            </w:r>
+            <w:r>
+              <w:rPr>
+                <w:rFonts w:eastAsia="宋体" w:ascii="Consolas" w:hAnsi="Consolas"/>
+                <w:rFonts w:ascii="Consolas" w:hAnsi="Consolas"/>
+                <w:sz w:val="18"/>
+                <w:color w:val="000000"/>
+              </w:rPr>
+              <w:t>-</w:t>
+            </w:r>
+            <w:r>
+              <w:rPr>
+                <w:rFonts w:eastAsia="宋体" w:ascii="Consolas" w:hAnsi="Consolas"/>
+                <w:rFonts w:ascii="Consolas" w:hAnsi="Consolas"/>
+                <w:sz w:val="18"/>
+                <w:color w:val="098658"/>
+              </w:rPr>
+              <w:t>3</w:t>
+            </w:r>
+            <w:r>
+              <w:rPr>
+                <w:rFonts w:eastAsia="宋体" w:ascii="Consolas" w:hAnsi="Consolas"/>
+                <w:rFonts w:ascii="Consolas" w:hAnsi="Consolas"/>
+                <w:sz w:val="18"/>
+                <w:color w:val="000000"/>
+              </w:rPr>
+              <w:t>]</w:t>
+            </w:r>
+          </w:p>
+          <w:p>
+            <w:pPr>
+              <w:spacing w:before="0" w:after="0" w:line="220" w:lineRule="exact"/>
+            </w:pPr>
+            <w:r>
+              <w:rPr>
+                <w:rFonts w:eastAsia="宋体" w:ascii="Consolas" w:hAnsi="Consolas"/>
+                <w:rFonts w:ascii="Consolas" w:hAnsi="Consolas"/>
+                <w:sz w:val="18"/>
+                <w:color w:val="000000"/>
+              </w:rPr>
+              <w:t xml:space="preserve">    </w:t>
+            </w:r>
+            <w:r>
+              <w:rPr>
+                <w:rFonts w:eastAsia="宋体" w:ascii="Consolas" w:hAnsi="Consolas"/>
+                <w:rFonts w:ascii="Consolas" w:hAnsi="Consolas"/>
+                <w:sz w:val="18"/>
+                <w:color w:val="000000"/>
+              </w:rPr>
+              <w:t>line</w:t>
+            </w:r>
+            <w:r>
+              <w:rPr>
+                <w:rFonts w:eastAsia="宋体" w:ascii="Consolas" w:hAnsi="Consolas"/>
+                <w:rFonts w:ascii="Consolas" w:hAnsi="Consolas"/>
+                <w:sz w:val="18"/>
+                <w:color w:val="000000"/>
+              </w:rPr>
+              <w:t xml:space="preserve"> </w:t>
+            </w:r>
+            <w:r>
+              <w:rPr>
+                <w:rFonts w:eastAsia="宋体" w:ascii="Consolas" w:hAnsi="Consolas"/>
+                <w:rFonts w:ascii="Consolas" w:hAnsi="Consolas"/>
+                <w:sz w:val="18"/>
+                <w:color w:val="000000"/>
+              </w:rPr>
+              <w:t>=</w:t>
+            </w:r>
+            <w:r>
+              <w:rPr>
+                <w:rFonts w:eastAsia="宋体" w:ascii="Consolas" w:hAnsi="Consolas"/>
+                <w:rFonts w:ascii="Consolas" w:hAnsi="Consolas"/>
+                <w:sz w:val="18"/>
+                <w:color w:val="000000"/>
+              </w:rPr>
+              <w:t xml:space="preserve"> </w:t>
+            </w:r>
+            <w:r>
+              <w:rPr>
+                <w:rFonts w:eastAsia="宋体" w:ascii="Consolas" w:hAnsi="Consolas"/>
+                <w:rFonts w:ascii="Consolas" w:hAnsi="Consolas"/>
+                <w:sz w:val="18"/>
+                <w:color w:val="A31515"/>
+              </w:rPr>
+              <w:t>f</w:t>
+            </w:r>
+            <w:r>
+              <w:rPr>
+                <w:rFonts w:eastAsia="宋体" w:ascii="Consolas" w:hAnsi="Consolas"/>
+                <w:rFonts w:ascii="Consolas" w:hAnsi="Consolas"/>
+                <w:sz w:val="18"/>
+                <w:color w:val="A31515"/>
+              </w:rPr>
+              <w:t>"</w:t>
+            </w:r>
+            <w:r>
+              <w:rPr>
+                <w:rFonts w:eastAsia="宋体" w:ascii="Consolas" w:hAnsi="Consolas"/>
+                <w:rFonts w:ascii="Consolas" w:hAnsi="Consolas"/>
+                <w:sz w:val="18"/>
+                <w:color w:val="A31515"/>
+              </w:rPr>
+              <w:t>[</w:t>
+            </w:r>
+            <w:r>
+              <w:rPr>
+                <w:rFonts w:eastAsia="宋体" w:ascii="Consolas" w:hAnsi="Consolas"/>
+                <w:rFonts w:ascii="Consolas" w:hAnsi="Consolas"/>
+                <w:sz w:val="18"/>
+                <w:color w:val="A31515"/>
+              </w:rPr>
+              <w:t>{</w:t>
+            </w:r>
+            <w:r>
+              <w:rPr>
+                <w:rFonts w:eastAsia="宋体" w:ascii="Consolas" w:hAnsi="Consolas"/>
+                <w:rFonts w:ascii="Consolas" w:hAnsi="Consolas"/>
+                <w:sz w:val="18"/>
+                <w:color w:val="000000"/>
+              </w:rPr>
+              <w:t>timestamp</w:t>
+            </w:r>
+            <w:r>
+              <w:rPr>
+                <w:rFonts w:eastAsia="宋体" w:ascii="Consolas" w:hAnsi="Consolas"/>
+                <w:rFonts w:ascii="Consolas" w:hAnsi="Consolas"/>
+                <w:sz w:val="18"/>
+                <w:color w:val="A31515"/>
+              </w:rPr>
+              <w:t>}</w:t>
+            </w:r>
+            <w:r>
+              <w:rPr>
+                <w:rFonts w:eastAsia="宋体" w:ascii="Consolas" w:hAnsi="Consolas"/>
+                <w:rFonts w:ascii="Consolas" w:hAnsi="Consolas"/>
+                <w:sz w:val="18"/>
+                <w:color w:val="A31515"/>
+              </w:rPr>
+              <w:t xml:space="preserve">] </w:t>
+            </w:r>
+            <w:r>
+              <w:rPr>
+                <w:rFonts w:eastAsia="宋体" w:ascii="Consolas" w:hAnsi="Consolas"/>
+                <w:rFonts w:ascii="Consolas" w:hAnsi="Consolas"/>
+                <w:sz w:val="18"/>
+                <w:color w:val="A31515"/>
+              </w:rPr>
+              <w:t>{</w:t>
+            </w:r>
+            <w:r>
+              <w:rPr>
+                <w:rFonts w:eastAsia="宋体" w:ascii="Consolas" w:hAnsi="Consolas"/>
+                <w:rFonts w:ascii="Consolas" w:hAnsi="Consolas"/>
+                <w:sz w:val="18"/>
+                <w:color w:val="000000"/>
+              </w:rPr>
+              <w:t>fmt</w:t>
+            </w:r>
+            <w:r>
+              <w:rPr>
+                <w:rFonts w:eastAsia="宋体" w:ascii="Consolas" w:hAnsi="Consolas"/>
+                <w:rFonts w:ascii="Consolas" w:hAnsi="Consolas"/>
+                <w:sz w:val="18"/>
+                <w:color w:val="000000"/>
+              </w:rPr>
+              <w:t>.</w:t>
+            </w:r>
+            <w:r>
+              <w:rPr>
+                <w:rFonts w:eastAsia="宋体" w:ascii="Consolas" w:hAnsi="Consolas"/>
+                <w:rFonts w:ascii="Consolas" w:hAnsi="Consolas"/>
+                <w:sz w:val="18"/>
+                <w:color w:val="000000"/>
+              </w:rPr>
+              <w:t>format</w:t>
+            </w:r>
+            <w:r>
+              <w:rPr>
+                <w:rFonts w:eastAsia="宋体" w:ascii="Consolas" w:hAnsi="Consolas"/>
+                <w:rFonts w:ascii="Consolas" w:hAnsi="Consolas"/>
+                <w:sz w:val="18"/>
+                <w:color w:val="000000"/>
+              </w:rPr>
+              <w:t>(</w:t>
+            </w:r>
+            <w:r>
+              <w:rPr>
+                <w:rFonts w:eastAsia="宋体" w:ascii="Consolas" w:hAnsi="Consolas"/>
+                <w:rFonts w:ascii="Consolas" w:hAnsi="Consolas"/>
+                <w:sz w:val="18"/>
+                <w:color w:val="000000"/>
+              </w:rPr>
+              <w:t>*</w:t>
+            </w:r>
+            <w:r>
+              <w:rPr>
+                <w:rFonts w:eastAsia="宋体" w:ascii="Consolas" w:hAnsi="Consolas"/>
+                <w:rFonts w:ascii="Consolas" w:hAnsi="Consolas"/>
+                <w:sz w:val="18"/>
+                <w:color w:val="000000"/>
+              </w:rPr>
+              <w:t>args</w:t>
+            </w:r>
+            <w:r>
+              <w:rPr>
+                <w:rFonts w:eastAsia="宋体" w:ascii="Consolas" w:hAnsi="Consolas"/>
+                <w:rFonts w:ascii="Consolas" w:hAnsi="Consolas"/>
+                <w:sz w:val="18"/>
+                <w:color w:val="000000"/>
+              </w:rPr>
+              <w:t>)</w:t>
+            </w:r>
+            <w:r>
+              <w:rPr>
+                <w:rFonts w:eastAsia="宋体" w:ascii="Consolas" w:hAnsi="Consolas"/>
+                <w:rFonts w:ascii="Consolas" w:hAnsi="Consolas"/>
+                <w:sz w:val="18"/>
+                <w:color w:val="A31515"/>
+              </w:rPr>
+              <w:t>}</w:t>
+            </w:r>
+            <w:r>
+              <w:rPr>
+                <w:rFonts w:eastAsia="宋体" w:ascii="Consolas" w:hAnsi="Consolas"/>
+                <w:rFonts w:ascii="Consolas" w:hAnsi="Consolas"/>
+                <w:sz w:val="18"/>
+                <w:color w:val="A31515"/>
+              </w:rPr>
+              <w:t>"</w:t>
+            </w:r>
+          </w:p>
+          <w:p>
+            <w:pPr>
+              <w:spacing w:before="0" w:after="0" w:line="220" w:lineRule="exact"/>
+            </w:pPr>
+            <w:r>
+              <w:rPr>
+                <w:rFonts w:eastAsia="宋体" w:ascii="Consolas" w:hAnsi="Consolas"/>
+                <w:rFonts w:ascii="Consolas" w:hAnsi="Consolas"/>
+                <w:sz w:val="18"/>
+                <w:color w:val="000000"/>
+              </w:rPr>
+              <w:t xml:space="preserve">    </w:t>
+            </w:r>
+            <w:r>
+              <w:rPr>
+                <w:rFonts w:eastAsia="宋体" w:ascii="Consolas" w:hAnsi="Consolas"/>
+                <w:rFonts w:ascii="Consolas" w:hAnsi="Consolas"/>
+                <w:sz w:val="18"/>
+                <w:color w:val="0000FF"/>
+              </w:rPr>
+              <w:t>with</w:t>
+            </w:r>
+            <w:r>
+              <w:rPr>
+                <w:rFonts w:eastAsia="宋体" w:ascii="Consolas" w:hAnsi="Consolas"/>
+                <w:rFonts w:ascii="Consolas" w:hAnsi="Consolas"/>
+                <w:sz w:val="18"/>
+                <w:color w:val="000000"/>
+              </w:rPr>
+              <w:t xml:space="preserve"> </w:t>
+            </w:r>
+            <w:r>
+              <w:rPr>
+                <w:rFonts w:eastAsia="宋体" w:ascii="Consolas" w:hAnsi="Consolas"/>
+                <w:rFonts w:ascii="Consolas" w:hAnsi="Consolas"/>
+                <w:sz w:val="18"/>
+                <w:color w:val="000000"/>
+              </w:rPr>
+              <w:t>_LOG_LOCK</w:t>
+            </w:r>
+            <w:r>
+              <w:rPr>
+                <w:rFonts w:eastAsia="宋体" w:ascii="Consolas" w:hAnsi="Consolas"/>
+                <w:rFonts w:ascii="Consolas" w:hAnsi="Consolas"/>
+                <w:sz w:val="18"/>
+                <w:color w:val="000000"/>
+              </w:rPr>
+              <w:t>:</w:t>
+            </w:r>
+          </w:p>
+          <w:p>
+            <w:pPr>
+              <w:spacing w:before="0" w:after="0" w:line="220" w:lineRule="exact"/>
+            </w:pPr>
+            <w:r>
+              <w:rPr>
+                <w:rFonts w:eastAsia="宋体" w:ascii="Consolas" w:hAnsi="Consolas"/>
+                <w:rFonts w:ascii="Consolas" w:hAnsi="Consolas"/>
+                <w:sz w:val="18"/>
+                <w:color w:val="000000"/>
+              </w:rPr>
+              <w:t xml:space="preserve">        </w:t>
+            </w:r>
+            <w:r>
+              <w:rPr>
+                <w:rFonts w:eastAsia="宋体" w:ascii="Consolas" w:hAnsi="Consolas"/>
+                <w:rFonts w:ascii="Consolas" w:hAnsi="Consolas"/>
+                <w:sz w:val="18"/>
+                <w:color w:val="0000FF"/>
+              </w:rPr>
+              <w:t>with</w:t>
+            </w:r>
+            <w:r>
+              <w:rPr>
+                <w:rFonts w:eastAsia="宋体" w:ascii="Consolas" w:hAnsi="Consolas"/>
+                <w:rFonts w:ascii="Consolas" w:hAnsi="Consolas"/>
+                <w:sz w:val="18"/>
+                <w:color w:val="000000"/>
+              </w:rPr>
+              <w:t xml:space="preserve"> </w:t>
+            </w:r>
+            <w:r>
+              <w:rPr>
+                <w:rFonts w:eastAsia="宋体" w:ascii="Consolas" w:hAnsi="Consolas"/>
+                <w:rFonts w:ascii="Consolas" w:hAnsi="Consolas"/>
+                <w:sz w:val="18"/>
+                <w:color w:val="008080"/>
+              </w:rPr>
+              <w:t>open</w:t>
+            </w:r>
+            <w:r>
+              <w:rPr>
+                <w:rFonts w:eastAsia="宋体" w:ascii="Consolas" w:hAnsi="Consolas"/>
+                <w:rFonts w:ascii="Consolas" w:hAnsi="Consolas"/>
+                <w:sz w:val="18"/>
+                <w:color w:val="000000"/>
+              </w:rPr>
+              <w:t>(</w:t>
+            </w:r>
+            <w:r>
+              <w:rPr>
+                <w:rFonts w:eastAsia="宋体" w:ascii="Consolas" w:hAnsi="Consolas"/>
+                <w:rFonts w:ascii="Consolas" w:hAnsi="Consolas"/>
+                <w:sz w:val="18"/>
+                <w:color w:val="000000"/>
+              </w:rPr>
+              <w:t>log_path</w:t>
+            </w:r>
+            <w:r>
+              <w:rPr>
+                <w:rFonts w:eastAsia="宋体" w:ascii="Consolas" w:hAnsi="Consolas"/>
+                <w:rFonts w:ascii="Consolas" w:hAnsi="Consolas"/>
+                <w:sz w:val="18"/>
+                <w:color w:val="000000"/>
+              </w:rPr>
+              <w:t>,</w:t>
+            </w:r>
+            <w:r>
+              <w:rPr>
+                <w:rFonts w:eastAsia="宋体" w:ascii="Consolas" w:hAnsi="Consolas"/>
+                <w:rFonts w:ascii="Consolas" w:hAnsi="Consolas"/>
+                <w:sz w:val="18"/>
+                <w:color w:val="000000"/>
+              </w:rPr>
+              <w:t xml:space="preserve"> </w:t>
+            </w:r>
+            <w:r>
+              <w:rPr>
+                <w:rFonts w:eastAsia="宋体" w:ascii="Consolas" w:hAnsi="Consolas"/>
+                <w:rFonts w:ascii="Consolas" w:hAnsi="Consolas"/>
+                <w:sz w:val="18"/>
+                <w:color w:val="A31515"/>
+              </w:rPr>
+              <w:t>"</w:t>
+            </w:r>
+            <w:r>
+              <w:rPr>
+                <w:rFonts w:eastAsia="宋体" w:ascii="Consolas" w:hAnsi="Consolas"/>
+                <w:rFonts w:ascii="Consolas" w:hAnsi="Consolas"/>
+                <w:sz w:val="18"/>
+                <w:color w:val="A31515"/>
+              </w:rPr>
+              <w:t>a</w:t>
+            </w:r>
+            <w:r>
+              <w:rPr>
+                <w:rFonts w:eastAsia="宋体" w:ascii="Consolas" w:hAnsi="Consolas"/>
+                <w:rFonts w:ascii="Consolas" w:hAnsi="Consolas"/>
+                <w:sz w:val="18"/>
+                <w:color w:val="A31515"/>
+              </w:rPr>
+              <w:t>"</w:t>
+            </w:r>
+            <w:r>
+              <w:rPr>
+                <w:rFonts w:eastAsia="宋体" w:ascii="Consolas" w:hAnsi="Consolas"/>
+                <w:rFonts w:ascii="Consolas" w:hAnsi="Consolas"/>
+                <w:sz w:val="18"/>
+                <w:color w:val="000000"/>
+              </w:rPr>
+              <w:t>,</w:t>
+            </w:r>
+            <w:r>
+              <w:rPr>
+                <w:rFonts w:eastAsia="宋体" w:ascii="Consolas" w:hAnsi="Consolas"/>
+                <w:rFonts w:ascii="Consolas" w:hAnsi="Consolas"/>
+                <w:sz w:val="18"/>
+                <w:color w:val="000000"/>
+              </w:rPr>
+              <w:t xml:space="preserve"> </w:t>
+            </w:r>
+            <w:r>
+              <w:rPr>
+                <w:rFonts w:eastAsia="宋体" w:ascii="Consolas" w:hAnsi="Consolas"/>
+                <w:rFonts w:ascii="Consolas" w:hAnsi="Consolas"/>
+                <w:sz w:val="18"/>
+                <w:color w:val="000000"/>
+              </w:rPr>
+              <w:t>encoding</w:t>
+            </w:r>
+            <w:r>
+              <w:rPr>
+                <w:rFonts w:eastAsia="宋体" w:ascii="Consolas" w:hAnsi="Consolas"/>
+                <w:rFonts w:ascii="Consolas" w:hAnsi="Consolas"/>
+                <w:sz w:val="18"/>
+                <w:color w:val="000000"/>
+              </w:rPr>
+              <w:t>=</w:t>
+            </w:r>
+            <w:r>
+              <w:rPr>
+                <w:rFonts w:eastAsia="宋体" w:ascii="Consolas" w:hAnsi="Consolas"/>
+                <w:rFonts w:ascii="Consolas" w:hAnsi="Consolas"/>
+                <w:sz w:val="18"/>
+                <w:color w:val="A31515"/>
+              </w:rPr>
+              <w:t>"</w:t>
+            </w:r>
+            <w:r>
+              <w:rPr>
+                <w:rFonts w:eastAsia="宋体" w:ascii="Consolas" w:hAnsi="Consolas"/>
+                <w:rFonts w:ascii="Consolas" w:hAnsi="Consolas"/>
+                <w:sz w:val="18"/>
+                <w:color w:val="A31515"/>
+              </w:rPr>
+              <w:t>utf-8</w:t>
+            </w:r>
+            <w:r>
+              <w:rPr>
+                <w:rFonts w:eastAsia="宋体" w:ascii="Consolas" w:hAnsi="Consolas"/>
+                <w:rFonts w:ascii="Consolas" w:hAnsi="Consolas"/>
+                <w:sz w:val="18"/>
+                <w:color w:val="A31515"/>
+              </w:rPr>
+              <w:t>"</w:t>
+            </w:r>
+            <w:r>
+              <w:rPr>
+                <w:rFonts w:eastAsia="宋体" w:ascii="Consolas" w:hAnsi="Consolas"/>
+                <w:rFonts w:ascii="Consolas" w:hAnsi="Consolas"/>
+                <w:sz w:val="18"/>
+                <w:color w:val="000000"/>
+              </w:rPr>
+              <w:t>)</w:t>
+            </w:r>
+            <w:r>
+              <w:rPr>
+                <w:rFonts w:eastAsia="宋体" w:ascii="Consolas" w:hAnsi="Consolas"/>
+                <w:rFonts w:ascii="Consolas" w:hAnsi="Consolas"/>
+                <w:sz w:val="18"/>
+                <w:color w:val="000000"/>
+              </w:rPr>
+              <w:t xml:space="preserve"> </w:t>
+            </w:r>
+            <w:r>
+              <w:rPr>
+                <w:rFonts w:eastAsia="宋体" w:ascii="Consolas" w:hAnsi="Consolas"/>
+                <w:rFonts w:ascii="Consolas" w:hAnsi="Consolas"/>
+                <w:sz w:val="18"/>
+                <w:color w:val="0000FF"/>
+              </w:rPr>
+              <w:t>as</w:t>
+            </w:r>
+            <w:r>
+              <w:rPr>
+                <w:rFonts w:eastAsia="宋体" w:ascii="Consolas" w:hAnsi="Consolas"/>
+                <w:rFonts w:ascii="Consolas" w:hAnsi="Consolas"/>
+                <w:sz w:val="18"/>
+                <w:color w:val="000000"/>
+              </w:rPr>
+              <w:t xml:space="preserve"> </w:t>
+            </w:r>
+            <w:r>
+              <w:rPr>
+                <w:rFonts w:eastAsia="宋体" w:ascii="Consolas" w:hAnsi="Consolas"/>
+                <w:rFonts w:ascii="Consolas" w:hAnsi="Consolas"/>
+                <w:sz w:val="18"/>
+                <w:color w:val="000000"/>
+              </w:rPr>
+              <w:t>f</w:t>
+            </w:r>
+            <w:r>
+              <w:rPr>
+                <w:rFonts w:eastAsia="宋体" w:ascii="Consolas" w:hAnsi="Consolas"/>
+                <w:rFonts w:ascii="Consolas" w:hAnsi="Consolas"/>
+                <w:sz w:val="18"/>
+                <w:color w:val="000000"/>
+              </w:rPr>
+              <w:t>:</w:t>
+            </w:r>
+          </w:p>
+          <w:p>
+            <w:pPr>
+              <w:spacing w:before="0" w:after="0" w:line="220" w:lineRule="exact"/>
+            </w:pPr>
+            <w:r>
+              <w:rPr>
+                <w:rFonts w:eastAsia="宋体" w:ascii="Consolas" w:hAnsi="Consolas"/>
+                <w:rFonts w:ascii="Consolas" w:hAnsi="Consolas"/>
+                <w:sz w:val="18"/>
+                <w:color w:val="000000"/>
+              </w:rPr>
+              <w:t xml:space="preserve">            </w:t>
+            </w:r>
+            <w:r>
+              <w:rPr>
+                <w:rFonts w:eastAsia="宋体" w:ascii="Consolas" w:hAnsi="Consolas"/>
+                <w:rFonts w:ascii="Consolas" w:hAnsi="Consolas"/>
+                <w:sz w:val="18"/>
+                <w:color w:val="000000"/>
+              </w:rPr>
+              <w:t>f</w:t>
+            </w:r>
+            <w:r>
+              <w:rPr>
+                <w:rFonts w:eastAsia="宋体" w:ascii="Consolas" w:hAnsi="Consolas"/>
+                <w:rFonts w:ascii="Consolas" w:hAnsi="Consolas"/>
+                <w:sz w:val="18"/>
+                <w:color w:val="000000"/>
+              </w:rPr>
+              <w:t>.</w:t>
+            </w:r>
+            <w:r>
+              <w:rPr>
+                <w:rFonts w:eastAsia="宋体" w:ascii="Consolas" w:hAnsi="Consolas"/>
+                <w:rFonts w:ascii="Consolas" w:hAnsi="Consolas"/>
+                <w:sz w:val="18"/>
+                <w:color w:val="000000"/>
+              </w:rPr>
+              <w:t>write</w:t>
+            </w:r>
+            <w:r>
+              <w:rPr>
+                <w:rFonts w:eastAsia="宋体" w:ascii="Consolas" w:hAnsi="Consolas"/>
+                <w:rFonts w:ascii="Consolas" w:hAnsi="Consolas"/>
+                <w:sz w:val="18"/>
+                <w:color w:val="000000"/>
+              </w:rPr>
+              <w:t>(</w:t>
+            </w:r>
+            <w:r>
+              <w:rPr>
+                <w:rFonts w:eastAsia="宋体" w:ascii="Consolas" w:hAnsi="Consolas"/>
+                <w:rFonts w:ascii="Consolas" w:hAnsi="Consolas"/>
+                <w:sz w:val="18"/>
+                <w:color w:val="000000"/>
+              </w:rPr>
+              <w:t>line</w:t>
+            </w:r>
+            <w:r>
+              <w:rPr>
+                <w:rFonts w:eastAsia="宋体" w:ascii="Consolas" w:hAnsi="Consolas"/>
+                <w:rFonts w:ascii="Consolas" w:hAnsi="Consolas"/>
+                <w:sz w:val="18"/>
+                <w:color w:val="000000"/>
+              </w:rPr>
+              <w:t xml:space="preserve"> </w:t>
+            </w:r>
+            <w:r>
+              <w:rPr>
+                <w:rFonts w:eastAsia="宋体" w:ascii="Consolas" w:hAnsi="Consolas"/>
+                <w:rFonts w:ascii="Consolas" w:hAnsi="Consolas"/>
+                <w:sz w:val="18"/>
+                <w:color w:val="000000"/>
+              </w:rPr>
+              <w:t>+</w:t>
+            </w:r>
+            <w:r>
+              <w:rPr>
+                <w:rFonts w:eastAsia="宋体" w:ascii="Consolas" w:hAnsi="Consolas"/>
+                <w:rFonts w:ascii="Consolas" w:hAnsi="Consolas"/>
+                <w:sz w:val="18"/>
+                <w:color w:val="000000"/>
+              </w:rPr>
+              <w:t xml:space="preserve"> </w:t>
+            </w:r>
+            <w:r>
+              <w:rPr>
+                <w:rFonts w:eastAsia="宋体" w:ascii="Consolas" w:hAnsi="Consolas"/>
+                <w:rFonts w:ascii="Consolas" w:hAnsi="Consolas"/>
+                <w:sz w:val="18"/>
+                <w:color w:val="A31515"/>
+              </w:rPr>
+              <w:t>"</w:t>
+            </w:r>
+            <w:r>
+              <w:rPr>
+                <w:rFonts w:eastAsia="宋体" w:ascii="Consolas" w:hAnsi="Consolas"/>
+                <w:rFonts w:ascii="Consolas" w:hAnsi="Consolas"/>
+                <w:sz w:val="18"/>
+                <w:color w:val="A31515"/>
+              </w:rPr>
+              <w:t>\n</w:t>
+            </w:r>
+            <w:r>
+              <w:rPr>
+                <w:rFonts w:eastAsia="宋体" w:ascii="Consolas" w:hAnsi="Consolas"/>
+                <w:rFonts w:ascii="Consolas" w:hAnsi="Consolas"/>
+                <w:sz w:val="18"/>
+                <w:color w:val="A31515"/>
+              </w:rPr>
+              <w:t>"</w:t>
+            </w:r>
+            <w:r>
+              <w:rPr>
+                <w:rFonts w:eastAsia="宋体" w:ascii="Consolas" w:hAnsi="Consolas"/>
+                <w:rFonts w:ascii="Consolas" w:hAnsi="Consolas"/>
+                <w:sz w:val="18"/>
+                <w:color w:val="000000"/>
+              </w:rPr>
+              <w:t>)</w:t>
+            </w:r>
+          </w:p>
+          <w:p>
+            <w:pPr>
+              <w:spacing w:before="0" w:after="0" w:line="220" w:lineRule="exact"/>
+            </w:pPr>
+          </w:p>
+          <w:p>
+            <w:pPr>
+              <w:spacing w:before="0" w:after="0" w:line="220" w:lineRule="exact"/>
+            </w:pPr>
+            <w:r>
+              <w:rPr>
+                <w:rFonts w:eastAsia="宋体" w:ascii="Consolas" w:hAnsi="Consolas"/>
+                <w:rFonts w:ascii="Consolas" w:hAnsi="Consolas"/>
+                <w:sz w:val="18"/>
+                <w:color w:val="0000FF"/>
+              </w:rPr>
+              <w:t>while</w:t>
+            </w:r>
+            <w:r>
+              <w:rPr>
+                <w:rFonts w:eastAsia="宋体" w:ascii="Consolas" w:hAnsi="Consolas"/>
+                <w:rFonts w:ascii="Consolas" w:hAnsi="Consolas"/>
+                <w:sz w:val="18"/>
+                <w:color w:val="000000"/>
+              </w:rPr>
+              <w:t xml:space="preserve"> </w:t>
+            </w:r>
+            <w:r>
+              <w:rPr>
+                <w:rFonts w:eastAsia="宋体" w:ascii="Consolas" w:hAnsi="Consolas"/>
+                <w:rFonts w:ascii="Consolas" w:hAnsi="Consolas"/>
+                <w:sz w:val="18"/>
+                <w:color w:val="0000FF"/>
+              </w:rPr>
+              <w:t>True</w:t>
+            </w:r>
+            <w:r>
+              <w:rPr>
+                <w:rFonts w:eastAsia="宋体" w:ascii="Consolas" w:hAnsi="Consolas"/>
+                <w:rFonts w:ascii="Consolas" w:hAnsi="Consolas"/>
+                <w:sz w:val="18"/>
+                <w:color w:val="000000"/>
+              </w:rPr>
+              <w:t>:</w:t>
+            </w:r>
+          </w:p>
+          <w:p>
+            <w:pPr>
+              <w:spacing w:before="0" w:after="0" w:line="220" w:lineRule="exact"/>
+            </w:pPr>
+            <w:r>
+              <w:rPr>
+                <w:rFonts w:eastAsia="宋体" w:ascii="Consolas" w:hAnsi="Consolas"/>
+                <w:rFonts w:ascii="Consolas" w:hAnsi="Consolas"/>
+                <w:sz w:val="18"/>
+                <w:color w:val="000000"/>
+              </w:rPr>
+              <w:t xml:space="preserve">    </w:t>
+            </w:r>
+            <w:r>
+              <w:rPr>
+                <w:rFonts w:eastAsia="宋体" w:ascii="Consolas" w:hAnsi="Consolas"/>
+                <w:rFonts w:ascii="Consolas" w:hAnsi="Consolas"/>
+                <w:sz w:val="18"/>
+                <w:color w:val="000000"/>
+              </w:rPr>
+              <w:t>conn</w:t>
+            </w:r>
+            <w:r>
+              <w:rPr>
+                <w:rFonts w:eastAsia="宋体" w:ascii="Consolas" w:hAnsi="Consolas"/>
+                <w:rFonts w:ascii="Consolas" w:hAnsi="Consolas"/>
+                <w:sz w:val="18"/>
+                <w:color w:val="000000"/>
+              </w:rPr>
+              <w:t>,</w:t>
+            </w:r>
+            <w:r>
+              <w:rPr>
+                <w:rFonts w:eastAsia="宋体" w:ascii="Consolas" w:hAnsi="Consolas"/>
+                <w:rFonts w:ascii="Consolas" w:hAnsi="Consolas"/>
+                <w:sz w:val="18"/>
+                <w:color w:val="000000"/>
+              </w:rPr>
+              <w:t xml:space="preserve"> </w:t>
+            </w:r>
+            <w:r>
+              <w:rPr>
+                <w:rFonts w:eastAsia="宋体" w:ascii="Consolas" w:hAnsi="Consolas"/>
+                <w:rFonts w:ascii="Consolas" w:hAnsi="Consolas"/>
+                <w:sz w:val="18"/>
+                <w:color w:val="000000"/>
+              </w:rPr>
+              <w:t>addr</w:t>
+            </w:r>
+            <w:r>
+              <w:rPr>
+                <w:rFonts w:eastAsia="宋体" w:ascii="Consolas" w:hAnsi="Consolas"/>
+                <w:rFonts w:ascii="Consolas" w:hAnsi="Consolas"/>
+                <w:sz w:val="18"/>
+                <w:color w:val="000000"/>
+              </w:rPr>
+              <w:t xml:space="preserve"> </w:t>
+            </w:r>
+            <w:r>
+              <w:rPr>
+                <w:rFonts w:eastAsia="宋体" w:ascii="Consolas" w:hAnsi="Consolas"/>
+                <w:rFonts w:ascii="Consolas" w:hAnsi="Consolas"/>
+                <w:sz w:val="18"/>
+                <w:color w:val="000000"/>
+              </w:rPr>
+              <w:t>=</w:t>
+            </w:r>
+            <w:r>
+              <w:rPr>
+                <w:rFonts w:eastAsia="宋体" w:ascii="Consolas" w:hAnsi="Consolas"/>
+                <w:rFonts w:ascii="Consolas" w:hAnsi="Consolas"/>
+                <w:sz w:val="18"/>
+                <w:color w:val="000000"/>
+              </w:rPr>
+              <w:t xml:space="preserve"> </w:t>
+            </w:r>
+            <w:r>
+              <w:rPr>
+                <w:rFonts w:eastAsia="宋体" w:ascii="Consolas" w:hAnsi="Consolas"/>
+                <w:rFonts w:ascii="Consolas" w:hAnsi="Consolas"/>
+                <w:sz w:val="18"/>
+                <w:color w:val="000000"/>
+              </w:rPr>
+              <w:t>server_socket</w:t>
+            </w:r>
+            <w:r>
+              <w:rPr>
+                <w:rFonts w:eastAsia="宋体" w:ascii="Consolas" w:hAnsi="Consolas"/>
+                <w:rFonts w:ascii="Consolas" w:hAnsi="Consolas"/>
+                <w:sz w:val="18"/>
+                <w:color w:val="000000"/>
+              </w:rPr>
+              <w:t>.</w:t>
+            </w:r>
+            <w:r>
+              <w:rPr>
+                <w:rFonts w:eastAsia="宋体" w:ascii="Consolas" w:hAnsi="Consolas"/>
+                <w:rFonts w:ascii="Consolas" w:hAnsi="Consolas"/>
+                <w:sz w:val="18"/>
+                <w:color w:val="000000"/>
+              </w:rPr>
+              <w:t>accept</w:t>
+            </w:r>
+            <w:r>
+              <w:rPr>
+                <w:rFonts w:eastAsia="宋体" w:ascii="Consolas" w:hAnsi="Consolas"/>
+                <w:rFonts w:ascii="Consolas" w:hAnsi="Consolas"/>
+                <w:sz w:val="18"/>
+                <w:color w:val="000000"/>
+              </w:rPr>
+              <w:t>(</w:t>
+            </w:r>
+            <w:r>
+              <w:rPr>
+                <w:rFonts w:eastAsia="宋体" w:ascii="Consolas" w:hAnsi="Consolas"/>
+                <w:rFonts w:ascii="Consolas" w:hAnsi="Consolas"/>
+                <w:sz w:val="18"/>
+                <w:color w:val="000000"/>
+              </w:rPr>
+              <w:t>)</w:t>
+            </w:r>
+          </w:p>
+          <w:p>
+            <w:pPr>
+              <w:spacing w:before="0" w:after="0" w:line="220" w:lineRule="exact"/>
+            </w:pPr>
+            <w:r>
+              <w:rPr>
+                <w:rFonts w:eastAsia="宋体" w:ascii="Consolas" w:hAnsi="Consolas"/>
+                <w:rFonts w:ascii="Consolas" w:hAnsi="Consolas"/>
+                <w:sz w:val="18"/>
+                <w:color w:val="000000"/>
+              </w:rPr>
+              <w:t xml:space="preserve">    </w:t>
+            </w:r>
+            <w:r>
+              <w:rPr>
+                <w:rFonts w:eastAsia="宋体" w:ascii="Consolas" w:hAnsi="Consolas"/>
+                <w:rFonts w:ascii="Consolas" w:hAnsi="Consolas"/>
+                <w:sz w:val="18"/>
+                <w:color w:val="000000"/>
+              </w:rPr>
+              <w:t>t</w:t>
+            </w:r>
+            <w:r>
+              <w:rPr>
+                <w:rFonts w:eastAsia="宋体" w:ascii="Consolas" w:hAnsi="Consolas"/>
+                <w:rFonts w:ascii="Consolas" w:hAnsi="Consolas"/>
+                <w:sz w:val="18"/>
+                <w:color w:val="000000"/>
+              </w:rPr>
+              <w:t xml:space="preserve"> </w:t>
+            </w:r>
+            <w:r>
+              <w:rPr>
+                <w:rFonts w:eastAsia="宋体" w:ascii="Consolas" w:hAnsi="Consolas"/>
+                <w:rFonts w:ascii="Consolas" w:hAnsi="Consolas"/>
+                <w:sz w:val="18"/>
+                <w:color w:val="000000"/>
+              </w:rPr>
+              <w:t>=</w:t>
+            </w:r>
+            <w:r>
+              <w:rPr>
+                <w:rFonts w:eastAsia="宋体" w:ascii="Consolas" w:hAnsi="Consolas"/>
+                <w:rFonts w:ascii="Consolas" w:hAnsi="Consolas"/>
+                <w:sz w:val="18"/>
+                <w:color w:val="000000"/>
+              </w:rPr>
+              <w:t xml:space="preserve"> </w:t>
+            </w:r>
+            <w:r>
+              <w:rPr>
+                <w:rFonts w:eastAsia="宋体" w:ascii="Consolas" w:hAnsi="Consolas"/>
+                <w:rFonts w:ascii="Consolas" w:hAnsi="Consolas"/>
+                <w:sz w:val="18"/>
+                <w:color w:val="000000"/>
+              </w:rPr>
+              <w:t>threading</w:t>
+            </w:r>
+            <w:r>
+              <w:rPr>
+                <w:rFonts w:eastAsia="宋体" w:ascii="Consolas" w:hAnsi="Consolas"/>
+                <w:rFonts w:ascii="Consolas" w:hAnsi="Consolas"/>
+                <w:sz w:val="18"/>
+                <w:color w:val="000000"/>
+              </w:rPr>
+              <w:t>.</w:t>
+            </w:r>
+            <w:r>
+              <w:rPr>
+                <w:rFonts w:eastAsia="宋体" w:ascii="Consolas" w:hAnsi="Consolas"/>
+                <w:rFonts w:ascii="Consolas" w:hAnsi="Consolas"/>
+                <w:sz w:val="18"/>
+                <w:color w:val="000000"/>
+              </w:rPr>
+              <w:t>Thread</w:t>
+            </w:r>
+            <w:r>
+              <w:rPr>
+                <w:rFonts w:eastAsia="宋体" w:ascii="Consolas" w:hAnsi="Consolas"/>
+                <w:rFonts w:ascii="Consolas" w:hAnsi="Consolas"/>
+                <w:sz w:val="18"/>
+                <w:color w:val="000000"/>
+              </w:rPr>
+              <w:t>(</w:t>
+            </w:r>
+            <w:r>
+              <w:rPr>
+                <w:rFonts w:eastAsia="宋体" w:ascii="Consolas" w:hAnsi="Consolas"/>
+                <w:rFonts w:ascii="Consolas" w:hAnsi="Consolas"/>
+                <w:sz w:val="18"/>
+                <w:color w:val="000000"/>
+              </w:rPr>
+              <w:t>target</w:t>
+            </w:r>
+            <w:r>
+              <w:rPr>
+                <w:rFonts w:eastAsia="宋体" w:ascii="Consolas" w:hAnsi="Consolas"/>
+                <w:rFonts w:ascii="Consolas" w:hAnsi="Consolas"/>
+                <w:sz w:val="18"/>
+                <w:color w:val="000000"/>
+              </w:rPr>
+              <w:t>=</w:t>
+            </w:r>
+            <w:r>
+              <w:rPr>
+                <w:rFonts w:eastAsia="宋体" w:ascii="Consolas" w:hAnsi="Consolas"/>
+                <w:rFonts w:ascii="Consolas" w:hAnsi="Consolas"/>
+                <w:sz w:val="18"/>
+                <w:color w:val="000000"/>
+              </w:rPr>
+              <w:t>handle_client</w:t>
+            </w:r>
+            <w:r>
+              <w:rPr>
+                <w:rFonts w:eastAsia="宋体" w:ascii="Consolas" w:hAnsi="Consolas"/>
+                <w:rFonts w:ascii="Consolas" w:hAnsi="Consolas"/>
+                <w:sz w:val="18"/>
+                <w:color w:val="000000"/>
+              </w:rPr>
+              <w:t>,</w:t>
+            </w:r>
+            <w:r>
+              <w:rPr>
+                <w:rFonts w:eastAsia="宋体" w:ascii="Consolas" w:hAnsi="Consolas"/>
+                <w:rFonts w:ascii="Consolas" w:hAnsi="Consolas"/>
+                <w:sz w:val="18"/>
+                <w:color w:val="000000"/>
+              </w:rPr>
+              <w:t xml:space="preserve"> </w:t>
+            </w:r>
+            <w:r>
+              <w:rPr>
+                <w:rFonts w:eastAsia="宋体" w:ascii="Consolas" w:hAnsi="Consolas"/>
+                <w:rFonts w:ascii="Consolas" w:hAnsi="Consolas"/>
+                <w:sz w:val="18"/>
+                <w:color w:val="000000"/>
+              </w:rPr>
+              <w:t>args</w:t>
+            </w:r>
+            <w:r>
+              <w:rPr>
+                <w:rFonts w:eastAsia="宋体" w:ascii="Consolas" w:hAnsi="Consolas"/>
+                <w:rFonts w:ascii="Consolas" w:hAnsi="Consolas"/>
+                <w:sz w:val="18"/>
+                <w:color w:val="000000"/>
+              </w:rPr>
+              <w:t>=</w:t>
+            </w:r>
+            <w:r>
+              <w:rPr>
+                <w:rFonts w:eastAsia="宋体" w:ascii="Consolas" w:hAnsi="Consolas"/>
+                <w:rFonts w:ascii="Consolas" w:hAnsi="Consolas"/>
+                <w:sz w:val="18"/>
+                <w:color w:val="000000"/>
+              </w:rPr>
+              <w:t>(</w:t>
+            </w:r>
+            <w:r>
+              <w:rPr>
+                <w:rFonts w:eastAsia="宋体" w:ascii="Consolas" w:hAnsi="Consolas"/>
+                <w:rFonts w:ascii="Consolas" w:hAnsi="Consolas"/>
+                <w:sz w:val="18"/>
+                <w:color w:val="000000"/>
+              </w:rPr>
+              <w:t>conn</w:t>
+            </w:r>
+            <w:r>
+              <w:rPr>
+                <w:rFonts w:eastAsia="宋体" w:ascii="Consolas" w:hAnsi="Consolas"/>
+                <w:rFonts w:ascii="Consolas" w:hAnsi="Consolas"/>
+                <w:sz w:val="18"/>
+                <w:color w:val="000000"/>
+              </w:rPr>
+              <w:t>,</w:t>
+            </w:r>
+            <w:r>
+              <w:rPr>
+                <w:rFonts w:eastAsia="宋体" w:ascii="Consolas" w:hAnsi="Consolas"/>
+                <w:rFonts w:ascii="Consolas" w:hAnsi="Consolas"/>
+                <w:sz w:val="18"/>
+                <w:color w:val="000000"/>
+              </w:rPr>
+              <w:t xml:space="preserve"> </w:t>
+            </w:r>
+            <w:r>
+              <w:rPr>
+                <w:rFonts w:eastAsia="宋体" w:ascii="Consolas" w:hAnsi="Consolas"/>
+                <w:rFonts w:ascii="Consolas" w:hAnsi="Consolas"/>
+                <w:sz w:val="18"/>
+                <w:color w:val="000000"/>
+              </w:rPr>
+              <w:t>addr</w:t>
+            </w:r>
+            <w:r>
+              <w:rPr>
+                <w:rFonts w:eastAsia="宋体" w:ascii="Consolas" w:hAnsi="Consolas"/>
+                <w:rFonts w:ascii="Consolas" w:hAnsi="Consolas"/>
+                <w:sz w:val="18"/>
+                <w:color w:val="000000"/>
+              </w:rPr>
+              <w:t>)</w:t>
+            </w:r>
+            <w:r>
+              <w:rPr>
+                <w:rFonts w:eastAsia="宋体" w:ascii="Consolas" w:hAnsi="Consolas"/>
+                <w:rFonts w:ascii="Consolas" w:hAnsi="Consolas"/>
+                <w:sz w:val="18"/>
+                <w:color w:val="000000"/>
+              </w:rPr>
+              <w:t>,</w:t>
+            </w:r>
+            <w:r>
+              <w:rPr>
+                <w:rFonts w:eastAsia="宋体" w:ascii="Consolas" w:hAnsi="Consolas"/>
+                <w:rFonts w:ascii="Consolas" w:hAnsi="Consolas"/>
+                <w:sz w:val="18"/>
+                <w:color w:val="000000"/>
+              </w:rPr>
+              <w:t xml:space="preserve"> </w:t>
+            </w:r>
+            <w:r>
+              <w:rPr>
+                <w:rFonts w:eastAsia="宋体" w:ascii="Consolas" w:hAnsi="Consolas"/>
+                <w:rFonts w:ascii="Consolas" w:hAnsi="Consolas"/>
+                <w:sz w:val="18"/>
+                <w:color w:val="000000"/>
+              </w:rPr>
+              <w:t>daemon</w:t>
+            </w:r>
+            <w:r>
+              <w:rPr>
+                <w:rFonts w:eastAsia="宋体" w:ascii="Consolas" w:hAnsi="Consolas"/>
+                <w:rFonts w:ascii="Consolas" w:hAnsi="Consolas"/>
+                <w:sz w:val="18"/>
+                <w:color w:val="000000"/>
+              </w:rPr>
+              <w:t>=</w:t>
+            </w:r>
+            <w:r>
+              <w:rPr>
+                <w:rFonts w:eastAsia="宋体" w:ascii="Consolas" w:hAnsi="Consolas"/>
+                <w:rFonts w:ascii="Consolas" w:hAnsi="Consolas"/>
+                <w:sz w:val="18"/>
+                <w:color w:val="0000FF"/>
+              </w:rPr>
+              <w:t>True</w:t>
+            </w:r>
+            <w:r>
+              <w:rPr>
+                <w:rFonts w:eastAsia="宋体" w:ascii="Consolas" w:hAnsi="Consolas"/>
+                <w:rFonts w:ascii="Consolas" w:hAnsi="Consolas"/>
+                <w:sz w:val="18"/>
+                <w:color w:val="000000"/>
+              </w:rPr>
+              <w:t>)</w:t>
+            </w:r>
+          </w:p>
+          <w:p>
+            <w:pPr>
+              <w:spacing w:before="0" w:after="0" w:line="220" w:lineRule="exact"/>
+            </w:pPr>
+            <w:r>
+              <w:rPr>
+                <w:rFonts w:eastAsia="宋体" w:ascii="Consolas" w:hAnsi="Consolas"/>
+                <w:rFonts w:ascii="Consolas" w:hAnsi="Consolas"/>
+                <w:sz w:val="18"/>
+                <w:color w:val="000000"/>
+              </w:rPr>
+              <w:t xml:space="preserve">    </w:t>
+            </w:r>
+            <w:r>
+              <w:rPr>
+                <w:rFonts w:eastAsia="宋体" w:ascii="Consolas" w:hAnsi="Consolas"/>
+                <w:rFonts w:ascii="Consolas" w:hAnsi="Consolas"/>
+                <w:sz w:val="18"/>
+                <w:color w:val="000000"/>
+              </w:rPr>
+              <w:t>t</w:t>
+            </w:r>
+            <w:r>
+              <w:rPr>
+                <w:rFonts w:eastAsia="宋体" w:ascii="Consolas" w:hAnsi="Consolas"/>
+                <w:rFonts w:ascii="Consolas" w:hAnsi="Consolas"/>
+                <w:sz w:val="18"/>
+                <w:color w:val="000000"/>
+              </w:rPr>
+              <w:t>.</w:t>
+            </w:r>
+            <w:r>
+              <w:rPr>
+                <w:rFonts w:eastAsia="宋体" w:ascii="Consolas" w:hAnsi="Consolas"/>
+                <w:rFonts w:ascii="Consolas" w:hAnsi="Consolas"/>
+                <w:sz w:val="18"/>
+                <w:color w:val="000000"/>
+              </w:rPr>
+              <w:t>start</w:t>
+            </w:r>
+            <w:r>
+              <w:rPr>
+                <w:rFonts w:eastAsia="宋体" w:ascii="Consolas" w:hAnsi="Consolas"/>
+                <w:rFonts w:ascii="Consolas" w:hAnsi="Consolas"/>
+                <w:sz w:val="18"/>
+                <w:color w:val="000000"/>
+              </w:rPr>
+              <w:t>(</w:t>
+            </w:r>
+            <w:r>
+              <w:rPr>
+                <w:rFonts w:eastAsia="宋体" w:ascii="Consolas" w:hAnsi="Consolas"/>
+                <w:rFonts w:ascii="Consolas" w:hAnsi="Consolas"/>
+                <w:sz w:val="18"/>
+                <w:color w:val="000000"/>
+              </w:rPr>
+              <w:t>)</w:t>
+            </w:r>
+          </w:p>
+          <w:p>
+            <w:pPr>
+              <w:spacing w:before="0" w:after="80" w:line="220" w:lineRule="exact"/>
+            </w:pPr>
           </w:p>
         </w:tc>
       </w:tr>

</xml_diff>